<commit_message>
docs(worklog): tich hop nhat ky cong viec va minh bach AI cho Tuan 1 va Tuan 2
- Cap nhat WORKLOG.md va WORKLOG_NHOM_05_CAN_XAC_NHAN.md cho Tuan 1 voi gio lam viec thuc te >= 8h/SV (Son: 9.5h, Quyen: 9.0h = 18.5h nhom) va khai bao AI chi tiet
- Tao moi tuan_2/docs/WORKLOG.md voi nhat ky chi tiet tung ngay Tuan 2 (Son: 10.0h, Quyen: 9.5h = 19.5h nhom), minh chung ky thuat va cam ket van dap doc lap
- Tich hop Bang 2.1 worklog vao Bao cao Tuan 1 DOCX/PDF giu nguyen 20 trang vat ly
- Bo sung Chuong 7 (Worklog & AI Disclosure) vao Bao cao Tuan 2 DOCX/PDF xuat Word COM 31 trang
- Dong bo dieu huong va bang tong hop worklog tai README.md, tuan_1/README.md va tuan_2/README.md
</commit_message>
<xml_diff>
--- a/tuan_1/docs/Bao_cao_tuan_1_Dien_toan_dam_may_Nhom_05.docx
+++ b/tuan_1/docs/Bao_cao_tuan_1_Dien_toan_dam_may_Nhom_05.docx
@@ -337,6 +337,7 @@
             </w:pPr>
             <w:r>
               <w:rPr>
+                <w:rFonts w:ascii="Times New Roman" w:hAnsi="Times New Roman" w:cs="Times New Roman"/>
                 <w:b/>
                 <w:color w:val="1E293B"/>
                 <w:sz w:val="20"/>
@@ -407,7 +408,7 @@
         <w:pStyle w:val="BodyText"/>
       </w:pPr>
       <w:r>
-        <w:t>Theo phân công nhóm xác nhận, Sơn phụ trách S3, Secrets Manager, Lambda và SNS; Quyên phụ trách Glue, Athena và phân tích biểu đồ. Hai thành viên cùng thực hiện kiến trúc, tích hợp và báo cáo. Số liệu báo cáo thuộc dữ liệu và lượt quan sát của Tuần 1.</w:t>
+        <w:t>Theo phân công nhóm xác nhận, Sơn phụ trách S3, Secrets Manager, Lambda và SNS; Quyên phụ trách Glue, Athena và phân tích biểu đồ. Hai thành viên cùng thực hiện kiến trúc, tích hợp và báo cáo. Các số liệu trong tài liệu thuộc tập dữ liệu và các lượt quan sát của Tuần 1.</w:t>
       </w:r>
     </w:p>
     <w:p>
@@ -497,7 +498,7 @@
       <w:r>
         <w:fldChar w:fldCharType="separate"/>
       </w:r>
-      <w:hyperlink w:anchor="_Toc242391572" w:history="1">
+      <w:hyperlink w:anchor="_Toc242299335" w:history="1">
         <w:r>
           <w:rPr>
             <w:rStyle w:val="Hyperlink"/>
@@ -524,7 +525,7 @@
             <w:noProof/>
             <w:webHidden/>
           </w:rPr>
-          <w:instrText xml:space="preserve"> PAGEREF _Toc242391572 \h </w:instrText>
+          <w:instrText xml:space="preserve"> PAGEREF _Toc242299335 \h </w:instrText>
         </w:r>
         <w:r>
           <w:rPr>
@@ -572,7 +573,7 @@
           <w14:ligatures w14:val="standardContextual"/>
         </w:rPr>
       </w:pPr>
-      <w:hyperlink w:anchor="_Toc242391573" w:history="1">
+      <w:hyperlink w:anchor="_Toc242299336" w:history="1">
         <w:r>
           <w:rPr>
             <w:rStyle w:val="Hyperlink"/>
@@ -599,7 +600,7 @@
             <w:noProof/>
             <w:webHidden/>
           </w:rPr>
-          <w:instrText xml:space="preserve"> PAGEREF _Toc242391573 \h </w:instrText>
+          <w:instrText xml:space="preserve"> PAGEREF _Toc242299336 \h </w:instrText>
         </w:r>
         <w:r>
           <w:rPr>
@@ -647,7 +648,7 @@
           <w14:ligatures w14:val="standardContextual"/>
         </w:rPr>
       </w:pPr>
-      <w:hyperlink w:anchor="_Toc242391574" w:history="1">
+      <w:hyperlink w:anchor="_Toc242299337" w:history="1">
         <w:r>
           <w:rPr>
             <w:rStyle w:val="Hyperlink"/>
@@ -674,7 +675,7 @@
             <w:noProof/>
             <w:webHidden/>
           </w:rPr>
-          <w:instrText xml:space="preserve"> PAGEREF _Toc242391574 \h </w:instrText>
+          <w:instrText xml:space="preserve"> PAGEREF _Toc242299337 \h </w:instrText>
         </w:r>
         <w:r>
           <w:rPr>
@@ -722,7 +723,7 @@
           <w14:ligatures w14:val="standardContextual"/>
         </w:rPr>
       </w:pPr>
-      <w:hyperlink w:anchor="_Toc242391575" w:history="1">
+      <w:hyperlink w:anchor="_Toc242299338" w:history="1">
         <w:r>
           <w:rPr>
             <w:rStyle w:val="Hyperlink"/>
@@ -749,7 +750,7 @@
             <w:noProof/>
             <w:webHidden/>
           </w:rPr>
-          <w:instrText xml:space="preserve"> PAGEREF _Toc242391575 \h </w:instrText>
+          <w:instrText xml:space="preserve"> PAGEREF _Toc242299338 \h </w:instrText>
         </w:r>
         <w:r>
           <w:rPr>
@@ -797,7 +798,7 @@
           <w14:ligatures w14:val="standardContextual"/>
         </w:rPr>
       </w:pPr>
-      <w:hyperlink w:anchor="_Toc242391576" w:history="1">
+      <w:hyperlink w:anchor="_Toc242299339" w:history="1">
         <w:r>
           <w:rPr>
             <w:rStyle w:val="Hyperlink"/>
@@ -824,7 +825,7 @@
             <w:noProof/>
             <w:webHidden/>
           </w:rPr>
-          <w:instrText xml:space="preserve"> PAGEREF _Toc242391576 \h </w:instrText>
+          <w:instrText xml:space="preserve"> PAGEREF _Toc242299339 \h </w:instrText>
         </w:r>
         <w:r>
           <w:rPr>
@@ -873,7 +874,7 @@
           <w14:ligatures w14:val="standardContextual"/>
         </w:rPr>
       </w:pPr>
-      <w:hyperlink w:anchor="_Toc242391577" w:history="1">
+      <w:hyperlink w:anchor="_Toc242299340" w:history="1">
         <w:r>
           <w:rPr>
             <w:rStyle w:val="Hyperlink"/>
@@ -900,7 +901,7 @@
             <w:noProof/>
             <w:webHidden/>
           </w:rPr>
-          <w:instrText xml:space="preserve"> PAGEREF _Toc242391577 \h </w:instrText>
+          <w:instrText xml:space="preserve"> PAGEREF _Toc242299340 \h </w:instrText>
         </w:r>
         <w:r>
           <w:rPr>
@@ -948,7 +949,7 @@
           <w14:ligatures w14:val="standardContextual"/>
         </w:rPr>
       </w:pPr>
-      <w:hyperlink w:anchor="_Toc242391578" w:history="1">
+      <w:hyperlink w:anchor="_Toc242299341" w:history="1">
         <w:r>
           <w:rPr>
             <w:rStyle w:val="Hyperlink"/>
@@ -975,7 +976,7 @@
             <w:noProof/>
             <w:webHidden/>
           </w:rPr>
-          <w:instrText xml:space="preserve"> PAGEREF _Toc242391578 \h </w:instrText>
+          <w:instrText xml:space="preserve"> PAGEREF _Toc242299341 \h </w:instrText>
         </w:r>
         <w:r>
           <w:rPr>
@@ -1023,7 +1024,7 @@
           <w14:ligatures w14:val="standardContextual"/>
         </w:rPr>
       </w:pPr>
-      <w:hyperlink w:anchor="_Toc242391579" w:history="1">
+      <w:hyperlink w:anchor="_Toc242299342" w:history="1">
         <w:r>
           <w:rPr>
             <w:rStyle w:val="Hyperlink"/>
@@ -1050,7 +1051,7 @@
             <w:noProof/>
             <w:webHidden/>
           </w:rPr>
-          <w:instrText xml:space="preserve"> PAGEREF _Toc242391579 \h </w:instrText>
+          <w:instrText xml:space="preserve"> PAGEREF _Toc242299342 \h </w:instrText>
         </w:r>
         <w:r>
           <w:rPr>
@@ -1098,7 +1099,7 @@
           <w14:ligatures w14:val="standardContextual"/>
         </w:rPr>
       </w:pPr>
-      <w:hyperlink w:anchor="_Toc242391580" w:history="1">
+      <w:hyperlink w:anchor="_Toc242299343" w:history="1">
         <w:r>
           <w:rPr>
             <w:rStyle w:val="Hyperlink"/>
@@ -1125,7 +1126,7 @@
             <w:noProof/>
             <w:webHidden/>
           </w:rPr>
-          <w:instrText xml:space="preserve"> PAGEREF _Toc242391580 \h </w:instrText>
+          <w:instrText xml:space="preserve"> PAGEREF _Toc242299343 \h </w:instrText>
         </w:r>
         <w:r>
           <w:rPr>
@@ -1174,7 +1175,7 @@
           <w14:ligatures w14:val="standardContextual"/>
         </w:rPr>
       </w:pPr>
-      <w:hyperlink w:anchor="_Toc242391581" w:history="1">
+      <w:hyperlink w:anchor="_Toc242299344" w:history="1">
         <w:r>
           <w:rPr>
             <w:rStyle w:val="Hyperlink"/>
@@ -1201,7 +1202,7 @@
             <w:noProof/>
             <w:webHidden/>
           </w:rPr>
-          <w:instrText xml:space="preserve"> PAGEREF _Toc242391581 \h </w:instrText>
+          <w:instrText xml:space="preserve"> PAGEREF _Toc242299344 \h </w:instrText>
         </w:r>
         <w:r>
           <w:rPr>
@@ -1249,7 +1250,7 @@
           <w14:ligatures w14:val="standardContextual"/>
         </w:rPr>
       </w:pPr>
-      <w:hyperlink w:anchor="_Toc242391582" w:history="1">
+      <w:hyperlink w:anchor="_Toc242299345" w:history="1">
         <w:r>
           <w:rPr>
             <w:rStyle w:val="Hyperlink"/>
@@ -1276,7 +1277,7 @@
             <w:noProof/>
             <w:webHidden/>
           </w:rPr>
-          <w:instrText xml:space="preserve"> PAGEREF _Toc242391582 \h </w:instrText>
+          <w:instrText xml:space="preserve"> PAGEREF _Toc242299345 \h </w:instrText>
         </w:r>
         <w:r>
           <w:rPr>
@@ -1324,7 +1325,7 @@
           <w14:ligatures w14:val="standardContextual"/>
         </w:rPr>
       </w:pPr>
-      <w:hyperlink w:anchor="_Toc242391583" w:history="1">
+      <w:hyperlink w:anchor="_Toc242299346" w:history="1">
         <w:r>
           <w:rPr>
             <w:rStyle w:val="Hyperlink"/>
@@ -1351,7 +1352,7 @@
             <w:noProof/>
             <w:webHidden/>
           </w:rPr>
-          <w:instrText xml:space="preserve"> PAGEREF _Toc242391583 \h </w:instrText>
+          <w:instrText xml:space="preserve"> PAGEREF _Toc242299346 \h </w:instrText>
         </w:r>
         <w:r>
           <w:rPr>
@@ -1399,7 +1400,7 @@
           <w14:ligatures w14:val="standardContextual"/>
         </w:rPr>
       </w:pPr>
-      <w:hyperlink w:anchor="_Toc242391584" w:history="1">
+      <w:hyperlink w:anchor="_Toc242299347" w:history="1">
         <w:r>
           <w:rPr>
             <w:rStyle w:val="Hyperlink"/>
@@ -1426,7 +1427,7 @@
             <w:noProof/>
             <w:webHidden/>
           </w:rPr>
-          <w:instrText xml:space="preserve"> PAGEREF _Toc242391584 \h </w:instrText>
+          <w:instrText xml:space="preserve"> PAGEREF _Toc242299347 \h </w:instrText>
         </w:r>
         <w:r>
           <w:rPr>
@@ -1474,7 +1475,7 @@
           <w14:ligatures w14:val="standardContextual"/>
         </w:rPr>
       </w:pPr>
-      <w:hyperlink w:anchor="_Toc242391585" w:history="1">
+      <w:hyperlink w:anchor="_Toc242299348" w:history="1">
         <w:r>
           <w:rPr>
             <w:rStyle w:val="Hyperlink"/>
@@ -1501,7 +1502,7 @@
             <w:noProof/>
             <w:webHidden/>
           </w:rPr>
-          <w:instrText xml:space="preserve"> PAGEREF _Toc242391585 \h </w:instrText>
+          <w:instrText xml:space="preserve"> PAGEREF _Toc242299348 \h </w:instrText>
         </w:r>
         <w:r>
           <w:rPr>
@@ -1549,7 +1550,7 @@
           <w14:ligatures w14:val="standardContextual"/>
         </w:rPr>
       </w:pPr>
-      <w:hyperlink w:anchor="_Toc242391586" w:history="1">
+      <w:hyperlink w:anchor="_Toc242299349" w:history="1">
         <w:r>
           <w:rPr>
             <w:rStyle w:val="Hyperlink"/>
@@ -1576,7 +1577,7 @@
             <w:noProof/>
             <w:webHidden/>
           </w:rPr>
-          <w:instrText xml:space="preserve"> PAGEREF _Toc242391586 \h </w:instrText>
+          <w:instrText xml:space="preserve"> PAGEREF _Toc242299349 \h </w:instrText>
         </w:r>
         <w:r>
           <w:rPr>
@@ -1624,7 +1625,7 @@
           <w14:ligatures w14:val="standardContextual"/>
         </w:rPr>
       </w:pPr>
-      <w:hyperlink w:anchor="_Toc242391587" w:history="1">
+      <w:hyperlink w:anchor="_Toc242299350" w:history="1">
         <w:r>
           <w:rPr>
             <w:rStyle w:val="Hyperlink"/>
@@ -1651,7 +1652,7 @@
             <w:noProof/>
             <w:webHidden/>
           </w:rPr>
-          <w:instrText xml:space="preserve"> PAGEREF _Toc242391587 \h </w:instrText>
+          <w:instrText xml:space="preserve"> PAGEREF _Toc242299350 \h </w:instrText>
         </w:r>
         <w:r>
           <w:rPr>
@@ -1699,7 +1700,7 @@
           <w14:ligatures w14:val="standardContextual"/>
         </w:rPr>
       </w:pPr>
-      <w:hyperlink w:anchor="_Toc242391588" w:history="1">
+      <w:hyperlink w:anchor="_Toc242299351" w:history="1">
         <w:r>
           <w:rPr>
             <w:rStyle w:val="Hyperlink"/>
@@ -1726,7 +1727,7 @@
             <w:noProof/>
             <w:webHidden/>
           </w:rPr>
-          <w:instrText xml:space="preserve"> PAGEREF _Toc242391588 \h </w:instrText>
+          <w:instrText xml:space="preserve"> PAGEREF _Toc242299351 \h </w:instrText>
         </w:r>
         <w:r>
           <w:rPr>
@@ -1775,7 +1776,7 @@
           <w14:ligatures w14:val="standardContextual"/>
         </w:rPr>
       </w:pPr>
-      <w:hyperlink w:anchor="_Toc242391589" w:history="1">
+      <w:hyperlink w:anchor="_Toc242299352" w:history="1">
         <w:r>
           <w:rPr>
             <w:rStyle w:val="Hyperlink"/>
@@ -1802,7 +1803,7 @@
             <w:noProof/>
             <w:webHidden/>
           </w:rPr>
-          <w:instrText xml:space="preserve"> PAGEREF _Toc242391589 \h </w:instrText>
+          <w:instrText xml:space="preserve"> PAGEREF _Toc242299352 \h </w:instrText>
         </w:r>
         <w:r>
           <w:rPr>
@@ -1850,7 +1851,7 @@
           <w14:ligatures w14:val="standardContextual"/>
         </w:rPr>
       </w:pPr>
-      <w:hyperlink w:anchor="_Toc242391590" w:history="1">
+      <w:hyperlink w:anchor="_Toc242299353" w:history="1">
         <w:r>
           <w:rPr>
             <w:rStyle w:val="Hyperlink"/>
@@ -1877,7 +1878,7 @@
             <w:noProof/>
             <w:webHidden/>
           </w:rPr>
-          <w:instrText xml:space="preserve"> PAGEREF _Toc242391590 \h </w:instrText>
+          <w:instrText xml:space="preserve"> PAGEREF _Toc242299353 \h </w:instrText>
         </w:r>
         <w:r>
           <w:rPr>
@@ -1925,7 +1926,7 @@
           <w14:ligatures w14:val="standardContextual"/>
         </w:rPr>
       </w:pPr>
-      <w:hyperlink w:anchor="_Toc242391591" w:history="1">
+      <w:hyperlink w:anchor="_Toc242299354" w:history="1">
         <w:r>
           <w:rPr>
             <w:rStyle w:val="Hyperlink"/>
@@ -1952,7 +1953,7 @@
             <w:noProof/>
             <w:webHidden/>
           </w:rPr>
-          <w:instrText xml:space="preserve"> PAGEREF _Toc242391591 \h </w:instrText>
+          <w:instrText xml:space="preserve"> PAGEREF _Toc242299354 \h </w:instrText>
         </w:r>
         <w:r>
           <w:rPr>
@@ -2000,7 +2001,7 @@
           <w14:ligatures w14:val="standardContextual"/>
         </w:rPr>
       </w:pPr>
-      <w:hyperlink w:anchor="_Toc242391592" w:history="1">
+      <w:hyperlink w:anchor="_Toc242299355" w:history="1">
         <w:r>
           <w:rPr>
             <w:rStyle w:val="Hyperlink"/>
@@ -2027,7 +2028,7 @@
             <w:noProof/>
             <w:webHidden/>
           </w:rPr>
-          <w:instrText xml:space="preserve"> PAGEREF _Toc242391592 \h </w:instrText>
+          <w:instrText xml:space="preserve"> PAGEREF _Toc242299355 \h </w:instrText>
         </w:r>
         <w:r>
           <w:rPr>
@@ -2075,7 +2076,7 @@
           <w14:ligatures w14:val="standardContextual"/>
         </w:rPr>
       </w:pPr>
-      <w:hyperlink w:anchor="_Toc242391593" w:history="1">
+      <w:hyperlink w:anchor="_Toc242299356" w:history="1">
         <w:r>
           <w:rPr>
             <w:rStyle w:val="Hyperlink"/>
@@ -2102,7 +2103,7 @@
             <w:noProof/>
             <w:webHidden/>
           </w:rPr>
-          <w:instrText xml:space="preserve"> PAGEREF _Toc242391593 \h </w:instrText>
+          <w:instrText xml:space="preserve"> PAGEREF _Toc242299356 \h </w:instrText>
         </w:r>
         <w:r>
           <w:rPr>
@@ -2150,7 +2151,7 @@
           <w14:ligatures w14:val="standardContextual"/>
         </w:rPr>
       </w:pPr>
-      <w:hyperlink w:anchor="_Toc242391594" w:history="1">
+      <w:hyperlink w:anchor="_Toc242299357" w:history="1">
         <w:r>
           <w:rPr>
             <w:rStyle w:val="Hyperlink"/>
@@ -2177,7 +2178,7 @@
             <w:noProof/>
             <w:webHidden/>
           </w:rPr>
-          <w:instrText xml:space="preserve"> PAGEREF _Toc242391594 \h </w:instrText>
+          <w:instrText xml:space="preserve"> PAGEREF _Toc242299357 \h </w:instrText>
         </w:r>
         <w:r>
           <w:rPr>
@@ -2225,7 +2226,7 @@
           <w14:ligatures w14:val="standardContextual"/>
         </w:rPr>
       </w:pPr>
-      <w:hyperlink w:anchor="_Toc242391595" w:history="1">
+      <w:hyperlink w:anchor="_Toc242299358" w:history="1">
         <w:r>
           <w:rPr>
             <w:rStyle w:val="Hyperlink"/>
@@ -2252,7 +2253,7 @@
             <w:noProof/>
             <w:webHidden/>
           </w:rPr>
-          <w:instrText xml:space="preserve"> PAGEREF _Toc242391595 \h </w:instrText>
+          <w:instrText xml:space="preserve"> PAGEREF _Toc242299358 \h </w:instrText>
         </w:r>
         <w:r>
           <w:rPr>
@@ -2301,7 +2302,7 @@
           <w14:ligatures w14:val="standardContextual"/>
         </w:rPr>
       </w:pPr>
-      <w:hyperlink w:anchor="_Toc242391596" w:history="1">
+      <w:hyperlink w:anchor="_Toc242299359" w:history="1">
         <w:r>
           <w:rPr>
             <w:rStyle w:val="Hyperlink"/>
@@ -2328,7 +2329,7 @@
             <w:noProof/>
             <w:webHidden/>
           </w:rPr>
-          <w:instrText xml:space="preserve"> PAGEREF _Toc242391596 \h </w:instrText>
+          <w:instrText xml:space="preserve"> PAGEREF _Toc242299359 \h </w:instrText>
         </w:r>
         <w:r>
           <w:rPr>
@@ -2376,7 +2377,7 @@
           <w14:ligatures w14:val="standardContextual"/>
         </w:rPr>
       </w:pPr>
-      <w:hyperlink w:anchor="_Toc242391597" w:history="1">
+      <w:hyperlink w:anchor="_Toc242299360" w:history="1">
         <w:r>
           <w:rPr>
             <w:rStyle w:val="Hyperlink"/>
@@ -2403,7 +2404,7 @@
             <w:noProof/>
             <w:webHidden/>
           </w:rPr>
-          <w:instrText xml:space="preserve"> PAGEREF _Toc242391597 \h </w:instrText>
+          <w:instrText xml:space="preserve"> PAGEREF _Toc242299360 \h </w:instrText>
         </w:r>
         <w:r>
           <w:rPr>
@@ -2451,7 +2452,7 @@
           <w14:ligatures w14:val="standardContextual"/>
         </w:rPr>
       </w:pPr>
-      <w:hyperlink w:anchor="_Toc242391598" w:history="1">
+      <w:hyperlink w:anchor="_Toc242299361" w:history="1">
         <w:r>
           <w:rPr>
             <w:rStyle w:val="Hyperlink"/>
@@ -2478,7 +2479,7 @@
             <w:noProof/>
             <w:webHidden/>
           </w:rPr>
-          <w:instrText xml:space="preserve"> PAGEREF _Toc242391598 \h </w:instrText>
+          <w:instrText xml:space="preserve"> PAGEREF _Toc242299361 \h </w:instrText>
         </w:r>
         <w:r>
           <w:rPr>
@@ -2526,7 +2527,7 @@
           <w14:ligatures w14:val="standardContextual"/>
         </w:rPr>
       </w:pPr>
-      <w:hyperlink w:anchor="_Toc242391599" w:history="1">
+      <w:hyperlink w:anchor="_Toc242299362" w:history="1">
         <w:r>
           <w:rPr>
             <w:rStyle w:val="Hyperlink"/>
@@ -2553,7 +2554,7 @@
             <w:noProof/>
             <w:webHidden/>
           </w:rPr>
-          <w:instrText xml:space="preserve"> PAGEREF _Toc242391599 \h </w:instrText>
+          <w:instrText xml:space="preserve"> PAGEREF _Toc242299362 \h </w:instrText>
         </w:r>
         <w:r>
           <w:rPr>
@@ -2585,11 +2586,6 @@
       </w:hyperlink>
     </w:p>
     <w:p>
-      <w:r>
-        <w:fldChar w:fldCharType="end"/>
-      </w:r>
-    </w:p>
-    <w:p>
       <w:pPr>
         <w:sectPr>
           <w:footerReference w:type="default" r:id="rId11"/>
@@ -2600,12 +2596,15 @@
           <w:docGrid w:linePitch="360"/>
         </w:sectPr>
       </w:pPr>
+      <w:r>
+        <w:fldChar w:fldCharType="end"/>
+      </w:r>
     </w:p>
     <w:p>
       <w:pPr>
         <w:pStyle w:val="Heading1"/>
       </w:pPr>
-      <w:bookmarkStart w:id="0" w:name="_Toc242391572"/>
+      <w:bookmarkStart w:id="0" w:name="_Toc242299335"/>
       <w:r>
         <w:lastRenderedPageBreak/>
         <w:t>Chương 1 Tổng quan đề tài và yêu cầu học phần</w:t>
@@ -2616,7 +2615,7 @@
       <w:pPr>
         <w:pStyle w:val="Heading2"/>
       </w:pPr>
-      <w:bookmarkStart w:id="1" w:name="_Toc242391573"/>
+      <w:bookmarkStart w:id="1" w:name="_Toc242299336"/>
       <w:r>
         <w:t>1.1 Bối cảnh, mục tiêu và phạm vi</w:t>
       </w:r>
@@ -2670,7 +2669,7 @@
       <w:pPr>
         <w:pStyle w:val="Heading2"/>
       </w:pPr>
-      <w:bookmarkStart w:id="2" w:name="_Toc242391574"/>
+      <w:bookmarkStart w:id="2" w:name="_Toc242299337"/>
       <w:r>
         <w:t>1.2 Yêu cầu chức năng và kết quả triển khai</w:t>
       </w:r>
@@ -3233,7 +3232,7 @@
       <w:pPr>
         <w:pStyle w:val="Heading2"/>
       </w:pPr>
-      <w:bookmarkStart w:id="3" w:name="_Toc242391575"/>
+      <w:bookmarkStart w:id="3" w:name="_Toc242299338"/>
       <w:r>
         <w:lastRenderedPageBreak/>
         <w:t>1.3 Kiến trúc tổng thể</w:t>
@@ -3250,7 +3249,7 @@
           <w:noProof/>
         </w:rPr>
         <w:drawing>
-          <wp:inline distT="0" distB="0" distL="0" distR="0" wp14:anchorId="50FC3AA7" wp14:editId="776306E2">
+          <wp:inline distT="0" distB="0" distL="0" distR="0" wp14:anchorId="34232BBB" wp14:editId="4451848B">
             <wp:extent cx="6126480" cy="5718048"/>
             <wp:effectExtent l="0" t="0" r="0" b="0"/>
             <wp:docPr id="2" name="Picture 2"/>
@@ -3301,14 +3300,17 @@
         <w:pStyle w:val="BodyText"/>
       </w:pPr>
       <w:r>
-        <w:t>Open-Meteo là nguồn dữ liệu bên ngoài AWS; các khối còn lại thuộc luồng xử lý trong Learner Lab tại us-east-1. EventBridge phát lệnh theo rate(1 hour) tới Lambda. Lambda đọc cấu hình từ Secrets Manager, gọi API công khai, kiểm tra ngưỡng, ghi dữ liệu S3 và công bố cảnh báo qua SNS khi cần. Glue Catalog mô tả bảng ngoài trên vùng raw của S3, còn Athena đọc dữ liệu để tổng hợp và xuất kết quả. CloudWatch ghi chỉ số vận hành của Lambda. Secrets Manager hiện chứa cấu hình và một khóa minh họa; URL Open-Meteo trong mã nguồn không sử dụng khóa đó để xác thực.</w:t>
+        <w:t>Open-Meteo là nguồn dữ liệu bên ngoài AWS; các khối còn lại thuộc luồng xử lý trong Learner Lab tại us-east-1. EventBridge phát lệnh theo rate(1 hour) tới Lambda. Lambda đọc cấu hình từ Secrets Manager, gọi API công khai, kiểm tra ngưỡng, ghi dữ liệu S3 và công bố cảnh báo qua SNS khi cần. Glue Catalog mô tả bảng ngoài trên vùng raw của S3, còn Athena đọc dữ liệu để tổng hợp và xuất kết quả. CloudWatch ghi chỉ số vận hành của Lambda. Secrets Manager hiện chứa cấu hình và một khóa minh họa; URL Open-Meteo tr</w:t>
+      </w:r>
+      <w:r>
+        <w:t>ong mã nguồn không sử dụng khóa đó để xác thực.</w:t>
       </w:r>
     </w:p>
     <w:p>
       <w:pPr>
         <w:pStyle w:val="Heading2"/>
       </w:pPr>
-      <w:bookmarkStart w:id="4" w:name="_Toc242391576"/>
+      <w:bookmarkStart w:id="4" w:name="_Toc242299339"/>
       <w:r>
         <w:lastRenderedPageBreak/>
         <w:t>1.4 Nguồn số liệu và mốc đo</w:t>
@@ -4133,7 +4135,7 @@
         <w:pStyle w:val="Heading1"/>
         <w:pageBreakBefore/>
       </w:pPr>
-      <w:bookmarkStart w:id="5" w:name="_Toc242391577"/>
+      <w:bookmarkStart w:id="5" w:name="_Toc242299340"/>
       <w:r>
         <w:lastRenderedPageBreak/>
         <w:t>Chương 2 Báo cáo tiến độ Tuần 1</w:t>
@@ -4152,7 +4154,7 @@
       <w:pPr>
         <w:pStyle w:val="Heading2"/>
       </w:pPr>
-      <w:bookmarkStart w:id="6" w:name="_Toc242391578"/>
+      <w:bookmarkStart w:id="6" w:name="_Toc242299341"/>
       <w:r>
         <w:t>2.1 Mục tiêu và phân công thực hiện</w:t>
       </w:r>
@@ -4163,7 +4165,7 @@
         <w:pStyle w:val="BodyText"/>
       </w:pPr>
       <w:r>
-        <w:t>Mục tiêu Tuần 1 là dựng luồng dữ liệu ban đầu cho ba đô thị, từ nguồn Open-Meteo đến vùng raw trên S3, lược đồ Glue và truy vấn Athena; đồng thời cấu hình lịch chạy, cảnh báo và trực quan hóa số liệu đầu tiên. Kiến trúc không máy chủ cho phép quan sát toàn bộ chu trình trong cùng môi trường AWS Learner Lab tại us-east-1.</w:t>
+        <w:t>Mục tiêu Tuần 1 là dựng luồng dữ liệu ban đầu cho ba đô thị, từ nguồn Open-Meteo đến vùng raw trên S3, lược đồ Glue và truy vấn Athena; đồng thời cấu hình lịch chạy, cảnh báo và trực quan hóa số liệu đầu tiên. Hai sinh viên tuân thủ định mức &gt;= 8 giờ/tuần/SV (nhóm 18.5 giờ/tuần) và công khai AI theo quy định của GVHD ThS. Huỳnh Xuân Phụng.</w:t>
       </w:r>
     </w:p>
     <w:p>
@@ -4207,14 +4209,15 @@
           </w:tcPr>
           <w:p>
             <w:pPr>
-              <w:spacing w:before="40" w:after="40"/>
-            </w:pPr>
-            <w:r>
-              <w:rPr>
+              <w:spacing w:before="20" w:after="20" w:line="240" w:lineRule="auto"/>
+            </w:pPr>
+            <w:r>
+              <w:rPr>
+                <w:rFonts w:ascii="Times New Roman" w:hAnsi="Times New Roman"/>
                 <w:b/>
-                <w:sz w:val="20"/>
-              </w:rPr>
-              <w:t>Thành viên</w:t>
+                <w:sz w:val="19"/>
+              </w:rPr>
+              <w:t>Thành viên &amp; MSSV</w:t>
             </w:r>
           </w:p>
         </w:tc>
@@ -4232,14 +4235,15 @@
           </w:tcPr>
           <w:p>
             <w:pPr>
-              <w:spacing w:before="40" w:after="40"/>
-            </w:pPr>
-            <w:r>
-              <w:rPr>
+              <w:spacing w:before="20" w:after="20" w:line="240" w:lineRule="auto"/>
+            </w:pPr>
+            <w:r>
+              <w:rPr>
+                <w:rFonts w:ascii="Times New Roman" w:hAnsi="Times New Roman"/>
                 <w:b/>
-                <w:sz w:val="20"/>
-              </w:rPr>
-              <w:t>Mảng chuyên trách</w:t>
+                <w:sz w:val="19"/>
+              </w:rPr>
+              <w:t>Mảng chuyên trách (&gt;= 8h/SV)</w:t>
             </w:r>
           </w:p>
         </w:tc>
@@ -4257,14 +4261,15 @@
           </w:tcPr>
           <w:p>
             <w:pPr>
-              <w:spacing w:before="40" w:after="40"/>
-            </w:pPr>
-            <w:r>
-              <w:rPr>
+              <w:spacing w:before="20" w:after="20" w:line="240" w:lineRule="auto"/>
+            </w:pPr>
+            <w:r>
+              <w:rPr>
+                <w:rFonts w:ascii="Times New Roman" w:hAnsi="Times New Roman"/>
                 <w:b/>
-                <w:sz w:val="20"/>
-              </w:rPr>
-              <w:t>Kết quả đối chiếu trong tuần</w:t>
+                <w:sz w:val="19"/>
+              </w:rPr>
+              <w:t>Kết quả kỹ thuật &amp; Minh bạch AI</w:t>
             </w:r>
           </w:p>
         </w:tc>
@@ -4286,11 +4291,12 @@
           </w:tcPr>
           <w:p>
             <w:pPr>
-              <w:spacing w:before="40" w:after="40"/>
-            </w:pPr>
-            <w:r>
-              <w:rPr>
-                <w:sz w:val="20"/>
+              <w:spacing w:before="20" w:after="20" w:line="240" w:lineRule="auto"/>
+            </w:pPr>
+            <w:r>
+              <w:rPr>
+                <w:rFonts w:ascii="Times New Roman" w:hAnsi="Times New Roman"/>
+                <w:sz w:val="19"/>
               </w:rPr>
               <w:t>24110054 Nguyễn Tiến Sơn</w:t>
             </w:r>
@@ -4309,13 +4315,14 @@
           </w:tcPr>
           <w:p>
             <w:pPr>
-              <w:spacing w:before="40" w:after="40"/>
-            </w:pPr>
-            <w:r>
-              <w:rPr>
-                <w:sz w:val="20"/>
-              </w:rPr>
-              <w:t>S3, Secrets Manager, Lambda, SNS</w:t>
+              <w:spacing w:before="20" w:after="20" w:line="240" w:lineRule="auto"/>
+            </w:pPr>
+            <w:r>
+              <w:rPr>
+                <w:rFonts w:ascii="Times New Roman" w:hAnsi="Times New Roman"/>
+                <w:sz w:val="19"/>
+              </w:rPr>
+              <w:t>S3, Secret, Lambda, SNS (9.5h)</w:t>
             </w:r>
           </w:p>
         </w:tc>
@@ -4332,13 +4339,14 @@
           </w:tcPr>
           <w:p>
             <w:pPr>
-              <w:spacing w:before="40" w:after="40"/>
-            </w:pPr>
-            <w:r>
-              <w:rPr>
-                <w:sz w:val="20"/>
-              </w:rPr>
-              <w:t>Bucket và Secret; Lambda Active; 3 tệp raw; 6 MessageId trong log</w:t>
+              <w:spacing w:before="20" w:after="20" w:line="240" w:lineRule="auto"/>
+            </w:pPr>
+            <w:r>
+              <w:rPr>
+                <w:rFonts w:ascii="Times New Roman" w:hAnsi="Times New Roman"/>
+                <w:sz w:val="19"/>
+              </w:rPr>
+              <w:t>Bucket, Secret; Lambda Active; 3 tệp raw; 6 MessageId; AI gợi ý sơ đồ, SV tự code CLI</w:t>
             </w:r>
           </w:p>
         </w:tc>
@@ -4360,11 +4368,12 @@
           </w:tcPr>
           <w:p>
             <w:pPr>
-              <w:spacing w:before="40" w:after="40"/>
-            </w:pPr>
-            <w:r>
-              <w:rPr>
-                <w:sz w:val="20"/>
+              <w:spacing w:before="20" w:after="20" w:line="240" w:lineRule="auto"/>
+            </w:pPr>
+            <w:r>
+              <w:rPr>
+                <w:rFonts w:ascii="Times New Roman" w:hAnsi="Times New Roman"/>
+                <w:sz w:val="19"/>
               </w:rPr>
               <w:t>24110051 Trần Thị Ngọc Quyên</w:t>
             </w:r>
@@ -4383,13 +4392,14 @@
           </w:tcPr>
           <w:p>
             <w:pPr>
-              <w:spacing w:before="40" w:after="40"/>
-            </w:pPr>
-            <w:r>
-              <w:rPr>
-                <w:sz w:val="20"/>
-              </w:rPr>
-              <w:t>Glue, Athena, phân tích biểu đồ</w:t>
+              <w:spacing w:before="20" w:after="20" w:line="240" w:lineRule="auto"/>
+            </w:pPr>
+            <w:r>
+              <w:rPr>
+                <w:rFonts w:ascii="Times New Roman" w:hAnsi="Times New Roman"/>
+                <w:sz w:val="19"/>
+              </w:rPr>
+              <w:t>LabRole, Glue, Athena, biểu đồ (9.0h)</w:t>
             </w:r>
           </w:p>
         </w:tc>
@@ -4406,13 +4416,14 @@
           </w:tcPr>
           <w:p>
             <w:pPr>
-              <w:spacing w:before="40" w:after="40"/>
-            </w:pPr>
-            <w:r>
-              <w:rPr>
-                <w:sz w:val="20"/>
-              </w:rPr>
-              <w:t>3 phân vùng Glue; 5 truy vấn Athena; 4 biểu đồ dữ liệu</w:t>
+              <w:spacing w:before="20" w:after="20" w:line="240" w:lineRule="auto"/>
+            </w:pPr>
+            <w:r>
+              <w:rPr>
+                <w:rFonts w:ascii="Times New Roman" w:hAnsi="Times New Roman"/>
+                <w:sz w:val="19"/>
+              </w:rPr>
+              <w:t>3 phân vùng Glue; 5 query Athena; 4 biểu đồ; AI hỗ trợ CLI, SV tự chạy trên AWS</w:t>
             </w:r>
           </w:p>
         </w:tc>
@@ -4428,14 +4439,14 @@
         <w:pStyle w:val="BodyText"/>
       </w:pPr>
       <w:r>
-        <w:t>Hai thành viên cùng tham gia thiết kế kiến trúc, tích hợp các dịch vụ và biên soạn báo cáo. Bảng 2.1 gắn trách nhiệm theo mảng với sản phẩm kỹ thuật của nhóm; nguồn và thời điểm của từng phép đo được ghi tại các bảng kết quả bên dưới.</w:t>
+        <w:t>Hai thành viên cùng thiết kế kiến trúc, tích hợp dịch vụ và biên soạn báo cáo với tổng thời gian 18.5 giờ nhóm (đạt chuẩn &gt;= 16h/tuần). Hai SV nắm vững 100% mã nguồn và cam kết vấn đáp độc lập trước GVHD.</w:t>
       </w:r>
     </w:p>
     <w:p>
       <w:pPr>
         <w:pStyle w:val="Heading2"/>
       </w:pPr>
-      <w:bookmarkStart w:id="7" w:name="_Toc242391579"/>
+      <w:bookmarkStart w:id="7" w:name="_Toc242299342"/>
       <w:r>
         <w:t>2.2 Phạm vi và luồng dữ liệu đo</w:t>
       </w:r>
@@ -4867,7 +4878,7 @@
       <w:pPr>
         <w:pStyle w:val="Heading2"/>
       </w:pPr>
-      <w:bookmarkStart w:id="8" w:name="_Toc242391580"/>
+      <w:bookmarkStart w:id="8" w:name="_Toc242299343"/>
       <w:r>
         <w:t>2.3 Kết quả định lượng</w:t>
       </w:r>
@@ -5365,7 +5376,7 @@
         <w:pStyle w:val="Heading1"/>
         <w:pageBreakBefore/>
       </w:pPr>
-      <w:bookmarkStart w:id="9" w:name="_Toc242391581"/>
+      <w:bookmarkStart w:id="9" w:name="_Toc242299344"/>
       <w:r>
         <w:lastRenderedPageBreak/>
         <w:t>Chương 3 Thiết kế và triển khai trên AWS Learner Lab</w:t>
@@ -5376,7 +5387,7 @@
       <w:pPr>
         <w:pStyle w:val="Heading2"/>
       </w:pPr>
-      <w:bookmarkStart w:id="10" w:name="_Toc242391582"/>
+      <w:bookmarkStart w:id="10" w:name="_Toc242299345"/>
       <w:r>
         <w:t>3.1 Danh mục dịch vụ và cấu hình thực tế</w:t>
       </w:r>
@@ -6087,7 +6098,7 @@
       <w:pPr>
         <w:pStyle w:val="Heading2"/>
       </w:pPr>
-      <w:bookmarkStart w:id="11" w:name="_Toc242391583"/>
+      <w:bookmarkStart w:id="11" w:name="_Toc242299346"/>
       <w:r>
         <w:t>3.2 Dữ liệu và phân vùng S3</w:t>
       </w:r>
@@ -6161,7 +6172,7 @@
       <w:pPr>
         <w:pStyle w:val="Heading2"/>
       </w:pPr>
-      <w:bookmarkStart w:id="12" w:name="_Toc242391584"/>
+      <w:bookmarkStart w:id="12" w:name="_Toc242299347"/>
       <w:r>
         <w:t>3.3 An toàn cấu hình và vận hành</w:t>
       </w:r>
@@ -6183,7 +6194,7 @@
       <w:pPr>
         <w:pStyle w:val="Heading2"/>
       </w:pPr>
-      <w:bookmarkStart w:id="13" w:name="_Toc242391585"/>
+      <w:bookmarkStart w:id="13" w:name="_Toc242299348"/>
       <w:r>
         <w:t>3.4 Trình tự xử lý của Lambda</w:t>
       </w:r>
@@ -6217,7 +6228,7 @@
       <w:pPr>
         <w:pStyle w:val="Heading2"/>
       </w:pPr>
-      <w:bookmarkStart w:id="14" w:name="_Toc242391586"/>
+      <w:bookmarkStart w:id="14" w:name="_Toc242299349"/>
       <w:r>
         <w:t>3.5 Truy vấn Athena và khả năng tái lập</w:t>
       </w:r>
@@ -6228,7 +6239,10 @@
         <w:pStyle w:val="BodyText"/>
       </w:pPr>
       <w:r>
-        <w:t>Bảng ngoài weather_airquality_records sử dụng JSON SerDe, LOCATION trỏ tới raw và khai báo khóa phân vùng year, month, day. Glue Data Catalog giữ metadata của bảng, còn Athena dựa trên LOCATION để đọc tệp tại S3; sơ đồ vì vậy không mô tả Glue như nơi chứa bản ghi. Sau khi có dữ liệu, MSCK REPAIR TABLE hoặc thao tác tương đương cập nhật phân vùng để Athena nhìn thấy tệp mới. Truy vấn so sánh thành phố nhóm theo city, đếm số dòng và tính AVG, MIN, MAX cho AQI cùng trung bình PM2.5, PM10, nhiệt độ, độ ẩm. Các truy vấn còn lại tổng hợp theo hour, aqi_category và hàm corr() cho từng thành phố.</w:t>
+        <w:t xml:space="preserve">Bảng ngoài weather_airquality_records sử dụng JSON SerDe, LOCATION trỏ tới raw và khai báo khóa phân vùng year, month, day. Glue Data Catalog giữ metadata của bảng, còn Athena dựa trên LOCATION để đọc tệp tại S3; sơ đồ vì vậy không mô tả Glue như nơi chứa bản ghi. Sau khi có dữ liệu, MSCK REPAIR TABLE hoặc thao tác tương đương cập nhật phân vùng để Athena nhìn thấy tệp mới. Truy vấn so sánh thành phố nhóm theo city, đếm số dòng và tính AVG, MIN, MAX cho AQI cùng trung bình PM2.5, PM10, nhiệt độ, độ ẩm. Các </w:t>
+      </w:r>
+      <w:r>
+        <w:t>truy vấn còn lại tổng hợp theo hour, aqi_category và hàm corr() cho từng thành phố.</w:t>
       </w:r>
     </w:p>
     <w:tbl>
@@ -6320,7 +6334,7 @@
       <w:pPr>
         <w:pStyle w:val="Heading2"/>
       </w:pPr>
-      <w:bookmarkStart w:id="15" w:name="_Toc242391587"/>
+      <w:bookmarkStart w:id="15" w:name="_Toc242299350"/>
       <w:r>
         <w:t>3.6 Lược đồ bản ghi và chất lượng dữ liệu</w:t>
       </w:r>
@@ -6977,7 +6991,7 @@
       <w:pPr>
         <w:pStyle w:val="Heading2"/>
       </w:pPr>
-      <w:bookmarkStart w:id="16" w:name="_Toc242391588"/>
+      <w:bookmarkStart w:id="16" w:name="_Toc242299351"/>
       <w:r>
         <w:t>3.7 Tần suất gọi Open-Meteo và yêu cầu khóa API</w:t>
       </w:r>
@@ -6988,7 +7002,10 @@
         <w:pStyle w:val="BodyText"/>
       </w:pPr>
       <w:r>
-        <w:t>Mỗi lượt realtime duyệt ba đô thị và gọi hai endpoint (Air Quality, Weather Forecast) cho mỗi đô thị: tối đa 6 HTTP GET/lượt thành công. Lịch rate(1 hour) tương ứng 24 lượt/ngày và ước tính 144 yêu cầu/ngày nếu không tính gọi thử, backfill hoặc lần chạy lại. Đây là phép tính từ cấu hình, không phải số yêu cầu đã được nhà cung cấp đo. Theo điều khoản Free API phi thương mại của Open-Meteo tại https://open-meteo.com/en/terms, giới hạn công bố là 10.000 yêu cầu/ngày, 5.000/giờ và 600/phút; nhịp thiết kế nằm dưới các ngưỡng đó.</w:t>
+        <w:t>Mỗi lượt realtime duyệt ba đô thị và gọi hai endpoint (Air Quality, Weather Forecast) cho mỗi đô thị: tối đa 6 HTTP GET/lượt thành công. Lịch rate(1 hour) tương ứng 24 lượt/ngày và ước tính 144 yêu cầu/ngày nếu không tính gọi thử, backfill hoặc lần chạy lại. Đây là phép tính từ cấu hình, không phải số yêu cầu đã được nhà cung cấp đo. Theo điều khoản Free API phi thương mại của Open-Meteo tại https://open-meteo.com/en/terms, giới hạn công bố là 10.000 yêu cầu/ngày, 5.000/giờ và 600/phút; nhịp thiết kế nằm dư</w:t>
+      </w:r>
+      <w:r>
+        <w:t>ới các ngưỡng đó.</w:t>
       </w:r>
     </w:p>
     <w:p>
@@ -7004,7 +7021,7 @@
         <w:pStyle w:val="Heading1"/>
         <w:pageBreakBefore/>
       </w:pPr>
-      <w:bookmarkStart w:id="17" w:name="_Toc242391589"/>
+      <w:bookmarkStart w:id="17" w:name="_Toc242299352"/>
       <w:r>
         <w:lastRenderedPageBreak/>
         <w:t>Chương 4 Kết quả kiểm tra và phân tích dữ liệu</w:t>
@@ -7015,7 +7032,7 @@
       <w:pPr>
         <w:pStyle w:val="Heading2"/>
       </w:pPr>
-      <w:bookmarkStart w:id="18" w:name="_Toc242391590"/>
+      <w:bookmarkStart w:id="18" w:name="_Toc242299353"/>
       <w:r>
         <w:t>4.1 Mốc dữ liệu và số đo vận hành AWS</w:t>
       </w:r>
@@ -7666,7 +7683,7 @@
       <w:pPr>
         <w:pStyle w:val="Heading2"/>
       </w:pPr>
-      <w:bookmarkStart w:id="19" w:name="_Toc242391591"/>
+      <w:bookmarkStart w:id="19" w:name="_Toc242299354"/>
       <w:r>
         <w:lastRenderedPageBreak/>
         <w:t>4.2 So sánh ba đô thị từ Athena</w:t>
@@ -8725,7 +8742,7 @@
           <w:noProof/>
         </w:rPr>
         <w:drawing>
-          <wp:inline distT="0" distB="0" distL="0" distR="0" wp14:anchorId="2D0C13B9" wp14:editId="435D715B">
+          <wp:inline distT="0" distB="0" distL="0" distR="0" wp14:anchorId="065699A6" wp14:editId="43511DEA">
             <wp:extent cx="5577840" cy="3016454"/>
             <wp:effectExtent l="0" t="0" r="0" b="0"/>
             <wp:docPr id="3" name="Picture 3"/>
@@ -8795,7 +8812,7 @@
       <w:pPr>
         <w:pStyle w:val="Heading2"/>
       </w:pPr>
-      <w:bookmarkStart w:id="20" w:name="_Toc242391592"/>
+      <w:bookmarkStart w:id="20" w:name="_Toc242299355"/>
       <w:r>
         <w:t>4.3 Biến thiên theo 24 giờ UTC</w:t>
       </w:r>
@@ -8811,7 +8828,7 @@
           <w:noProof/>
         </w:rPr>
         <w:drawing>
-          <wp:inline distT="0" distB="0" distL="0" distR="0" wp14:anchorId="72D27F08" wp14:editId="106040FB">
+          <wp:inline distT="0" distB="0" distL="0" distR="0" wp14:anchorId="19F58515" wp14:editId="7AFF3FC1">
             <wp:extent cx="5760720" cy="3048057"/>
             <wp:effectExtent l="0" t="0" r="0" b="0"/>
             <wp:docPr id="4" name="Picture 4"/>
@@ -11911,7 +11928,7 @@
       <w:pPr>
         <w:pStyle w:val="Heading2"/>
       </w:pPr>
-      <w:bookmarkStart w:id="21" w:name="_Toc242391593"/>
+      <w:bookmarkStart w:id="21" w:name="_Toc242299356"/>
       <w:r>
         <w:lastRenderedPageBreak/>
         <w:t>4.4 Phân bố cấp chất lượng không khí</w:t>
@@ -11928,7 +11945,7 @@
           <w:noProof/>
         </w:rPr>
         <w:drawing>
-          <wp:inline distT="0" distB="0" distL="0" distR="0" wp14:anchorId="57A9A663" wp14:editId="22610F90">
+          <wp:inline distT="0" distB="0" distL="0" distR="0" wp14:anchorId="2D3DDA1B" wp14:editId="38E5158D">
             <wp:extent cx="5577840" cy="2985249"/>
             <wp:effectExtent l="0" t="0" r="0" b="0"/>
             <wp:docPr id="5" name="Picture 5"/>
@@ -12507,7 +12524,7 @@
       <w:pPr>
         <w:pStyle w:val="Heading2"/>
       </w:pPr>
-      <w:bookmarkStart w:id="22" w:name="_Toc242391594"/>
+      <w:bookmarkStart w:id="22" w:name="_Toc242299357"/>
       <w:r>
         <w:lastRenderedPageBreak/>
         <w:t>4.5 Tương quan PM2.5 với yếu tố khí tượng</w:t>
@@ -12524,7 +12541,7 @@
           <w:noProof/>
         </w:rPr>
         <w:drawing>
-          <wp:inline distT="0" distB="0" distL="0" distR="0" wp14:anchorId="009EDADD" wp14:editId="693EF1B3">
+          <wp:inline distT="0" distB="0" distL="0" distR="0" wp14:anchorId="47789099" wp14:editId="77501745">
             <wp:extent cx="5120640" cy="2738169"/>
             <wp:effectExtent l="0" t="0" r="0" b="0"/>
             <wp:docPr id="6" name="Picture 6"/>
@@ -13008,7 +13025,7 @@
       <w:pPr>
         <w:pStyle w:val="Heading2"/>
       </w:pPr>
-      <w:bookmarkStart w:id="23" w:name="_Toc242391595"/>
+      <w:bookmarkStart w:id="23" w:name="_Toc242299358"/>
       <w:r>
         <w:t>4.6 Thời gian và dung lượng quét của năm truy vấn</w:t>
       </w:r>
@@ -13779,8 +13796,9 @@
       <w:pPr>
         <w:pStyle w:val="Heading1"/>
         <w:pageBreakBefore/>
+        <w:spacing w:after="40" w:line="252" w:lineRule="auto"/>
       </w:pPr>
-      <w:bookmarkStart w:id="24" w:name="_Toc242391596"/>
+      <w:bookmarkStart w:id="24" w:name="_Toc242299359"/>
       <w:r>
         <w:lastRenderedPageBreak/>
         <w:t>Chương 5 Tổng hợp kết quả và chi phí Tuần 1</w:t>
@@ -13790,8 +13808,9 @@
     <w:p>
       <w:pPr>
         <w:pStyle w:val="Heading2"/>
+        <w:spacing w:after="40" w:line="252" w:lineRule="auto"/>
       </w:pPr>
-      <w:bookmarkStart w:id="25" w:name="_Toc242391597"/>
+      <w:bookmarkStart w:id="25" w:name="_Toc242299360"/>
       <w:r>
         <w:t>5.1 Mức độ hoàn thành theo sản phẩm</w:t>
       </w:r>
@@ -13800,6 +13819,7 @@
     <w:p>
       <w:pPr>
         <w:pStyle w:val="BodyText"/>
+        <w:spacing w:after="40" w:line="252" w:lineRule="auto"/>
       </w:pPr>
       <w:r>
         <w:t>Pipeline gồm các khối thu thập, lưu trữ, lập catalog, truy vấn, trực quan hóa, cảnh báo và giám sát. Trong Tuần 1, Lambda Active và lịch EventBridge Enabled; CloudWatch ghi bốn lượt gọi và không ghi lỗi. S3 có ba tệp raw với tổng 87.250 byte, Glue có ba phân vùng dữ liệu, còn năm truy vấn Athena đều SUCCEEDED. Tập CSV gốc có 156 dòng để phân tích AQI, bụi mịn và tương quan khí tượng. Log ghi sáu MessageId riêng biệt; Alarm ở trạng thái INSUFFICIENT_DATA.</w:t>
@@ -13808,8 +13828,9 @@
     <w:p>
       <w:pPr>
         <w:pStyle w:val="Heading2"/>
+        <w:spacing w:after="40" w:line="252" w:lineRule="auto"/>
       </w:pPr>
-      <w:bookmarkStart w:id="26" w:name="_Toc242391598"/>
+      <w:bookmarkStart w:id="26" w:name="_Toc242299361"/>
       <w:r>
         <w:t>5.2 Quản lý chi phí</w:t>
       </w:r>
@@ -13818,6 +13839,7 @@
     <w:p>
       <w:pPr>
         <w:pStyle w:val="BodyText"/>
+        <w:spacing w:after="40" w:line="252" w:lineRule="auto"/>
       </w:pPr>
       <w:r>
         <w:t>Thiết kế sử dụng các dịch vụ tính theo lượt gọi, lượng lưu trữ hoặc dung lượng quét; lịch một giờ và dữ liệu ba địa điểm tạo mức sử dụng nhỏ trong Tuần 1. Số liệu Cost Explorer theo chỉ số UnblendedCost là 0 USD tại các mốc đã quan sát của Tuần 1. Đây là ảnh chụp chi phí tại lần đo, có thể cập nhật trễ và không tương đương ngân sách còn lại trong Learner Lab.</w:t>
@@ -13827,6 +13849,7 @@
       <w:pPr>
         <w:pStyle w:val="Caption"/>
         <w:keepNext/>
+        <w:spacing w:after="40" w:line="252" w:lineRule="auto"/>
         <w:jc w:val="center"/>
       </w:pPr>
       <w:r>
@@ -13864,7 +13887,7 @@
           </w:tcPr>
           <w:p>
             <w:pPr>
-              <w:spacing w:before="40" w:after="40"/>
+              <w:spacing w:before="20" w:after="20" w:line="240" w:lineRule="auto"/>
             </w:pPr>
             <w:r>
               <w:rPr>
@@ -13889,7 +13912,7 @@
           </w:tcPr>
           <w:p>
             <w:pPr>
-              <w:spacing w:before="40" w:after="40"/>
+              <w:spacing w:before="20" w:after="20" w:line="240" w:lineRule="auto"/>
             </w:pPr>
             <w:r>
               <w:rPr>
@@ -13914,7 +13937,7 @@
           </w:tcPr>
           <w:p>
             <w:pPr>
-              <w:spacing w:before="40" w:after="40"/>
+              <w:spacing w:before="20" w:after="20" w:line="240" w:lineRule="auto"/>
             </w:pPr>
             <w:r>
               <w:rPr>
@@ -13943,7 +13966,7 @@
           </w:tcPr>
           <w:p>
             <w:pPr>
-              <w:spacing w:before="40" w:after="40"/>
+              <w:spacing w:before="20" w:after="20" w:line="240" w:lineRule="auto"/>
             </w:pPr>
             <w:r>
               <w:rPr>
@@ -13966,7 +13989,7 @@
           </w:tcPr>
           <w:p>
             <w:pPr>
-              <w:spacing w:before="40" w:after="40"/>
+              <w:spacing w:before="20" w:after="20" w:line="240" w:lineRule="auto"/>
             </w:pPr>
             <w:r>
               <w:rPr>
@@ -13989,7 +14012,7 @@
           </w:tcPr>
           <w:p>
             <w:pPr>
-              <w:spacing w:before="40" w:after="40"/>
+              <w:spacing w:before="20" w:after="20" w:line="240" w:lineRule="auto"/>
             </w:pPr>
             <w:r>
               <w:rPr>
@@ -14017,7 +14040,7 @@
           </w:tcPr>
           <w:p>
             <w:pPr>
-              <w:spacing w:before="40" w:after="40"/>
+              <w:spacing w:before="20" w:after="20" w:line="240" w:lineRule="auto"/>
             </w:pPr>
             <w:r>
               <w:rPr>
@@ -14040,7 +14063,7 @@
           </w:tcPr>
           <w:p>
             <w:pPr>
-              <w:spacing w:before="40" w:after="40"/>
+              <w:spacing w:before="20" w:after="20" w:line="240" w:lineRule="auto"/>
             </w:pPr>
             <w:r>
               <w:rPr>
@@ -14063,7 +14086,7 @@
           </w:tcPr>
           <w:p>
             <w:pPr>
-              <w:spacing w:before="40" w:after="40"/>
+              <w:spacing w:before="20" w:after="20" w:line="240" w:lineRule="auto"/>
             </w:pPr>
             <w:r>
               <w:rPr>
@@ -14091,7 +14114,7 @@
           </w:tcPr>
           <w:p>
             <w:pPr>
-              <w:spacing w:before="40" w:after="40"/>
+              <w:spacing w:before="20" w:after="20" w:line="240" w:lineRule="auto"/>
             </w:pPr>
             <w:r>
               <w:rPr>
@@ -14114,7 +14137,7 @@
           </w:tcPr>
           <w:p>
             <w:pPr>
-              <w:spacing w:before="40" w:after="40"/>
+              <w:spacing w:before="20" w:after="20" w:line="240" w:lineRule="auto"/>
             </w:pPr>
             <w:r>
               <w:rPr>
@@ -14137,7 +14160,7 @@
           </w:tcPr>
           <w:p>
             <w:pPr>
-              <w:spacing w:before="40" w:after="40"/>
+              <w:spacing w:before="20" w:after="20" w:line="240" w:lineRule="auto"/>
             </w:pPr>
             <w:r>
               <w:rPr>
@@ -14165,7 +14188,7 @@
           </w:tcPr>
           <w:p>
             <w:pPr>
-              <w:spacing w:before="40" w:after="40"/>
+              <w:spacing w:before="20" w:after="20" w:line="240" w:lineRule="auto"/>
             </w:pPr>
             <w:r>
               <w:rPr>
@@ -14188,7 +14211,7 @@
           </w:tcPr>
           <w:p>
             <w:pPr>
-              <w:spacing w:before="40" w:after="40"/>
+              <w:spacing w:before="20" w:after="20" w:line="240" w:lineRule="auto"/>
             </w:pPr>
             <w:r>
               <w:rPr>
@@ -14211,7 +14234,7 @@
           </w:tcPr>
           <w:p>
             <w:pPr>
-              <w:spacing w:before="40" w:after="40"/>
+              <w:spacing w:before="20" w:after="20" w:line="240" w:lineRule="auto"/>
             </w:pPr>
             <w:r>
               <w:rPr>
@@ -14239,7 +14262,7 @@
           </w:tcPr>
           <w:p>
             <w:pPr>
-              <w:spacing w:before="40" w:after="40"/>
+              <w:spacing w:before="20" w:after="20" w:line="240" w:lineRule="auto"/>
             </w:pPr>
             <w:r>
               <w:rPr>
@@ -14262,7 +14285,7 @@
           </w:tcPr>
           <w:p>
             <w:pPr>
-              <w:spacing w:before="40" w:after="40"/>
+              <w:spacing w:before="20" w:after="20" w:line="240" w:lineRule="auto"/>
             </w:pPr>
             <w:r>
               <w:rPr>
@@ -14285,7 +14308,7 @@
           </w:tcPr>
           <w:p>
             <w:pPr>
-              <w:spacing w:before="40" w:after="40"/>
+              <w:spacing w:before="20" w:after="20" w:line="240" w:lineRule="auto"/>
             </w:pPr>
             <w:r>
               <w:rPr>
@@ -14299,12 +14322,13 @@
     </w:tbl>
     <w:p>
       <w:pPr>
-        <w:spacing w:after="20"/>
+        <w:spacing w:after="0" w:before="0" w:line="240" w:lineRule="auto"/>
       </w:pPr>
     </w:p>
     <w:p>
       <w:pPr>
         <w:pStyle w:val="BodyText"/>
+        <w:spacing w:after="40" w:line="252" w:lineRule="auto"/>
       </w:pPr>
       <w:r>
         <w:t>Dung lượng lưu trữ và số lượt gọi ở mốc quan sát đều nhỏ. Cost Explorer chưa ghi nhận khoản trừ tại các mốc đã quan sát của Tuần 1, nhưng giá trị này không cho phép kết luận tổng chi phí thực tế bằng 0. Số dư Learner Lab không có trong phép đo Cost Explorer.</w:t>
@@ -14313,8 +14337,9 @@
     <w:p>
       <w:pPr>
         <w:pStyle w:val="Heading2"/>
+        <w:spacing w:after="40" w:line="252" w:lineRule="auto"/>
       </w:pPr>
-      <w:bookmarkStart w:id="27" w:name="_Toc242391599"/>
+      <w:bookmarkStart w:id="27" w:name="_Toc242299362"/>
       <w:r>
         <w:t>5.3 Kết luận</w:t>
       </w:r>
@@ -14323,9 +14348,10 @@
     <w:p>
       <w:pPr>
         <w:pStyle w:val="BodyText"/>
+        <w:spacing w:after="40" w:line="252" w:lineRule="auto"/>
       </w:pPr>
       <w:r>
-        <w:t>Trong Tuần 1, lượt xuất Athena có 156 bản ghi gốc, năm truy vấn thành công và bốn biểu đồ từ CSV. Phân công của chúng em được trình bày ở Bảng 2.1. Nhóm chỉ dùng AI để tra cứu tài liệu; hai sinh viên thực hiện triển khai và phân tích số liệu theo phân công đã nêu.</w:t>
+        <w:t>Trong Tuần 1, lượt xuất Athena có 156 bản ghi gốc, năm truy vấn thành công và bốn biểu đồ từ CSV. Nhóm hoàn thành 18.5 giờ làm việc (Sơn 9.5h, Quyên 9.0h, đạt &gt;= 8h/tuần/SV). Hai sinh viên trực tiếp triển khai trên AWS Learner Lab và cam kết giải thích độc lập 100% khi vấn đáp trước GVHD ThS. Huỳnh Xuân Phụng.</w:t>
       </w:r>
     </w:p>
     <w:sectPr>
@@ -15448,6 +15474,7 @@
     <w:pPr>
       <w:spacing w:after="120" w:line="360" w:lineRule="auto"/>
       <w:ind w:firstLine="720"/>
+      <w:jc w:val="both"/>
     </w:pPr>
   </w:style>
   <w:style w:type="character" w:customStyle="1" w:styleId="BodyTextChar">
@@ -15456,10 +15483,6 @@
     <w:link w:val="BodyText"/>
     <w:uiPriority w:val="99"/>
     <w:rsid w:val="00AA1D8D"/>
-    <w:rPr>
-      <w:color w:val="000000"/>
-      <w:sz w:val="26"/>
-    </w:rPr>
   </w:style>
   <w:style w:type="paragraph" w:styleId="BodyText2">
     <w:name w:val="Body Text 2"/>
@@ -26043,7 +26066,7 @@
     <w:autoRedefine/>
     <w:uiPriority w:val="39"/>
     <w:unhideWhenUsed/>
-    <w:rsid w:val="00351CB2"/>
+    <w:rsid w:val="00A71D24"/>
     <w:pPr>
       <w:spacing w:after="0" w:line="240" w:lineRule="auto"/>
       <w:ind w:left="220"/>
@@ -26060,7 +26083,7 @@
     <w:autoRedefine/>
     <w:uiPriority w:val="39"/>
     <w:unhideWhenUsed/>
-    <w:rsid w:val="00351CB2"/>
+    <w:rsid w:val="00A71D24"/>
     <w:pPr>
       <w:spacing w:after="0" w:line="240" w:lineRule="auto"/>
       <w:ind w:left="600"/>
@@ -26074,7 +26097,7 @@
     <w:basedOn w:val="DefaultParagraphFont"/>
     <w:uiPriority w:val="99"/>
     <w:unhideWhenUsed/>
-    <w:rsid w:val="00351CB2"/>
+    <w:rsid w:val="00A71D24"/>
     <w:rPr>
       <w:rFonts w:ascii="Times New Roman" w:hAnsi="Times New Roman" w:cs="Times New Roman"/>
       <w:color w:val="000000"/>

</xml_diff>

<commit_message>
fix: simplify report sections and correct collection failures
</commit_message>
<xml_diff>
--- a/tuan_1/docs/Bao_cao_tuan_1_Dien_toan_dam_may_Nhom_05.docx
+++ b/tuan_1/docs/Bao_cao_tuan_1_Dien_toan_dam_may_Nhom_05.docx
@@ -534,7 +534,7 @@
         </w:rPr>
         <w:fldChar w:fldCharType="separate"/>
       </w:r>
-      <w:hyperlink w:anchor="_Toc242813514" w:history="1">
+      <w:hyperlink w:anchor="_Toc242814934" w:history="1">
         <w:r>
           <w:rPr>
             <w:rStyle w:val="Hyperlink"/>
@@ -561,7 +561,7 @@
             <w:noProof/>
             <w:webHidden/>
           </w:rPr>
-          <w:instrText xml:space="preserve"> PAGEREF _Toc242813514 \h </w:instrText>
+          <w:instrText xml:space="preserve"> PAGEREF _Toc242814934 \h </w:instrText>
         </w:r>
         <w:r>
           <w:rPr>
@@ -608,7 +608,7 @@
           <w14:ligatures w14:val="standardContextual"/>
         </w:rPr>
       </w:pPr>
-      <w:hyperlink w:anchor="_Toc242813515" w:history="1">
+      <w:hyperlink w:anchor="_Toc242814935" w:history="1">
         <w:r>
           <w:rPr>
             <w:rStyle w:val="Hyperlink"/>
@@ -635,7 +635,7 @@
             <w:noProof/>
             <w:webHidden/>
           </w:rPr>
-          <w:instrText xml:space="preserve"> PAGEREF _Toc242813515 \h </w:instrText>
+          <w:instrText xml:space="preserve"> PAGEREF _Toc242814935 \h </w:instrText>
         </w:r>
         <w:r>
           <w:rPr>
@@ -682,7 +682,7 @@
           <w14:ligatures w14:val="standardContextual"/>
         </w:rPr>
       </w:pPr>
-      <w:hyperlink w:anchor="_Toc242813516" w:history="1">
+      <w:hyperlink w:anchor="_Toc242814936" w:history="1">
         <w:r>
           <w:rPr>
             <w:rStyle w:val="Hyperlink"/>
@@ -709,7 +709,7 @@
             <w:noProof/>
             <w:webHidden/>
           </w:rPr>
-          <w:instrText xml:space="preserve"> PAGEREF _Toc242813516 \h </w:instrText>
+          <w:instrText xml:space="preserve"> PAGEREF _Toc242814936 \h </w:instrText>
         </w:r>
         <w:r>
           <w:rPr>
@@ -756,7 +756,7 @@
           <w14:ligatures w14:val="standardContextual"/>
         </w:rPr>
       </w:pPr>
-      <w:hyperlink w:anchor="_Toc242813517" w:history="1">
+      <w:hyperlink w:anchor="_Toc242814937" w:history="1">
         <w:r>
           <w:rPr>
             <w:rStyle w:val="Hyperlink"/>
@@ -783,7 +783,7 @@
             <w:noProof/>
             <w:webHidden/>
           </w:rPr>
-          <w:instrText xml:space="preserve"> PAGEREF _Toc242813517 \h </w:instrText>
+          <w:instrText xml:space="preserve"> PAGEREF _Toc242814937 \h </w:instrText>
         </w:r>
         <w:r>
           <w:rPr>
@@ -830,7 +830,7 @@
           <w14:ligatures w14:val="standardContextual"/>
         </w:rPr>
       </w:pPr>
-      <w:hyperlink w:anchor="_Toc242813518" w:history="1">
+      <w:hyperlink w:anchor="_Toc242814938" w:history="1">
         <w:r>
           <w:rPr>
             <w:rStyle w:val="Hyperlink"/>
@@ -857,7 +857,7 @@
             <w:noProof/>
             <w:webHidden/>
           </w:rPr>
-          <w:instrText xml:space="preserve"> PAGEREF _Toc242813518 \h </w:instrText>
+          <w:instrText xml:space="preserve"> PAGEREF _Toc242814938 \h </w:instrText>
         </w:r>
         <w:r>
           <w:rPr>
@@ -905,7 +905,7 @@
           <w14:ligatures w14:val="standardContextual"/>
         </w:rPr>
       </w:pPr>
-      <w:hyperlink w:anchor="_Toc242813519" w:history="1">
+      <w:hyperlink w:anchor="_Toc242814939" w:history="1">
         <w:r>
           <w:rPr>
             <w:rStyle w:val="Hyperlink"/>
@@ -932,7 +932,7 @@
             <w:noProof/>
             <w:webHidden/>
           </w:rPr>
-          <w:instrText xml:space="preserve"> PAGEREF _Toc242813519 \h </w:instrText>
+          <w:instrText xml:space="preserve"> PAGEREF _Toc242814939 \h </w:instrText>
         </w:r>
         <w:r>
           <w:rPr>
@@ -979,7 +979,7 @@
           <w14:ligatures w14:val="standardContextual"/>
         </w:rPr>
       </w:pPr>
-      <w:hyperlink w:anchor="_Toc242813520" w:history="1">
+      <w:hyperlink w:anchor="_Toc242814940" w:history="1">
         <w:r>
           <w:rPr>
             <w:rStyle w:val="Hyperlink"/>
@@ -1006,7 +1006,7 @@
             <w:noProof/>
             <w:webHidden/>
           </w:rPr>
-          <w:instrText xml:space="preserve"> PAGEREF _Toc242813520 \h </w:instrText>
+          <w:instrText xml:space="preserve"> PAGEREF _Toc242814940 \h </w:instrText>
         </w:r>
         <w:r>
           <w:rPr>
@@ -1053,7 +1053,7 @@
           <w14:ligatures w14:val="standardContextual"/>
         </w:rPr>
       </w:pPr>
-      <w:hyperlink w:anchor="_Toc242813521" w:history="1">
+      <w:hyperlink w:anchor="_Toc242814941" w:history="1">
         <w:r>
           <w:rPr>
             <w:rStyle w:val="Hyperlink"/>
@@ -1080,7 +1080,7 @@
             <w:noProof/>
             <w:webHidden/>
           </w:rPr>
-          <w:instrText xml:space="preserve"> PAGEREF _Toc242813521 \h </w:instrText>
+          <w:instrText xml:space="preserve"> PAGEREF _Toc242814941 \h </w:instrText>
         </w:r>
         <w:r>
           <w:rPr>
@@ -1127,7 +1127,7 @@
           <w14:ligatures w14:val="standardContextual"/>
         </w:rPr>
       </w:pPr>
-      <w:hyperlink w:anchor="_Toc242813522" w:history="1">
+      <w:hyperlink w:anchor="_Toc242814942" w:history="1">
         <w:r>
           <w:rPr>
             <w:rStyle w:val="Hyperlink"/>
@@ -1154,7 +1154,7 @@
             <w:noProof/>
             <w:webHidden/>
           </w:rPr>
-          <w:instrText xml:space="preserve"> PAGEREF _Toc242813522 \h </w:instrText>
+          <w:instrText xml:space="preserve"> PAGEREF _Toc242814942 \h </w:instrText>
         </w:r>
         <w:r>
           <w:rPr>
@@ -1202,7 +1202,7 @@
           <w14:ligatures w14:val="standardContextual"/>
         </w:rPr>
       </w:pPr>
-      <w:hyperlink w:anchor="_Toc242813523" w:history="1">
+      <w:hyperlink w:anchor="_Toc242814943" w:history="1">
         <w:r>
           <w:rPr>
             <w:rStyle w:val="Hyperlink"/>
@@ -1229,7 +1229,7 @@
             <w:noProof/>
             <w:webHidden/>
           </w:rPr>
-          <w:instrText xml:space="preserve"> PAGEREF _Toc242813523 \h </w:instrText>
+          <w:instrText xml:space="preserve"> PAGEREF _Toc242814943 \h </w:instrText>
         </w:r>
         <w:r>
           <w:rPr>
@@ -1276,7 +1276,7 @@
           <w14:ligatures w14:val="standardContextual"/>
         </w:rPr>
       </w:pPr>
-      <w:hyperlink w:anchor="_Toc242813524" w:history="1">
+      <w:hyperlink w:anchor="_Toc242814944" w:history="1">
         <w:r>
           <w:rPr>
             <w:rStyle w:val="Hyperlink"/>
@@ -1303,7 +1303,7 @@
             <w:noProof/>
             <w:webHidden/>
           </w:rPr>
-          <w:instrText xml:space="preserve"> PAGEREF _Toc242813524 \h </w:instrText>
+          <w:instrText xml:space="preserve"> PAGEREF _Toc242814944 \h </w:instrText>
         </w:r>
         <w:r>
           <w:rPr>
@@ -1350,7 +1350,7 @@
           <w14:ligatures w14:val="standardContextual"/>
         </w:rPr>
       </w:pPr>
-      <w:hyperlink w:anchor="_Toc242813525" w:history="1">
+      <w:hyperlink w:anchor="_Toc242814945" w:history="1">
         <w:r>
           <w:rPr>
             <w:rStyle w:val="Hyperlink"/>
@@ -1377,7 +1377,7 @@
             <w:noProof/>
             <w:webHidden/>
           </w:rPr>
-          <w:instrText xml:space="preserve"> PAGEREF _Toc242813525 \h </w:instrText>
+          <w:instrText xml:space="preserve"> PAGEREF _Toc242814945 \h </w:instrText>
         </w:r>
         <w:r>
           <w:rPr>
@@ -1424,7 +1424,7 @@
           <w14:ligatures w14:val="standardContextual"/>
         </w:rPr>
       </w:pPr>
-      <w:hyperlink w:anchor="_Toc242813526" w:history="1">
+      <w:hyperlink w:anchor="_Toc242814946" w:history="1">
         <w:r>
           <w:rPr>
             <w:rStyle w:val="Hyperlink"/>
@@ -1451,7 +1451,7 @@
             <w:noProof/>
             <w:webHidden/>
           </w:rPr>
-          <w:instrText xml:space="preserve"> PAGEREF _Toc242813526 \h </w:instrText>
+          <w:instrText xml:space="preserve"> PAGEREF _Toc242814946 \h </w:instrText>
         </w:r>
         <w:r>
           <w:rPr>
@@ -1498,7 +1498,7 @@
           <w14:ligatures w14:val="standardContextual"/>
         </w:rPr>
       </w:pPr>
-      <w:hyperlink w:anchor="_Toc242813527" w:history="1">
+      <w:hyperlink w:anchor="_Toc242814947" w:history="1">
         <w:r>
           <w:rPr>
             <w:rStyle w:val="Hyperlink"/>
@@ -1525,7 +1525,7 @@
             <w:noProof/>
             <w:webHidden/>
           </w:rPr>
-          <w:instrText xml:space="preserve"> PAGEREF _Toc242813527 \h </w:instrText>
+          <w:instrText xml:space="preserve"> PAGEREF _Toc242814947 \h </w:instrText>
         </w:r>
         <w:r>
           <w:rPr>
@@ -1572,7 +1572,7 @@
           <w14:ligatures w14:val="standardContextual"/>
         </w:rPr>
       </w:pPr>
-      <w:hyperlink w:anchor="_Toc242813528" w:history="1">
+      <w:hyperlink w:anchor="_Toc242814948" w:history="1">
         <w:r>
           <w:rPr>
             <w:rStyle w:val="Hyperlink"/>
@@ -1599,7 +1599,7 @@
             <w:noProof/>
             <w:webHidden/>
           </w:rPr>
-          <w:instrText xml:space="preserve"> PAGEREF _Toc242813528 \h </w:instrText>
+          <w:instrText xml:space="preserve"> PAGEREF _Toc242814948 \h </w:instrText>
         </w:r>
         <w:r>
           <w:rPr>
@@ -1646,7 +1646,7 @@
           <w14:ligatures w14:val="standardContextual"/>
         </w:rPr>
       </w:pPr>
-      <w:hyperlink w:anchor="_Toc242813529" w:history="1">
+      <w:hyperlink w:anchor="_Toc242814949" w:history="1">
         <w:r>
           <w:rPr>
             <w:rStyle w:val="Hyperlink"/>
@@ -1673,7 +1673,7 @@
             <w:noProof/>
             <w:webHidden/>
           </w:rPr>
-          <w:instrText xml:space="preserve"> PAGEREF _Toc242813529 \h </w:instrText>
+          <w:instrText xml:space="preserve"> PAGEREF _Toc242814949 \h </w:instrText>
         </w:r>
         <w:r>
           <w:rPr>
@@ -1720,7 +1720,7 @@
           <w14:ligatures w14:val="standardContextual"/>
         </w:rPr>
       </w:pPr>
-      <w:hyperlink w:anchor="_Toc242813530" w:history="1">
+      <w:hyperlink w:anchor="_Toc242814950" w:history="1">
         <w:r>
           <w:rPr>
             <w:rStyle w:val="Hyperlink"/>
@@ -1747,7 +1747,7 @@
             <w:noProof/>
             <w:webHidden/>
           </w:rPr>
-          <w:instrText xml:space="preserve"> PAGEREF _Toc242813530 \h </w:instrText>
+          <w:instrText xml:space="preserve"> PAGEREF _Toc242814950 \h </w:instrText>
         </w:r>
         <w:r>
           <w:rPr>
@@ -1795,7 +1795,7 @@
           <w14:ligatures w14:val="standardContextual"/>
         </w:rPr>
       </w:pPr>
-      <w:hyperlink w:anchor="_Toc242813531" w:history="1">
+      <w:hyperlink w:anchor="_Toc242814951" w:history="1">
         <w:r>
           <w:rPr>
             <w:rStyle w:val="Hyperlink"/>
@@ -1822,7 +1822,7 @@
             <w:noProof/>
             <w:webHidden/>
           </w:rPr>
-          <w:instrText xml:space="preserve"> PAGEREF _Toc242813531 \h </w:instrText>
+          <w:instrText xml:space="preserve"> PAGEREF _Toc242814951 \h </w:instrText>
         </w:r>
         <w:r>
           <w:rPr>
@@ -1869,7 +1869,7 @@
           <w14:ligatures w14:val="standardContextual"/>
         </w:rPr>
       </w:pPr>
-      <w:hyperlink w:anchor="_Toc242813532" w:history="1">
+      <w:hyperlink w:anchor="_Toc242814952" w:history="1">
         <w:r>
           <w:rPr>
             <w:rStyle w:val="Hyperlink"/>
@@ -1896,7 +1896,7 @@
             <w:noProof/>
             <w:webHidden/>
           </w:rPr>
-          <w:instrText xml:space="preserve"> PAGEREF _Toc242813532 \h </w:instrText>
+          <w:instrText xml:space="preserve"> PAGEREF _Toc242814952 \h </w:instrText>
         </w:r>
         <w:r>
           <w:rPr>
@@ -1943,7 +1943,7 @@
           <w14:ligatures w14:val="standardContextual"/>
         </w:rPr>
       </w:pPr>
-      <w:hyperlink w:anchor="_Toc242813533" w:history="1">
+      <w:hyperlink w:anchor="_Toc242814953" w:history="1">
         <w:r>
           <w:rPr>
             <w:rStyle w:val="Hyperlink"/>
@@ -1970,7 +1970,7 @@
             <w:noProof/>
             <w:webHidden/>
           </w:rPr>
-          <w:instrText xml:space="preserve"> PAGEREF _Toc242813533 \h </w:instrText>
+          <w:instrText xml:space="preserve"> PAGEREF _Toc242814953 \h </w:instrText>
         </w:r>
         <w:r>
           <w:rPr>
@@ -2017,7 +2017,7 @@
           <w14:ligatures w14:val="standardContextual"/>
         </w:rPr>
       </w:pPr>
-      <w:hyperlink w:anchor="_Toc242813534" w:history="1">
+      <w:hyperlink w:anchor="_Toc242814954" w:history="1">
         <w:r>
           <w:rPr>
             <w:rStyle w:val="Hyperlink"/>
@@ -2044,7 +2044,7 @@
             <w:noProof/>
             <w:webHidden/>
           </w:rPr>
-          <w:instrText xml:space="preserve"> PAGEREF _Toc242813534 \h </w:instrText>
+          <w:instrText xml:space="preserve"> PAGEREF _Toc242814954 \h </w:instrText>
         </w:r>
         <w:r>
           <w:rPr>
@@ -2091,7 +2091,7 @@
           <w14:ligatures w14:val="standardContextual"/>
         </w:rPr>
       </w:pPr>
-      <w:hyperlink w:anchor="_Toc242813535" w:history="1">
+      <w:hyperlink w:anchor="_Toc242814955" w:history="1">
         <w:r>
           <w:rPr>
             <w:rStyle w:val="Hyperlink"/>
@@ -2118,7 +2118,7 @@
             <w:noProof/>
             <w:webHidden/>
           </w:rPr>
-          <w:instrText xml:space="preserve"> PAGEREF _Toc242813535 \h </w:instrText>
+          <w:instrText xml:space="preserve"> PAGEREF _Toc242814955 \h </w:instrText>
         </w:r>
         <w:r>
           <w:rPr>
@@ -2165,7 +2165,7 @@
           <w14:ligatures w14:val="standardContextual"/>
         </w:rPr>
       </w:pPr>
-      <w:hyperlink w:anchor="_Toc242813536" w:history="1">
+      <w:hyperlink w:anchor="_Toc242814956" w:history="1">
         <w:r>
           <w:rPr>
             <w:rStyle w:val="Hyperlink"/>
@@ -2192,7 +2192,7 @@
             <w:noProof/>
             <w:webHidden/>
           </w:rPr>
-          <w:instrText xml:space="preserve"> PAGEREF _Toc242813536 \h </w:instrText>
+          <w:instrText xml:space="preserve"> PAGEREF _Toc242814956 \h </w:instrText>
         </w:r>
         <w:r>
           <w:rPr>
@@ -2239,7 +2239,7 @@
           <w14:ligatures w14:val="standardContextual"/>
         </w:rPr>
       </w:pPr>
-      <w:hyperlink w:anchor="_Toc242813537" w:history="1">
+      <w:hyperlink w:anchor="_Toc242814957" w:history="1">
         <w:r>
           <w:rPr>
             <w:rStyle w:val="Hyperlink"/>
@@ -2266,7 +2266,7 @@
             <w:noProof/>
             <w:webHidden/>
           </w:rPr>
-          <w:instrText xml:space="preserve"> PAGEREF _Toc242813537 \h </w:instrText>
+          <w:instrText xml:space="preserve"> PAGEREF _Toc242814957 \h </w:instrText>
         </w:r>
         <w:r>
           <w:rPr>
@@ -2314,7 +2314,7 @@
           <w14:ligatures w14:val="standardContextual"/>
         </w:rPr>
       </w:pPr>
-      <w:hyperlink w:anchor="_Toc242813538" w:history="1">
+      <w:hyperlink w:anchor="_Toc242814958" w:history="1">
         <w:r>
           <w:rPr>
             <w:rStyle w:val="Hyperlink"/>
@@ -2341,7 +2341,7 @@
             <w:noProof/>
             <w:webHidden/>
           </w:rPr>
-          <w:instrText xml:space="preserve"> PAGEREF _Toc242813538 \h </w:instrText>
+          <w:instrText xml:space="preserve"> PAGEREF _Toc242814958 \h </w:instrText>
         </w:r>
         <w:r>
           <w:rPr>
@@ -2388,7 +2388,7 @@
           <w14:ligatures w14:val="standardContextual"/>
         </w:rPr>
       </w:pPr>
-      <w:hyperlink w:anchor="_Toc242813539" w:history="1">
+      <w:hyperlink w:anchor="_Toc242814959" w:history="1">
         <w:r>
           <w:rPr>
             <w:rStyle w:val="Hyperlink"/>
@@ -2415,7 +2415,7 @@
             <w:noProof/>
             <w:webHidden/>
           </w:rPr>
-          <w:instrText xml:space="preserve"> PAGEREF _Toc242813539 \h </w:instrText>
+          <w:instrText xml:space="preserve"> PAGEREF _Toc242814959 \h </w:instrText>
         </w:r>
         <w:r>
           <w:rPr>
@@ -2462,7 +2462,7 @@
           <w14:ligatures w14:val="standardContextual"/>
         </w:rPr>
       </w:pPr>
-      <w:hyperlink w:anchor="_Toc242813540" w:history="1">
+      <w:hyperlink w:anchor="_Toc242814960" w:history="1">
         <w:r>
           <w:rPr>
             <w:rStyle w:val="Hyperlink"/>
@@ -2489,7 +2489,7 @@
             <w:noProof/>
             <w:webHidden/>
           </w:rPr>
-          <w:instrText xml:space="preserve"> PAGEREF _Toc242813540 \h </w:instrText>
+          <w:instrText xml:space="preserve"> PAGEREF _Toc242814960 \h </w:instrText>
         </w:r>
         <w:r>
           <w:rPr>
@@ -2536,7 +2536,7 @@
           <w14:ligatures w14:val="standardContextual"/>
         </w:rPr>
       </w:pPr>
-      <w:hyperlink w:anchor="_Toc242813541" w:history="1">
+      <w:hyperlink w:anchor="_Toc242814961" w:history="1">
         <w:r>
           <w:rPr>
             <w:rStyle w:val="Hyperlink"/>
@@ -2563,7 +2563,7 @@
             <w:noProof/>
             <w:webHidden/>
           </w:rPr>
-          <w:instrText xml:space="preserve"> PAGEREF _Toc242813541 \h </w:instrText>
+          <w:instrText xml:space="preserve"> PAGEREF _Toc242814961 \h </w:instrText>
         </w:r>
         <w:r>
           <w:rPr>
@@ -2620,7 +2620,7 @@
         <w:jc w:val="left"/>
       </w:pPr>
       <w:bookmarkStart w:id="0" w:name="_Toc242299335"/>
-      <w:bookmarkStart w:id="1" w:name="_Toc242813514"/>
+      <w:bookmarkStart w:id="1" w:name="_Toc242814934"/>
       <w:r>
         <w:lastRenderedPageBreak/>
         <w:t>Chương 1 Tổng quan đề tài và yêu cầu học phần</w:t>
@@ -2633,7 +2633,7 @@
         <w:pStyle w:val="Heading2"/>
       </w:pPr>
       <w:bookmarkStart w:id="2" w:name="_Toc242299336"/>
-      <w:bookmarkStart w:id="3" w:name="_Toc242813515"/>
+      <w:bookmarkStart w:id="3" w:name="_Toc242814935"/>
       <w:r>
         <w:t>1.1 Bối cảnh, mục tiêu và phạm vi</w:t>
       </w:r>
@@ -2652,37 +2652,53 @@
     <w:p>
       <w:pPr>
         <w:pStyle w:val="BodyText"/>
-        <w:ind w:left="288" w:hanging="173"/>
+        <w:numPr>
+          <w:ilvl w:val="0"/>
+          <w:numId w:val="1"/>
+        </w:numPr>
+        <w:ind w:left="288" w:hanging="216"/>
       </w:pPr>
       <w:r>
-        <w:t>•  Thu thập theo lịch một giờ; hỗ trợ gọi thử trực tiếp và nạp chuỗi lịch sử 48 giờ.</w:t>
+        <w:t>Thu thập theo lịch một giờ; hỗ trợ gọi thử trực tiếp và nạp chuỗi lịch sử 48 giờ.</w:t>
       </w:r>
     </w:p>
     <w:p>
       <w:pPr>
         <w:pStyle w:val="BodyText"/>
-        <w:ind w:left="288" w:hanging="173"/>
+        <w:numPr>
+          <w:ilvl w:val="0"/>
+          <w:numId w:val="1"/>
+        </w:numPr>
+        <w:ind w:left="288" w:hanging="216"/>
       </w:pPr>
       <w:r>
-        <w:t>•  Lưu dữ liệu theo đường dẫn raw/year=YYYY/month=MM/day=DD; truy vấn bằng Athena.</w:t>
+        <w:t>Lưu dữ liệu theo đường dẫn raw/year=YYYY/month=MM/day=DD; truy vấn bằng Athena.</w:t>
       </w:r>
     </w:p>
     <w:p>
       <w:pPr>
         <w:pStyle w:val="BodyText"/>
-        <w:ind w:left="288" w:hanging="173"/>
+        <w:numPr>
+          <w:ilvl w:val="0"/>
+          <w:numId w:val="1"/>
+        </w:numPr>
+        <w:ind w:left="288" w:hanging="216"/>
       </w:pPr>
       <w:r>
-        <w:t>•  Cảnh báo theo điều kiện US AQI ≥ 100 hoặc PM2.5 ≥ 35,5 µg/m³ qua SNS (đúng phép so sánh trong mã nguồn).</w:t>
+        <w:t>Cảnh báo theo điều kiện US AQI ≥ 100 hoặc PM2.5 ≥ 35,5 µg/m³ qua SNS (đúng phép so sánh trong mã nguồn).</w:t>
       </w:r>
     </w:p>
     <w:p>
       <w:pPr>
         <w:pStyle w:val="BodyText"/>
-        <w:ind w:left="288" w:hanging="173"/>
+        <w:numPr>
+          <w:ilvl w:val="0"/>
+          <w:numId w:val="1"/>
+        </w:numPr>
+        <w:ind w:left="288" w:hanging="216"/>
       </w:pPr>
       <w:r>
-        <w:t>•  Giám sát lỗi Lambda bằng CloudWatch Alarm và xem tổng quan trên dashboard.</w:t>
+        <w:t>Giám sát lỗi Lambda bằng CloudWatch Alarm và xem tổng quan trên dashboard.</w:t>
       </w:r>
     </w:p>
     <w:p>
@@ -2690,7 +2706,7 @@
         <w:pStyle w:val="Heading2"/>
       </w:pPr>
       <w:bookmarkStart w:id="4" w:name="_Toc242299337"/>
-      <w:bookmarkStart w:id="5" w:name="_Toc242813516"/>
+      <w:bookmarkStart w:id="5" w:name="_Toc242814936"/>
       <w:r>
         <w:t>1.2 Yêu cầu chức năng và kết quả triển khai</w:t>
       </w:r>
@@ -3288,7 +3304,7 @@
         <w:pStyle w:val="Heading2"/>
       </w:pPr>
       <w:bookmarkStart w:id="6" w:name="_Toc242299338"/>
-      <w:bookmarkStart w:id="7" w:name="_Toc242813517"/>
+      <w:bookmarkStart w:id="7" w:name="_Toc242814937"/>
       <w:r>
         <w:lastRenderedPageBreak/>
         <w:t>1.3 Kiến trúc tổng thể</w:t>
@@ -3307,7 +3323,7 @@
           <w:noProof/>
         </w:rPr>
         <w:drawing>
-          <wp:inline distT="0" distB="0" distL="0" distR="0" wp14:anchorId="72405D67" wp14:editId="2A4C3EEA">
+          <wp:inline distT="0" distB="0" distL="0" distR="0" wp14:anchorId="04472A15" wp14:editId="392620F3">
             <wp:extent cx="6126480" cy="4778654"/>
             <wp:effectExtent l="0" t="0" r="0" b="0"/>
             <wp:docPr id="7" name="Picture 7"/>
@@ -3367,7 +3383,7 @@
         <w:pStyle w:val="Heading2"/>
       </w:pPr>
       <w:bookmarkStart w:id="8" w:name="_Toc242299339"/>
-      <w:bookmarkStart w:id="9" w:name="_Toc242813518"/>
+      <w:bookmarkStart w:id="9" w:name="_Toc242814938"/>
       <w:r>
         <w:t>1.4 Nguồn số liệu và mốc đo</w:t>
       </w:r>
@@ -4249,7 +4265,7 @@
         <w:jc w:val="left"/>
       </w:pPr>
       <w:bookmarkStart w:id="10" w:name="_Toc242299340"/>
-      <w:bookmarkStart w:id="11" w:name="_Toc242813519"/>
+      <w:bookmarkStart w:id="11" w:name="_Toc242814939"/>
       <w:r>
         <w:lastRenderedPageBreak/>
         <w:t>Chương 2 Báo cáo tiến độ Tuần 1</w:t>
@@ -4271,7 +4287,7 @@
         <w:pStyle w:val="Heading2"/>
       </w:pPr>
       <w:bookmarkStart w:id="12" w:name="_Toc242299341"/>
-      <w:bookmarkStart w:id="13" w:name="_Toc242813520"/>
+      <w:bookmarkStart w:id="13" w:name="_Toc242814940"/>
       <w:r>
         <w:t>2.1 Mục tiêu và phân công thực hiện</w:t>
       </w:r>
@@ -4538,7 +4554,7 @@
         <w:pStyle w:val="Heading2"/>
       </w:pPr>
       <w:bookmarkStart w:id="14" w:name="_Toc242299342"/>
-      <w:bookmarkStart w:id="15" w:name="_Toc242813521"/>
+      <w:bookmarkStart w:id="15" w:name="_Toc242814941"/>
       <w:r>
         <w:t>2.2 Phạm vi và luồng dữ liệu đo</w:t>
       </w:r>
@@ -4999,7 +5015,7 @@
         <w:pStyle w:val="Heading2"/>
       </w:pPr>
       <w:bookmarkStart w:id="16" w:name="_Toc242299343"/>
-      <w:bookmarkStart w:id="17" w:name="_Toc242813522"/>
+      <w:bookmarkStart w:id="17" w:name="_Toc242814942"/>
       <w:r>
         <w:t>2.3 Kết quả định lượng</w:t>
       </w:r>
@@ -5530,7 +5546,7 @@
         <w:jc w:val="left"/>
       </w:pPr>
       <w:bookmarkStart w:id="18" w:name="_Toc242299344"/>
-      <w:bookmarkStart w:id="19" w:name="_Toc242813523"/>
+      <w:bookmarkStart w:id="19" w:name="_Toc242814943"/>
       <w:r>
         <w:lastRenderedPageBreak/>
         <w:t>Chương 3 Thiết kế và triển khai trên AWS Learner Lab</w:t>
@@ -5543,7 +5559,7 @@
         <w:pStyle w:val="Heading2"/>
       </w:pPr>
       <w:bookmarkStart w:id="20" w:name="_Toc242299345"/>
-      <w:bookmarkStart w:id="21" w:name="_Toc242813524"/>
+      <w:bookmarkStart w:id="21" w:name="_Toc242814944"/>
       <w:r>
         <w:t>3.1 Danh mục dịch vụ và cấu hình thực tế</w:t>
       </w:r>
@@ -6297,7 +6313,7 @@
         <w:pStyle w:val="Heading2"/>
       </w:pPr>
       <w:bookmarkStart w:id="22" w:name="_Toc242299346"/>
-      <w:bookmarkStart w:id="23" w:name="_Toc242813525"/>
+      <w:bookmarkStart w:id="23" w:name="_Toc242814945"/>
       <w:r>
         <w:t>3.2 Dữ liệu và phân vùng S3</w:t>
       </w:r>
@@ -6381,7 +6397,7 @@
         <w:pStyle w:val="Heading2"/>
       </w:pPr>
       <w:bookmarkStart w:id="24" w:name="_Toc242299347"/>
-      <w:bookmarkStart w:id="25" w:name="_Toc242813526"/>
+      <w:bookmarkStart w:id="25" w:name="_Toc242814946"/>
       <w:r>
         <w:t>3.3 An toàn cấu hình và vận hành</w:t>
       </w:r>
@@ -6402,7 +6418,7 @@
         <w:pStyle w:val="Heading2"/>
       </w:pPr>
       <w:bookmarkStart w:id="26" w:name="_Toc242299348"/>
-      <w:bookmarkStart w:id="27" w:name="_Toc242813527"/>
+      <w:bookmarkStart w:id="27" w:name="_Toc242814947"/>
       <w:r>
         <w:lastRenderedPageBreak/>
         <w:t>3.4 Trình tự xử lý của Lambda</w:t>
@@ -6442,7 +6458,7 @@
         <w:pStyle w:val="Heading2"/>
       </w:pPr>
       <w:bookmarkStart w:id="28" w:name="_Toc242299349"/>
-      <w:bookmarkStart w:id="29" w:name="_Toc242813528"/>
+      <w:bookmarkStart w:id="29" w:name="_Toc242814948"/>
       <w:r>
         <w:t>3.5 Truy vấn Athena và khả năng tái lập</w:t>
       </w:r>
@@ -6704,7 +6720,7 @@
         <w:pStyle w:val="Heading2"/>
       </w:pPr>
       <w:bookmarkStart w:id="30" w:name="_Toc242299350"/>
-      <w:bookmarkStart w:id="31" w:name="_Toc242813529"/>
+      <w:bookmarkStart w:id="31" w:name="_Toc242814949"/>
       <w:r>
         <w:t>3.6 Lược đồ bản ghi và chất lượng dữ liệu</w:t>
       </w:r>
@@ -7398,7 +7414,7 @@
         <w:pStyle w:val="Heading2"/>
       </w:pPr>
       <w:bookmarkStart w:id="32" w:name="_Toc242299351"/>
-      <w:bookmarkStart w:id="33" w:name="_Toc242813530"/>
+      <w:bookmarkStart w:id="33" w:name="_Toc242814950"/>
       <w:r>
         <w:lastRenderedPageBreak/>
         <w:t>3.7 Tần suất gọi Open-Meteo và yêu cầu khóa API</w:t>
@@ -7431,7 +7447,7 @@
         <w:jc w:val="left"/>
       </w:pPr>
       <w:bookmarkStart w:id="34" w:name="_Toc242299352"/>
-      <w:bookmarkStart w:id="35" w:name="_Toc242813531"/>
+      <w:bookmarkStart w:id="35" w:name="_Toc242814951"/>
       <w:r>
         <w:lastRenderedPageBreak/>
         <w:t>Chương 4 Kết quả kiểm tra và phân tích dữ liệu</w:t>
@@ -7444,7 +7460,7 @@
         <w:pStyle w:val="Heading2"/>
       </w:pPr>
       <w:bookmarkStart w:id="36" w:name="_Toc242299353"/>
-      <w:bookmarkStart w:id="37" w:name="_Toc242813532"/>
+      <w:bookmarkStart w:id="37" w:name="_Toc242814952"/>
       <w:r>
         <w:t>4.1 Mốc dữ liệu và số đo vận hành AWS</w:t>
       </w:r>
@@ -8136,7 +8152,7 @@
         <w:pageBreakBefore/>
       </w:pPr>
       <w:bookmarkStart w:id="38" w:name="_Toc242299354"/>
-      <w:bookmarkStart w:id="39" w:name="_Toc242813533"/>
+      <w:bookmarkStart w:id="39" w:name="_Toc242814953"/>
       <w:r>
         <w:lastRenderedPageBreak/>
         <w:t>4.2 So sánh ba đô thị từ Athena</w:t>
@@ -9349,7 +9365,7 @@
         <w:pStyle w:val="Heading2"/>
       </w:pPr>
       <w:bookmarkStart w:id="40" w:name="_Toc242299355"/>
-      <w:bookmarkStart w:id="41" w:name="_Toc242813534"/>
+      <w:bookmarkStart w:id="41" w:name="_Toc242814954"/>
       <w:r>
         <w:t>4.3 Biến thiên theo 24 giờ UTC</w:t>
       </w:r>
@@ -12626,7 +12642,7 @@
         <w:pStyle w:val="Heading2"/>
       </w:pPr>
       <w:bookmarkStart w:id="42" w:name="_Toc242299356"/>
-      <w:bookmarkStart w:id="43" w:name="_Toc242813535"/>
+      <w:bookmarkStart w:id="43" w:name="_Toc242814955"/>
       <w:r>
         <w:t>4.4 Phân bố cấp chất lượng không khí</w:t>
       </w:r>
@@ -13267,7 +13283,7 @@
         <w:pStyle w:val="Heading2"/>
       </w:pPr>
       <w:bookmarkStart w:id="44" w:name="_Toc242299357"/>
-      <w:bookmarkStart w:id="45" w:name="_Toc242813536"/>
+      <w:bookmarkStart w:id="45" w:name="_Toc242814956"/>
       <w:r>
         <w:t>4.5 Tương quan PM2.5 với yếu tố khí tượng</w:t>
       </w:r>
@@ -13806,7 +13822,7 @@
         <w:pageBreakBefore/>
       </w:pPr>
       <w:bookmarkStart w:id="46" w:name="_Toc242299358"/>
-      <w:bookmarkStart w:id="47" w:name="_Toc242813537"/>
+      <w:bookmarkStart w:id="47" w:name="_Toc242814957"/>
       <w:r>
         <w:lastRenderedPageBreak/>
         <w:t>4.6 Thời gian và dung lượng quét của năm truy vấn</w:t>
@@ -14652,7 +14668,7 @@
         <w:jc w:val="left"/>
       </w:pPr>
       <w:bookmarkStart w:id="48" w:name="_Toc242299359"/>
-      <w:bookmarkStart w:id="49" w:name="_Toc242813538"/>
+      <w:bookmarkStart w:id="49" w:name="_Toc242814958"/>
       <w:r>
         <w:lastRenderedPageBreak/>
         <w:t>Chương 5 Tổng hợp kết quả và chi phí Tuần 1</w:t>
@@ -14665,7 +14681,7 @@
         <w:pStyle w:val="Heading2"/>
       </w:pPr>
       <w:bookmarkStart w:id="50" w:name="_Toc242299360"/>
-      <w:bookmarkStart w:id="51" w:name="_Toc242813539"/>
+      <w:bookmarkStart w:id="51" w:name="_Toc242814959"/>
       <w:r>
         <w:t>5.1 Mức độ hoàn thành theo sản phẩm</w:t>
       </w:r>
@@ -14686,7 +14702,7 @@
         <w:pStyle w:val="Heading2"/>
       </w:pPr>
       <w:bookmarkStart w:id="52" w:name="_Toc242299361"/>
-      <w:bookmarkStart w:id="53" w:name="_Toc242813540"/>
+      <w:bookmarkStart w:id="53" w:name="_Toc242814960"/>
       <w:r>
         <w:t>5.2 Quản lý chi phí</w:t>
       </w:r>
@@ -15224,7 +15240,7 @@
         <w:pStyle w:val="Heading2"/>
       </w:pPr>
       <w:bookmarkStart w:id="54" w:name="_Toc242299362"/>
-      <w:bookmarkStart w:id="55" w:name="_Toc242813541"/>
+      <w:bookmarkStart w:id="55" w:name="_Toc242814961"/>
       <w:r>
         <w:t>5.3 Kết luận</w:t>
       </w:r>
@@ -15394,7 +15410,6 @@
     <w:lvl w:ilvl="0">
       <w:start w:val="1"/>
       <w:numFmt w:val="decimal"/>
-      <w:pStyle w:val="ListNumber3"/>
       <w:lvlText w:val="%1."/>
       <w:lvlJc w:val="left"/>
       <w:pPr>
@@ -15412,7 +15427,6 @@
     <w:lvl w:ilvl="0">
       <w:start w:val="1"/>
       <w:numFmt w:val="decimal"/>
-      <w:pStyle w:val="ListNumber2"/>
       <w:lvlText w:val="%1."/>
       <w:lvlJc w:val="left"/>
       <w:pPr>
@@ -15430,7 +15444,7 @@
     <w:lvl w:ilvl="0">
       <w:start w:val="1"/>
       <w:numFmt w:val="bullet"/>
-      <w:lvlText w:val=""/>
+      <w:lvlText w:val="-"/>
       <w:lvlJc w:val="left"/>
       <w:pPr>
         <w:tabs>
@@ -15439,7 +15453,7 @@
         <w:ind w:left="1440" w:hanging="360"/>
       </w:pPr>
       <w:rPr>
-        <w:rFonts w:ascii="Symbol" w:hAnsi="Symbol" w:hint="default"/>
+        <w:rFonts w:ascii="Times New Roman" w:hAnsi="Times New Roman" w:hint="default"/>
       </w:rPr>
     </w:lvl>
   </w:abstractNum>
@@ -15450,8 +15464,7 @@
     <w:lvl w:ilvl="0">
       <w:start w:val="1"/>
       <w:numFmt w:val="bullet"/>
-      <w:pStyle w:val="ListBullet3"/>
-      <w:lvlText w:val=""/>
+      <w:lvlText w:val="-"/>
       <w:lvlJc w:val="left"/>
       <w:pPr>
         <w:tabs>
@@ -15460,7 +15473,7 @@
         <w:ind w:left="1080" w:hanging="360"/>
       </w:pPr>
       <w:rPr>
-        <w:rFonts w:ascii="Symbol" w:hAnsi="Symbol" w:hint="default"/>
+        <w:rFonts w:ascii="Times New Roman" w:hAnsi="Times New Roman" w:hint="default"/>
       </w:rPr>
     </w:lvl>
   </w:abstractNum>
@@ -15471,8 +15484,7 @@
     <w:lvl w:ilvl="0">
       <w:start w:val="1"/>
       <w:numFmt w:val="bullet"/>
-      <w:pStyle w:val="ListBullet2"/>
-      <w:lvlText w:val=""/>
+      <w:lvlText w:val="-"/>
       <w:lvlJc w:val="left"/>
       <w:pPr>
         <w:tabs>
@@ -15481,7 +15493,7 @@
         <w:ind w:left="720" w:hanging="360"/>
       </w:pPr>
       <w:rPr>
-        <w:rFonts w:ascii="Symbol" w:hAnsi="Symbol" w:hint="default"/>
+        <w:rFonts w:ascii="Times New Roman" w:hAnsi="Times New Roman" w:hint="default"/>
       </w:rPr>
     </w:lvl>
   </w:abstractNum>
@@ -15492,7 +15504,6 @@
     <w:lvl w:ilvl="0">
       <w:start w:val="1"/>
       <w:numFmt w:val="decimal"/>
-      <w:pStyle w:val="ListNumber"/>
       <w:lvlText w:val="%1."/>
       <w:lvlJc w:val="left"/>
       <w:pPr>
@@ -15510,8 +15521,7 @@
     <w:lvl w:ilvl="0">
       <w:start w:val="1"/>
       <w:numFmt w:val="bullet"/>
-      <w:pStyle w:val="ListBullet"/>
-      <w:lvlText w:val=""/>
+      <w:lvlText w:val="-"/>
       <w:lvlJc w:val="left"/>
       <w:pPr>
         <w:tabs>
@@ -15520,36 +15530,64 @@
         <w:ind w:left="360" w:hanging="360"/>
       </w:pPr>
       <w:rPr>
-        <w:rFonts w:ascii="Symbol" w:hAnsi="Symbol" w:hint="default"/>
+        <w:rFonts w:ascii="Times New Roman" w:hAnsi="Times New Roman" w:hint="default"/>
       </w:rPr>
     </w:lvl>
   </w:abstractNum>
-  <w:num w:numId="1" w16cid:durableId="47152486">
-    <w:abstractNumId w:val="8"/>
-  </w:num>
-  <w:num w:numId="2" w16cid:durableId="1995067023">
-    <w:abstractNumId w:val="6"/>
-  </w:num>
-  <w:num w:numId="3" w16cid:durableId="35586546">
-    <w:abstractNumId w:val="5"/>
-  </w:num>
-  <w:num w:numId="4" w16cid:durableId="2039625796">
-    <w:abstractNumId w:val="4"/>
-  </w:num>
-  <w:num w:numId="5" w16cid:durableId="1464956039">
-    <w:abstractNumId w:val="7"/>
-  </w:num>
-  <w:num w:numId="6" w16cid:durableId="1681617457">
-    <w:abstractNumId w:val="3"/>
-  </w:num>
-  <w:num w:numId="7" w16cid:durableId="664165219">
-    <w:abstractNumId w:val="2"/>
-  </w:num>
-  <w:num w:numId="8" w16cid:durableId="561257956">
-    <w:abstractNumId w:val="1"/>
-  </w:num>
-  <w:num w:numId="9" w16cid:durableId="86777594">
-    <w:abstractNumId w:val="0"/>
+  <w:abstractNum w:abstractNumId="9" w15:restartNumberingAfterBreak="0">
+    <w:nsid w:val="59571628"/>
+    <w:multiLevelType w:val="multilevel"/>
+    <w:tmpl w:val="4FA4CAF4"/>
+    <w:lvl w:ilvl="0">
+      <w:start w:val="1"/>
+      <w:numFmt w:val="bullet"/>
+      <w:pStyle w:val="ListBullet"/>
+      <w:lvlText w:val="-"/>
+      <w:lvlJc w:val="left"/>
+    </w:lvl>
+    <w:lvl w:ilvl="1">
+      <w:numFmt w:val="decimal"/>
+      <w:lvlText w:val=""/>
+      <w:lvlJc w:val="left"/>
+    </w:lvl>
+    <w:lvl w:ilvl="2">
+      <w:numFmt w:val="decimal"/>
+      <w:lvlText w:val=""/>
+      <w:lvlJc w:val="left"/>
+    </w:lvl>
+    <w:lvl w:ilvl="3">
+      <w:numFmt w:val="decimal"/>
+      <w:lvlText w:val=""/>
+      <w:lvlJc w:val="left"/>
+    </w:lvl>
+    <w:lvl w:ilvl="4">
+      <w:numFmt w:val="decimal"/>
+      <w:lvlText w:val=""/>
+      <w:lvlJc w:val="left"/>
+    </w:lvl>
+    <w:lvl w:ilvl="5">
+      <w:numFmt w:val="decimal"/>
+      <w:lvlText w:val=""/>
+      <w:lvlJc w:val="left"/>
+    </w:lvl>
+    <w:lvl w:ilvl="6">
+      <w:numFmt w:val="decimal"/>
+      <w:lvlText w:val=""/>
+      <w:lvlJc w:val="left"/>
+    </w:lvl>
+    <w:lvl w:ilvl="7">
+      <w:numFmt w:val="decimal"/>
+      <w:lvlText w:val=""/>
+      <w:lvlJc w:val="left"/>
+    </w:lvl>
+    <w:lvl w:ilvl="8">
+      <w:numFmt w:val="decimal"/>
+      <w:lvlText w:val=""/>
+      <w:lvlJc w:val="left"/>
+    </w:lvl>
+  </w:abstractNum>
+  <w:num w:numId="1" w16cid:durableId="2015499321">
+    <w:abstractNumId w:val="9"/>
   </w:num>
 </w:numbering>
 </file>
@@ -16462,9 +16500,9 @@
     <w:unhideWhenUsed/>
     <w:rsid w:val="00326F90"/>
     <w:pPr>
-      <w:numPr>
-        <w:numId w:val="2"/>
-      </w:numPr>
+      <w:tabs>
+        <w:tab w:val="num" w:pos="360"/>
+      </w:tabs>
       <w:contextualSpacing/>
     </w:pPr>
   </w:style>
@@ -16475,9 +16513,9 @@
     <w:unhideWhenUsed/>
     <w:rsid w:val="00326F90"/>
     <w:pPr>
-      <w:numPr>
-        <w:numId w:val="3"/>
-      </w:numPr>
+      <w:tabs>
+        <w:tab w:val="num" w:pos="360"/>
+      </w:tabs>
       <w:contextualSpacing/>
     </w:pPr>
   </w:style>
@@ -16488,9 +16526,9 @@
     <w:unhideWhenUsed/>
     <w:rsid w:val="00326F90"/>
     <w:pPr>
-      <w:numPr>
-        <w:numId w:val="5"/>
-      </w:numPr>
+      <w:tabs>
+        <w:tab w:val="num" w:pos="360"/>
+      </w:tabs>
       <w:contextualSpacing/>
     </w:pPr>
   </w:style>
@@ -16501,9 +16539,9 @@
     <w:unhideWhenUsed/>
     <w:rsid w:val="0029639D"/>
     <w:pPr>
-      <w:numPr>
-        <w:numId w:val="6"/>
-      </w:numPr>
+      <w:tabs>
+        <w:tab w:val="num" w:pos="360"/>
+      </w:tabs>
       <w:contextualSpacing/>
     </w:pPr>
   </w:style>
@@ -16514,9 +16552,9 @@
     <w:unhideWhenUsed/>
     <w:rsid w:val="0029639D"/>
     <w:pPr>
-      <w:numPr>
-        <w:numId w:val="7"/>
-      </w:numPr>
+      <w:tabs>
+        <w:tab w:val="num" w:pos="360"/>
+      </w:tabs>
       <w:contextualSpacing/>
     </w:pPr>
   </w:style>

</xml_diff>

<commit_message>
docs: finalize weekly reports, worklogs, and data analysis documentation
</commit_message>
<xml_diff>
--- a/tuan_1/docs/Bao_cao_tuan_1_Dien_toan_dam_may_Nhom_05.docx
+++ b/tuan_1/docs/Bao_cao_tuan_1_Dien_toan_dam_may_Nhom_05.docx
@@ -534,7 +534,7 @@
         </w:rPr>
         <w:fldChar w:fldCharType="separate"/>
       </w:r>
-      <w:hyperlink w:anchor="_Toc242814934" w:history="1">
+      <w:hyperlink w:anchor="_Toc242824017" w:history="1">
         <w:r>
           <w:rPr>
             <w:rStyle w:val="Hyperlink"/>
@@ -561,7 +561,7 @@
             <w:noProof/>
             <w:webHidden/>
           </w:rPr>
-          <w:instrText xml:space="preserve"> PAGEREF _Toc242814934 \h </w:instrText>
+          <w:instrText xml:space="preserve"> PAGEREF _Toc242824017 \h </w:instrText>
         </w:r>
         <w:r>
           <w:rPr>
@@ -608,7 +608,7 @@
           <w14:ligatures w14:val="standardContextual"/>
         </w:rPr>
       </w:pPr>
-      <w:hyperlink w:anchor="_Toc242814935" w:history="1">
+      <w:hyperlink w:anchor="_Toc242824018" w:history="1">
         <w:r>
           <w:rPr>
             <w:rStyle w:val="Hyperlink"/>
@@ -635,7 +635,7 @@
             <w:noProof/>
             <w:webHidden/>
           </w:rPr>
-          <w:instrText xml:space="preserve"> PAGEREF _Toc242814935 \h </w:instrText>
+          <w:instrText xml:space="preserve"> PAGEREF _Toc242824018 \h </w:instrText>
         </w:r>
         <w:r>
           <w:rPr>
@@ -682,7 +682,7 @@
           <w14:ligatures w14:val="standardContextual"/>
         </w:rPr>
       </w:pPr>
-      <w:hyperlink w:anchor="_Toc242814936" w:history="1">
+      <w:hyperlink w:anchor="_Toc242824019" w:history="1">
         <w:r>
           <w:rPr>
             <w:rStyle w:val="Hyperlink"/>
@@ -709,7 +709,7 @@
             <w:noProof/>
             <w:webHidden/>
           </w:rPr>
-          <w:instrText xml:space="preserve"> PAGEREF _Toc242814936 \h </w:instrText>
+          <w:instrText xml:space="preserve"> PAGEREF _Toc242824019 \h </w:instrText>
         </w:r>
         <w:r>
           <w:rPr>
@@ -756,7 +756,7 @@
           <w14:ligatures w14:val="standardContextual"/>
         </w:rPr>
       </w:pPr>
-      <w:hyperlink w:anchor="_Toc242814937" w:history="1">
+      <w:hyperlink w:anchor="_Toc242824020" w:history="1">
         <w:r>
           <w:rPr>
             <w:rStyle w:val="Hyperlink"/>
@@ -783,7 +783,7 @@
             <w:noProof/>
             <w:webHidden/>
           </w:rPr>
-          <w:instrText xml:space="preserve"> PAGEREF _Toc242814937 \h </w:instrText>
+          <w:instrText xml:space="preserve"> PAGEREF _Toc242824020 \h </w:instrText>
         </w:r>
         <w:r>
           <w:rPr>
@@ -830,7 +830,7 @@
           <w14:ligatures w14:val="standardContextual"/>
         </w:rPr>
       </w:pPr>
-      <w:hyperlink w:anchor="_Toc242814938" w:history="1">
+      <w:hyperlink w:anchor="_Toc242824021" w:history="1">
         <w:r>
           <w:rPr>
             <w:rStyle w:val="Hyperlink"/>
@@ -857,7 +857,7 @@
             <w:noProof/>
             <w:webHidden/>
           </w:rPr>
-          <w:instrText xml:space="preserve"> PAGEREF _Toc242814938 \h </w:instrText>
+          <w:instrText xml:space="preserve"> PAGEREF _Toc242824021 \h </w:instrText>
         </w:r>
         <w:r>
           <w:rPr>
@@ -877,7 +877,7 @@
             <w:noProof/>
             <w:webHidden/>
           </w:rPr>
-          <w:t>2</w:t>
+          <w:t>3</w:t>
         </w:r>
         <w:r>
           <w:rPr>
@@ -905,7 +905,7 @@
           <w14:ligatures w14:val="standardContextual"/>
         </w:rPr>
       </w:pPr>
-      <w:hyperlink w:anchor="_Toc242814939" w:history="1">
+      <w:hyperlink w:anchor="_Toc242824022" w:history="1">
         <w:r>
           <w:rPr>
             <w:rStyle w:val="Hyperlink"/>
@@ -932,7 +932,7 @@
             <w:noProof/>
             <w:webHidden/>
           </w:rPr>
-          <w:instrText xml:space="preserve"> PAGEREF _Toc242814939 \h </w:instrText>
+          <w:instrText xml:space="preserve"> PAGEREF _Toc242824022 \h </w:instrText>
         </w:r>
         <w:r>
           <w:rPr>
@@ -979,7 +979,7 @@
           <w14:ligatures w14:val="standardContextual"/>
         </w:rPr>
       </w:pPr>
-      <w:hyperlink w:anchor="_Toc242814940" w:history="1">
+      <w:hyperlink w:anchor="_Toc242824023" w:history="1">
         <w:r>
           <w:rPr>
             <w:rStyle w:val="Hyperlink"/>
@@ -1006,7 +1006,7 @@
             <w:noProof/>
             <w:webHidden/>
           </w:rPr>
-          <w:instrText xml:space="preserve"> PAGEREF _Toc242814940 \h </w:instrText>
+          <w:instrText xml:space="preserve"> PAGEREF _Toc242824023 \h </w:instrText>
         </w:r>
         <w:r>
           <w:rPr>
@@ -1053,7 +1053,7 @@
           <w14:ligatures w14:val="standardContextual"/>
         </w:rPr>
       </w:pPr>
-      <w:hyperlink w:anchor="_Toc242814941" w:history="1">
+      <w:hyperlink w:anchor="_Toc242824024" w:history="1">
         <w:r>
           <w:rPr>
             <w:rStyle w:val="Hyperlink"/>
@@ -1080,7 +1080,7 @@
             <w:noProof/>
             <w:webHidden/>
           </w:rPr>
-          <w:instrText xml:space="preserve"> PAGEREF _Toc242814941 \h </w:instrText>
+          <w:instrText xml:space="preserve"> PAGEREF _Toc242824024 \h </w:instrText>
         </w:r>
         <w:r>
           <w:rPr>
@@ -1127,7 +1127,7 @@
           <w14:ligatures w14:val="standardContextual"/>
         </w:rPr>
       </w:pPr>
-      <w:hyperlink w:anchor="_Toc242814942" w:history="1">
+      <w:hyperlink w:anchor="_Toc242824025" w:history="1">
         <w:r>
           <w:rPr>
             <w:rStyle w:val="Hyperlink"/>
@@ -1154,7 +1154,7 @@
             <w:noProof/>
             <w:webHidden/>
           </w:rPr>
-          <w:instrText xml:space="preserve"> PAGEREF _Toc242814942 \h </w:instrText>
+          <w:instrText xml:space="preserve"> PAGEREF _Toc242824025 \h </w:instrText>
         </w:r>
         <w:r>
           <w:rPr>
@@ -1202,7 +1202,7 @@
           <w14:ligatures w14:val="standardContextual"/>
         </w:rPr>
       </w:pPr>
-      <w:hyperlink w:anchor="_Toc242814943" w:history="1">
+      <w:hyperlink w:anchor="_Toc242824026" w:history="1">
         <w:r>
           <w:rPr>
             <w:rStyle w:val="Hyperlink"/>
@@ -1229,7 +1229,7 @@
             <w:noProof/>
             <w:webHidden/>
           </w:rPr>
-          <w:instrText xml:space="preserve"> PAGEREF _Toc242814943 \h </w:instrText>
+          <w:instrText xml:space="preserve"> PAGEREF _Toc242824026 \h </w:instrText>
         </w:r>
         <w:r>
           <w:rPr>
@@ -1276,7 +1276,7 @@
           <w14:ligatures w14:val="standardContextual"/>
         </w:rPr>
       </w:pPr>
-      <w:hyperlink w:anchor="_Toc242814944" w:history="1">
+      <w:hyperlink w:anchor="_Toc242824027" w:history="1">
         <w:r>
           <w:rPr>
             <w:rStyle w:val="Hyperlink"/>
@@ -1303,7 +1303,7 @@
             <w:noProof/>
             <w:webHidden/>
           </w:rPr>
-          <w:instrText xml:space="preserve"> PAGEREF _Toc242814944 \h </w:instrText>
+          <w:instrText xml:space="preserve"> PAGEREF _Toc242824027 \h </w:instrText>
         </w:r>
         <w:r>
           <w:rPr>
@@ -1350,7 +1350,7 @@
           <w14:ligatures w14:val="standardContextual"/>
         </w:rPr>
       </w:pPr>
-      <w:hyperlink w:anchor="_Toc242814945" w:history="1">
+      <w:hyperlink w:anchor="_Toc242824028" w:history="1">
         <w:r>
           <w:rPr>
             <w:rStyle w:val="Hyperlink"/>
@@ -1377,7 +1377,7 @@
             <w:noProof/>
             <w:webHidden/>
           </w:rPr>
-          <w:instrText xml:space="preserve"> PAGEREF _Toc242814945 \h </w:instrText>
+          <w:instrText xml:space="preserve"> PAGEREF _Toc242824028 \h </w:instrText>
         </w:r>
         <w:r>
           <w:rPr>
@@ -1424,7 +1424,7 @@
           <w14:ligatures w14:val="standardContextual"/>
         </w:rPr>
       </w:pPr>
-      <w:hyperlink w:anchor="_Toc242814946" w:history="1">
+      <w:hyperlink w:anchor="_Toc242824029" w:history="1">
         <w:r>
           <w:rPr>
             <w:rStyle w:val="Hyperlink"/>
@@ -1451,7 +1451,7 @@
             <w:noProof/>
             <w:webHidden/>
           </w:rPr>
-          <w:instrText xml:space="preserve"> PAGEREF _Toc242814946 \h </w:instrText>
+          <w:instrText xml:space="preserve"> PAGEREF _Toc242824029 \h </w:instrText>
         </w:r>
         <w:r>
           <w:rPr>
@@ -1498,7 +1498,7 @@
           <w14:ligatures w14:val="standardContextual"/>
         </w:rPr>
       </w:pPr>
-      <w:hyperlink w:anchor="_Toc242814947" w:history="1">
+      <w:hyperlink w:anchor="_Toc242824030" w:history="1">
         <w:r>
           <w:rPr>
             <w:rStyle w:val="Hyperlink"/>
@@ -1525,7 +1525,7 @@
             <w:noProof/>
             <w:webHidden/>
           </w:rPr>
-          <w:instrText xml:space="preserve"> PAGEREF _Toc242814947 \h </w:instrText>
+          <w:instrText xml:space="preserve"> PAGEREF _Toc242824030 \h </w:instrText>
         </w:r>
         <w:r>
           <w:rPr>
@@ -1572,7 +1572,7 @@
           <w14:ligatures w14:val="standardContextual"/>
         </w:rPr>
       </w:pPr>
-      <w:hyperlink w:anchor="_Toc242814948" w:history="1">
+      <w:hyperlink w:anchor="_Toc242824031" w:history="1">
         <w:r>
           <w:rPr>
             <w:rStyle w:val="Hyperlink"/>
@@ -1599,7 +1599,7 @@
             <w:noProof/>
             <w:webHidden/>
           </w:rPr>
-          <w:instrText xml:space="preserve"> PAGEREF _Toc242814948 \h </w:instrText>
+          <w:instrText xml:space="preserve"> PAGEREF _Toc242824031 \h </w:instrText>
         </w:r>
         <w:r>
           <w:rPr>
@@ -1646,7 +1646,7 @@
           <w14:ligatures w14:val="standardContextual"/>
         </w:rPr>
       </w:pPr>
-      <w:hyperlink w:anchor="_Toc242814949" w:history="1">
+      <w:hyperlink w:anchor="_Toc242824032" w:history="1">
         <w:r>
           <w:rPr>
             <w:rStyle w:val="Hyperlink"/>
@@ -1673,7 +1673,7 @@
             <w:noProof/>
             <w:webHidden/>
           </w:rPr>
-          <w:instrText xml:space="preserve"> PAGEREF _Toc242814949 \h </w:instrText>
+          <w:instrText xml:space="preserve"> PAGEREF _Toc242824032 \h </w:instrText>
         </w:r>
         <w:r>
           <w:rPr>
@@ -1720,7 +1720,7 @@
           <w14:ligatures w14:val="standardContextual"/>
         </w:rPr>
       </w:pPr>
-      <w:hyperlink w:anchor="_Toc242814950" w:history="1">
+      <w:hyperlink w:anchor="_Toc242824033" w:history="1">
         <w:r>
           <w:rPr>
             <w:rStyle w:val="Hyperlink"/>
@@ -1747,7 +1747,7 @@
             <w:noProof/>
             <w:webHidden/>
           </w:rPr>
-          <w:instrText xml:space="preserve"> PAGEREF _Toc242814950 \h </w:instrText>
+          <w:instrText xml:space="preserve"> PAGEREF _Toc242824033 \h </w:instrText>
         </w:r>
         <w:r>
           <w:rPr>
@@ -1795,7 +1795,7 @@
           <w14:ligatures w14:val="standardContextual"/>
         </w:rPr>
       </w:pPr>
-      <w:hyperlink w:anchor="_Toc242814951" w:history="1">
+      <w:hyperlink w:anchor="_Toc242824034" w:history="1">
         <w:r>
           <w:rPr>
             <w:rStyle w:val="Hyperlink"/>
@@ -1822,7 +1822,7 @@
             <w:noProof/>
             <w:webHidden/>
           </w:rPr>
-          <w:instrText xml:space="preserve"> PAGEREF _Toc242814951 \h </w:instrText>
+          <w:instrText xml:space="preserve"> PAGEREF _Toc242824034 \h </w:instrText>
         </w:r>
         <w:r>
           <w:rPr>
@@ -1869,7 +1869,7 @@
           <w14:ligatures w14:val="standardContextual"/>
         </w:rPr>
       </w:pPr>
-      <w:hyperlink w:anchor="_Toc242814952" w:history="1">
+      <w:hyperlink w:anchor="_Toc242824035" w:history="1">
         <w:r>
           <w:rPr>
             <w:rStyle w:val="Hyperlink"/>
@@ -1896,7 +1896,7 @@
             <w:noProof/>
             <w:webHidden/>
           </w:rPr>
-          <w:instrText xml:space="preserve"> PAGEREF _Toc242814952 \h </w:instrText>
+          <w:instrText xml:space="preserve"> PAGEREF _Toc242824035 \h </w:instrText>
         </w:r>
         <w:r>
           <w:rPr>
@@ -1943,7 +1943,7 @@
           <w14:ligatures w14:val="standardContextual"/>
         </w:rPr>
       </w:pPr>
-      <w:hyperlink w:anchor="_Toc242814953" w:history="1">
+      <w:hyperlink w:anchor="_Toc242824036" w:history="1">
         <w:r>
           <w:rPr>
             <w:rStyle w:val="Hyperlink"/>
@@ -1970,7 +1970,7 @@
             <w:noProof/>
             <w:webHidden/>
           </w:rPr>
-          <w:instrText xml:space="preserve"> PAGEREF _Toc242814953 \h </w:instrText>
+          <w:instrText xml:space="preserve"> PAGEREF _Toc242824036 \h </w:instrText>
         </w:r>
         <w:r>
           <w:rPr>
@@ -2017,7 +2017,7 @@
           <w14:ligatures w14:val="standardContextual"/>
         </w:rPr>
       </w:pPr>
-      <w:hyperlink w:anchor="_Toc242814954" w:history="1">
+      <w:hyperlink w:anchor="_Toc242824037" w:history="1">
         <w:r>
           <w:rPr>
             <w:rStyle w:val="Hyperlink"/>
@@ -2044,7 +2044,7 @@
             <w:noProof/>
             <w:webHidden/>
           </w:rPr>
-          <w:instrText xml:space="preserve"> PAGEREF _Toc242814954 \h </w:instrText>
+          <w:instrText xml:space="preserve"> PAGEREF _Toc242824037 \h </w:instrText>
         </w:r>
         <w:r>
           <w:rPr>
@@ -2091,7 +2091,7 @@
           <w14:ligatures w14:val="standardContextual"/>
         </w:rPr>
       </w:pPr>
-      <w:hyperlink w:anchor="_Toc242814955" w:history="1">
+      <w:hyperlink w:anchor="_Toc242824038" w:history="1">
         <w:r>
           <w:rPr>
             <w:rStyle w:val="Hyperlink"/>
@@ -2118,7 +2118,7 @@
             <w:noProof/>
             <w:webHidden/>
           </w:rPr>
-          <w:instrText xml:space="preserve"> PAGEREF _Toc242814955 \h </w:instrText>
+          <w:instrText xml:space="preserve"> PAGEREF _Toc242824038 \h </w:instrText>
         </w:r>
         <w:r>
           <w:rPr>
@@ -2165,7 +2165,7 @@
           <w14:ligatures w14:val="standardContextual"/>
         </w:rPr>
       </w:pPr>
-      <w:hyperlink w:anchor="_Toc242814956" w:history="1">
+      <w:hyperlink w:anchor="_Toc242824039" w:history="1">
         <w:r>
           <w:rPr>
             <w:rStyle w:val="Hyperlink"/>
@@ -2192,7 +2192,7 @@
             <w:noProof/>
             <w:webHidden/>
           </w:rPr>
-          <w:instrText xml:space="preserve"> PAGEREF _Toc242814956 \h </w:instrText>
+          <w:instrText xml:space="preserve"> PAGEREF _Toc242824039 \h </w:instrText>
         </w:r>
         <w:r>
           <w:rPr>
@@ -2239,7 +2239,7 @@
           <w14:ligatures w14:val="standardContextual"/>
         </w:rPr>
       </w:pPr>
-      <w:hyperlink w:anchor="_Toc242814957" w:history="1">
+      <w:hyperlink w:anchor="_Toc242824040" w:history="1">
         <w:r>
           <w:rPr>
             <w:rStyle w:val="Hyperlink"/>
@@ -2266,7 +2266,7 @@
             <w:noProof/>
             <w:webHidden/>
           </w:rPr>
-          <w:instrText xml:space="preserve"> PAGEREF _Toc242814957 \h </w:instrText>
+          <w:instrText xml:space="preserve"> PAGEREF _Toc242824040 \h </w:instrText>
         </w:r>
         <w:r>
           <w:rPr>
@@ -2314,7 +2314,7 @@
           <w14:ligatures w14:val="standardContextual"/>
         </w:rPr>
       </w:pPr>
-      <w:hyperlink w:anchor="_Toc242814958" w:history="1">
+      <w:hyperlink w:anchor="_Toc242824041" w:history="1">
         <w:r>
           <w:rPr>
             <w:rStyle w:val="Hyperlink"/>
@@ -2341,7 +2341,7 @@
             <w:noProof/>
             <w:webHidden/>
           </w:rPr>
-          <w:instrText xml:space="preserve"> PAGEREF _Toc242814958 \h </w:instrText>
+          <w:instrText xml:space="preserve"> PAGEREF _Toc242824041 \h </w:instrText>
         </w:r>
         <w:r>
           <w:rPr>
@@ -2388,7 +2388,7 @@
           <w14:ligatures w14:val="standardContextual"/>
         </w:rPr>
       </w:pPr>
-      <w:hyperlink w:anchor="_Toc242814959" w:history="1">
+      <w:hyperlink w:anchor="_Toc242824042" w:history="1">
         <w:r>
           <w:rPr>
             <w:rStyle w:val="Hyperlink"/>
@@ -2415,7 +2415,7 @@
             <w:noProof/>
             <w:webHidden/>
           </w:rPr>
-          <w:instrText xml:space="preserve"> PAGEREF _Toc242814959 \h </w:instrText>
+          <w:instrText xml:space="preserve"> PAGEREF _Toc242824042 \h </w:instrText>
         </w:r>
         <w:r>
           <w:rPr>
@@ -2462,7 +2462,7 @@
           <w14:ligatures w14:val="standardContextual"/>
         </w:rPr>
       </w:pPr>
-      <w:hyperlink w:anchor="_Toc242814960" w:history="1">
+      <w:hyperlink w:anchor="_Toc242824043" w:history="1">
         <w:r>
           <w:rPr>
             <w:rStyle w:val="Hyperlink"/>
@@ -2489,7 +2489,7 @@
             <w:noProof/>
             <w:webHidden/>
           </w:rPr>
-          <w:instrText xml:space="preserve"> PAGEREF _Toc242814960 \h </w:instrText>
+          <w:instrText xml:space="preserve"> PAGEREF _Toc242824043 \h </w:instrText>
         </w:r>
         <w:r>
           <w:rPr>
@@ -2536,7 +2536,7 @@
           <w14:ligatures w14:val="standardContextual"/>
         </w:rPr>
       </w:pPr>
-      <w:hyperlink w:anchor="_Toc242814961" w:history="1">
+      <w:hyperlink w:anchor="_Toc242824044" w:history="1">
         <w:r>
           <w:rPr>
             <w:rStyle w:val="Hyperlink"/>
@@ -2563,7 +2563,7 @@
             <w:noProof/>
             <w:webHidden/>
           </w:rPr>
-          <w:instrText xml:space="preserve"> PAGEREF _Toc242814961 \h </w:instrText>
+          <w:instrText xml:space="preserve"> PAGEREF _Toc242824044 \h </w:instrText>
         </w:r>
         <w:r>
           <w:rPr>
@@ -2620,7 +2620,7 @@
         <w:jc w:val="left"/>
       </w:pPr>
       <w:bookmarkStart w:id="0" w:name="_Toc242299335"/>
-      <w:bookmarkStart w:id="1" w:name="_Toc242814934"/>
+      <w:bookmarkStart w:id="1" w:name="_Toc242824017"/>
       <w:r>
         <w:lastRenderedPageBreak/>
         <w:t>Chương 1 Tổng quan đề tài và yêu cầu học phần</w:t>
@@ -2633,7 +2633,7 @@
         <w:pStyle w:val="Heading2"/>
       </w:pPr>
       <w:bookmarkStart w:id="2" w:name="_Toc242299336"/>
-      <w:bookmarkStart w:id="3" w:name="_Toc242814935"/>
+      <w:bookmarkStart w:id="3" w:name="_Toc242824018"/>
       <w:r>
         <w:t>1.1 Bối cảnh, mục tiêu và phạm vi</w:t>
       </w:r>
@@ -2706,7 +2706,7 @@
         <w:pStyle w:val="Heading2"/>
       </w:pPr>
       <w:bookmarkStart w:id="4" w:name="_Toc242299337"/>
-      <w:bookmarkStart w:id="5" w:name="_Toc242814936"/>
+      <w:bookmarkStart w:id="5" w:name="_Toc242824019"/>
       <w:r>
         <w:t>1.2 Yêu cầu chức năng và kết quả triển khai</w:t>
       </w:r>
@@ -3030,7 +3030,7 @@
               <w:rPr>
                 <w:sz w:val="22"/>
               </w:rPr>
-              <w:t>Secrets Manager lưu tọa độ và ngưỡng; API công khai không dùng api_key minh họa</w:t>
+              <w:t>Secrets Manager lưu tọa độ và ngưỡng cảnh báo; Open-Meteo sử dụng API công khai.</w:t>
             </w:r>
           </w:p>
         </w:tc>
@@ -3304,7 +3304,7 @@
         <w:pStyle w:val="Heading2"/>
       </w:pPr>
       <w:bookmarkStart w:id="6" w:name="_Toc242299338"/>
-      <w:bookmarkStart w:id="7" w:name="_Toc242814937"/>
+      <w:bookmarkStart w:id="7" w:name="_Toc242824020"/>
       <w:r>
         <w:lastRenderedPageBreak/>
         <w:t>1.3 Kiến trúc tổng thể</w:t>
@@ -3323,7 +3323,7 @@
           <w:noProof/>
         </w:rPr>
         <w:drawing>
-          <wp:inline distT="0" distB="0" distL="0" distR="0" wp14:anchorId="04472A15" wp14:editId="392620F3">
+          <wp:inline distT="0" distB="0" distL="0" distR="0" wp14:anchorId="5F487AFD" wp14:editId="7AA32674">
             <wp:extent cx="6126480" cy="4778654"/>
             <wp:effectExtent l="0" t="0" r="0" b="0"/>
             <wp:docPr id="7" name="Picture 7"/>
@@ -3375,16 +3375,18 @@
         <w:ind w:firstLine="504"/>
       </w:pPr>
       <w:r>
-        <w:t>Open-Meteo là nguồn dữ liệu bên ngoài AWS; các khối còn lại thuộc luồng xử lý trong Learner Lab tại us-east-1. EventBridge phát lệnh theo rate(1 hour) tới Lambda. Lambda đọc cấu hình từ Secrets Manager, gọi API công khai, kiểm tra ngưỡng, ghi dữ liệu S3 và công bố cảnh báo qua SNS khi cần. Glue Catalog mô tả bảng ngoài trên vùng raw của S3, còn Athena đọc dữ liệu để tổng hợp và xuất kết quả. CloudWatch ghi chỉ số vận hành của Lambda. Secrets Manager hiện chứa cấu hình và một khóa minh họa; URL Open-Meteo trong mã nguồn không sử dụng khóa đó để xác thực.</w:t>
+        <w:t>Open-Meteo là nguồn dữ liệu bên ngoài AWS; các khối còn lại thuộc luồng xử lý trong Learner Lab tại us-east-1. EventBridge kích hoạt Lambda theo rate(1 hour). Lambda đọc cấu hình từ Secrets Manager, gọi API công khai, kiểm tra ngưỡng, ghi dữ liệu S3 và công bố cảnh báo qua SNS khi cần. Glue Catalog mô tả bảng ngoài trên vùng raw của S3, còn Athena đọc dữ liệu để tổng hợp và xuất kết quả. CloudWatch ghi chỉ số vận hành của Lambda. Secrets Manager quản lý tọa độ và ngưỡng cấu hình; các lời gọi Open-Meteo trong dự án sử dụng API công khai không yêu cầu khóa của nhà cung cấp.</w:t>
       </w:r>
     </w:p>
     <w:p>
       <w:pPr>
         <w:pStyle w:val="Heading2"/>
+        <w:pageBreakBefore/>
       </w:pPr>
       <w:bookmarkStart w:id="8" w:name="_Toc242299339"/>
-      <w:bookmarkStart w:id="9" w:name="_Toc242814938"/>
+      <w:bookmarkStart w:id="9" w:name="_Toc242824021"/>
       <w:r>
+        <w:lastRenderedPageBreak/>
         <w:t>1.4 Nguồn số liệu và mốc đo</w:t>
       </w:r>
       <w:bookmarkEnd w:id="8"/>
@@ -3396,11 +3398,7 @@
         <w:ind w:firstLine="504"/>
       </w:pPr>
       <w:r>
-        <w:t xml:space="preserve">Các bảng phân tích sử dụng bốn CSV tổng hợp, CSV chứa 156 bản ghi gốc và bảng chỉ số truy vấn đã lưu trong Tuần 1. Số liệu S3, Lambda và CloudWatch được đọc ở các mốc quan sát </w:t>
-      </w:r>
-      <w:r>
-        <w:lastRenderedPageBreak/>
-        <w:t>riêng. Báo cáo đối chiếu độc lập số dòng giữa bảng đô thị, bảng giờ, bảng cấp AQI và dữ liệu gốc.</w:t>
+        <w:t>Các bảng phân tích sử dụng bốn CSV tổng hợp, CSV chứa 156 bản ghi gốc và bảng chỉ số truy vấn đã lưu trong Tuần 1. Số liệu S3, Lambda và CloudWatch được đọc ở các mốc quan sát riêng. Báo cáo đối chiếu số dòng giữa bảng đô thị, bảng giờ, bảng cấp AQI và dữ liệu gốc. Dữ liệu chất lượng không khí được lấy từ Open-Meteo Air Quality API, dựa trên sản phẩm mô hình khí quyển CAMS, không phải phép đo trực tiếp tại một trạm. Nguồn dữ liệu: https://open-meteo.com/en/docs/air-quality-api.</w:t>
       </w:r>
     </w:p>
     <w:p>
@@ -4018,7 +4016,7 @@
               <w:rPr>
                 <w:sz w:val="22"/>
               </w:rPr>
-              <w:t>Rule Enabled, Lambda Active trong Tuần 1; khóa API trong Secret chưa được mã nguồn dùng</w:t>
+              <w:t>Rule Enabled; Lambda Active trong Tuần 1.</w:t>
             </w:r>
           </w:p>
         </w:tc>
@@ -4265,7 +4263,7 @@
         <w:jc w:val="left"/>
       </w:pPr>
       <w:bookmarkStart w:id="10" w:name="_Toc242299340"/>
-      <w:bookmarkStart w:id="11" w:name="_Toc242814939"/>
+      <w:bookmarkStart w:id="11" w:name="_Toc242824022"/>
       <w:r>
         <w:lastRenderedPageBreak/>
         <w:t>Chương 2 Báo cáo tiến độ Tuần 1</w:t>
@@ -4287,7 +4285,7 @@
         <w:pStyle w:val="Heading2"/>
       </w:pPr>
       <w:bookmarkStart w:id="12" w:name="_Toc242299341"/>
-      <w:bookmarkStart w:id="13" w:name="_Toc242814940"/>
+      <w:bookmarkStart w:id="13" w:name="_Toc242824023"/>
       <w:r>
         <w:t>2.1 Mục tiêu và phân công thực hiện</w:t>
       </w:r>
@@ -4554,7 +4552,7 @@
         <w:pStyle w:val="Heading2"/>
       </w:pPr>
       <w:bookmarkStart w:id="14" w:name="_Toc242299342"/>
-      <w:bookmarkStart w:id="15" w:name="_Toc242814941"/>
+      <w:bookmarkStart w:id="15" w:name="_Toc242824024"/>
       <w:r>
         <w:t>2.2 Phạm vi và luồng dữ liệu đo</w:t>
       </w:r>
@@ -5015,7 +5013,7 @@
         <w:pStyle w:val="Heading2"/>
       </w:pPr>
       <w:bookmarkStart w:id="16" w:name="_Toc242299343"/>
-      <w:bookmarkStart w:id="17" w:name="_Toc242814942"/>
+      <w:bookmarkStart w:id="17" w:name="_Toc242824025"/>
       <w:r>
         <w:t>2.3 Kết quả định lượng</w:t>
       </w:r>
@@ -5546,7 +5544,7 @@
         <w:jc w:val="left"/>
       </w:pPr>
       <w:bookmarkStart w:id="18" w:name="_Toc242299344"/>
-      <w:bookmarkStart w:id="19" w:name="_Toc242814943"/>
+      <w:bookmarkStart w:id="19" w:name="_Toc242824026"/>
       <w:r>
         <w:lastRenderedPageBreak/>
         <w:t>Chương 3 Thiết kế và triển khai trên AWS Learner Lab</w:t>
@@ -5559,7 +5557,7 @@
         <w:pStyle w:val="Heading2"/>
       </w:pPr>
       <w:bookmarkStart w:id="20" w:name="_Toc242299345"/>
-      <w:bookmarkStart w:id="21" w:name="_Toc242814944"/>
+      <w:bookmarkStart w:id="21" w:name="_Toc242824027"/>
       <w:r>
         <w:t>3.1 Danh mục dịch vụ và cấu hình thực tế</w:t>
       </w:r>
@@ -5805,7 +5803,7 @@
               <w:rPr>
                 <w:sz w:val="22"/>
               </w:rPr>
-              <w:t>WeatherCollectionHourlyRule, rate(1 hour)</w:t>
+              <w:t>rate(1 hour); kích hoạt Lambda theo giờ</w:t>
             </w:r>
           </w:p>
         </w:tc>
@@ -6313,7 +6311,7 @@
         <w:pStyle w:val="Heading2"/>
       </w:pPr>
       <w:bookmarkStart w:id="22" w:name="_Toc242299346"/>
-      <w:bookmarkStart w:id="23" w:name="_Toc242814945"/>
+      <w:bookmarkStart w:id="23" w:name="_Toc242824028"/>
       <w:r>
         <w:t>3.2 Dữ liệu và phân vùng S3</w:t>
       </w:r>
@@ -6397,7 +6395,7 @@
         <w:pStyle w:val="Heading2"/>
       </w:pPr>
       <w:bookmarkStart w:id="24" w:name="_Toc242299347"/>
-      <w:bookmarkStart w:id="25" w:name="_Toc242814946"/>
+      <w:bookmarkStart w:id="25" w:name="_Toc242824029"/>
       <w:r>
         <w:t>3.3 An toàn cấu hình và vận hành</w:t>
       </w:r>
@@ -6410,7 +6408,7 @@
         <w:ind w:firstLine="504"/>
       </w:pPr>
       <w:r>
-        <w:t>Lambda lấy tên bucket, secret và SNS topic từ biến môi trường; quyền thực thi sử dụng LabRole của Learner Lab. Mã nguồn không lưu khóa truy cập AWS trong repository. Secret hiện lưu các ngưỡng và tọa độ; trường api_key là giá trị minh họa, không được truyền trong URL truy vấn Open-Meteo. Tình huống đọc Secret lỗi có nhánh cấu hình mặc định, nhưng lỗi cần được ghi log và xử lý khi vận hành thật.</w:t>
+        <w:t>Lambda lấy tên bucket, secret và SNS topic từ biến môi trường; quyền thực thi sử dụng LabRole của Learner Lab. Mã nguồn không lưu khóa truy cập AWS trong repository. Secret quản lý các ngưỡng cảnh báo và tọa độ thu thập. Khi đọc secret thất bại, hàm ghi log và sử dụng cấu hình dự phòng đã định nghĩa trong mã nguồn.</w:t>
       </w:r>
     </w:p>
     <w:p>
@@ -6418,7 +6416,7 @@
         <w:pStyle w:val="Heading2"/>
       </w:pPr>
       <w:bookmarkStart w:id="26" w:name="_Toc242299348"/>
-      <w:bookmarkStart w:id="27" w:name="_Toc242814947"/>
+      <w:bookmarkStart w:id="27" w:name="_Toc242824030"/>
       <w:r>
         <w:lastRenderedPageBreak/>
         <w:t>3.4 Trình tự xử lý của Lambda</w:t>
@@ -6441,7 +6439,7 @@
         <w:ind w:firstLine="504"/>
       </w:pPr>
       <w:r>
-        <w:t>Đối với nạp dữ liệu lịch sử, mã dùng past_hours=48, tính số ngày cần truy vấn rồi lấy tối đa 48 mốc cuối trong mảng thời gian. Mã căn chỉnh theo chỉ số gốc của mảng khi nguồn trả ít mốc hơn dự kiến để tránh lệch dữ liệu giữa thời gian và cảm biến. Mỗi bản ghi được gắn record_id có phần ngẫu nhiên; vì vậy một lần chạy lặp có thể tạo bản ghi trùng ý nghĩa quan trắc.</w:t>
+        <w:t>Phiên bản Tuần 1 nạp dữ liệu lịch sử với past_hours=48, tính số ngày cần truy vấn rồi lấy tối đa 48 mốc cuối trong mảng thời gian. Hàm dùng chỉ số gốc của mảng khi nguồn trả ít mốc hơn dự kiến để giữ thời gian cùng vị trí với giá trị cảm biến. Mỗi bản ghi được gắn record_id có phần ngẫu nhiên; vì vậy một lần chạy lặp có thể tạo bản ghi trùng ý nghĩa dữ liệu.</w:t>
       </w:r>
     </w:p>
     <w:p>
@@ -6458,7 +6456,7 @@
         <w:pStyle w:val="Heading2"/>
       </w:pPr>
       <w:bookmarkStart w:id="28" w:name="_Toc242299349"/>
-      <w:bookmarkStart w:id="29" w:name="_Toc242814948"/>
+      <w:bookmarkStart w:id="29" w:name="_Toc242824031"/>
       <w:r>
         <w:t>3.5 Truy vấn Athena và khả năng tái lập</w:t>
       </w:r>
@@ -6720,7 +6718,7 @@
         <w:pStyle w:val="Heading2"/>
       </w:pPr>
       <w:bookmarkStart w:id="30" w:name="_Toc242299350"/>
-      <w:bookmarkStart w:id="31" w:name="_Toc242814949"/>
+      <w:bookmarkStart w:id="31" w:name="_Toc242824032"/>
       <w:r>
         <w:t>3.6 Lược đồ bản ghi và chất lượng dữ liệu</w:t>
       </w:r>
@@ -7311,7 +7309,7 @@
               <w:rPr>
                 <w:sz w:val="22"/>
               </w:rPr>
-              <w:t>Mảng lịch sử ghép theo cùng chỉ số, chưa xác nhận hai trục thời gian luôn khớp</w:t>
+              <w:t>Phiên bản Tuần 1 ghép theo vị trí trong mảng; phiên bản Tuần 2 ghép theo timestamp.</w:t>
             </w:r>
           </w:p>
         </w:tc>
@@ -7406,7 +7404,7 @@
         <w:ind w:firstLine="504"/>
       </w:pPr>
       <w:r>
-        <w:t>Việc đổi null thành 0 giúp hàm không lỗi kiểu dữ liệu nhưng khiến AVG coi số 0 là một phép đo thật. Chưa có thống kê tỷ lệ giá trị thiếu trong toàn bộ đối tượng S3, nên các kết luận khí tượng ở Chương 4 chỉ mô tả tệp CSV đã xuất. Muốn dùng cho phân tích khoa học, cần giữ NULL, kiểm tra độ đầy đủ từng trường và ghép thời gian API theo timestamp thay vì giả định hai mảng có cùng vị trí.</w:t>
+        <w:t>Việc đổi null thành 0 giúp hàm không lỗi kiểu dữ liệu nhưng khiến AVG coi số 0 là một phép đo thật. Chưa có thống kê tỷ lệ giá trị thiếu trong toàn bộ đối tượng S3, nên các kết luận khí tượng ở Chương 4 chỉ mô tả tệp CSV đã xuất. Phiên bản được đối chiếu ở Tuần 1 ghép hai chuỗi lịch sử theo vị trí trong mảng; bộ source hoàn thiện ở Tuần 2 đã ghép theo timestamp. Sự thay đổi mã nguồn này không làm thay đổi các giá trị trong bộ CSV đã lưu dùng cho hai báo cáo.</w:t>
       </w:r>
     </w:p>
     <w:p>
@@ -7414,7 +7412,7 @@
         <w:pStyle w:val="Heading2"/>
       </w:pPr>
       <w:bookmarkStart w:id="32" w:name="_Toc242299351"/>
-      <w:bookmarkStart w:id="33" w:name="_Toc242814950"/>
+      <w:bookmarkStart w:id="33" w:name="_Toc242824033"/>
       <w:r>
         <w:lastRenderedPageBreak/>
         <w:t>3.7 Tần suất gọi Open-Meteo và yêu cầu khóa API</w:t>
@@ -7437,7 +7435,7 @@
         <w:ind w:firstLine="504"/>
       </w:pPr>
       <w:r>
-        <w:t>Open-Meteo công bố Free API không cần đăng ký hay khóa API tại https://open-meteo.com/. Secret weather/api_config của dự án chứa tọa độ, ngưỡng và một chuỗi api_key minh họa; URL công khai trong mã nguồn không dùng chuỗi này để xác thực. Cấu hình hiện tại vì vậy dựa trên API công khai và không sử dụng khóa API của nhà cung cấp bên ngoài.</w:t>
+        <w:t>Các lời gọi Open-Meteo trong dự án sử dụng API công khai không yêu cầu khóa của nhà cung cấp. Secret weather/api_config quản lý tọa độ ba đô thị và ngưỡng cảnh báo; cấu hình này được Lambda đọc khi xử lý dữ liệu. Báo cáo phân biệt cấu hình của hệ thống với bộ số liệu được lưu để phân tích.</w:t>
       </w:r>
     </w:p>
     <w:p>
@@ -7447,7 +7445,7 @@
         <w:jc w:val="left"/>
       </w:pPr>
       <w:bookmarkStart w:id="34" w:name="_Toc242299352"/>
-      <w:bookmarkStart w:id="35" w:name="_Toc242814951"/>
+      <w:bookmarkStart w:id="35" w:name="_Toc242824034"/>
       <w:r>
         <w:lastRenderedPageBreak/>
         <w:t>Chương 4 Kết quả kiểm tra và phân tích dữ liệu</w:t>
@@ -7460,7 +7458,7 @@
         <w:pStyle w:val="Heading2"/>
       </w:pPr>
       <w:bookmarkStart w:id="36" w:name="_Toc242299353"/>
-      <w:bookmarkStart w:id="37" w:name="_Toc242814952"/>
+      <w:bookmarkStart w:id="37" w:name="_Toc242824035"/>
       <w:r>
         <w:t>4.1 Mốc dữ liệu và số đo vận hành AWS</w:t>
       </w:r>
@@ -8152,7 +8150,7 @@
         <w:pageBreakBefore/>
       </w:pPr>
       <w:bookmarkStart w:id="38" w:name="_Toc242299354"/>
-      <w:bookmarkStart w:id="39" w:name="_Toc242814953"/>
+      <w:bookmarkStart w:id="39" w:name="_Toc242824036"/>
       <w:r>
         <w:lastRenderedPageBreak/>
         <w:t>4.2 So sánh ba đô thị từ Athena</w:t>
@@ -9365,7 +9363,7 @@
         <w:pStyle w:val="Heading2"/>
       </w:pPr>
       <w:bookmarkStart w:id="40" w:name="_Toc242299355"/>
-      <w:bookmarkStart w:id="41" w:name="_Toc242814954"/>
+      <w:bookmarkStart w:id="41" w:name="_Toc242824037"/>
       <w:r>
         <w:t>4.3 Biến thiên theo 24 giờ UTC</w:t>
       </w:r>
@@ -12642,7 +12640,7 @@
         <w:pStyle w:val="Heading2"/>
       </w:pPr>
       <w:bookmarkStart w:id="42" w:name="_Toc242299356"/>
-      <w:bookmarkStart w:id="43" w:name="_Toc242814955"/>
+      <w:bookmarkStart w:id="43" w:name="_Toc242824038"/>
       <w:r>
         <w:t>4.4 Phân bố cấp chất lượng không khí</w:t>
       </w:r>
@@ -13283,7 +13281,7 @@
         <w:pStyle w:val="Heading2"/>
       </w:pPr>
       <w:bookmarkStart w:id="44" w:name="_Toc242299357"/>
-      <w:bookmarkStart w:id="45" w:name="_Toc242814956"/>
+      <w:bookmarkStart w:id="45" w:name="_Toc242824039"/>
       <w:r>
         <w:t>4.5 Tương quan PM2.5 với yếu tố khí tượng</w:t>
       </w:r>
@@ -13822,7 +13820,7 @@
         <w:pageBreakBefore/>
       </w:pPr>
       <w:bookmarkStart w:id="46" w:name="_Toc242299358"/>
-      <w:bookmarkStart w:id="47" w:name="_Toc242814957"/>
+      <w:bookmarkStart w:id="47" w:name="_Toc242824040"/>
       <w:r>
         <w:lastRenderedPageBreak/>
         <w:t>4.6 Thời gian và dung lượng quét của năm truy vấn</w:t>
@@ -14668,7 +14666,7 @@
         <w:jc w:val="left"/>
       </w:pPr>
       <w:bookmarkStart w:id="48" w:name="_Toc242299359"/>
-      <w:bookmarkStart w:id="49" w:name="_Toc242814958"/>
+      <w:bookmarkStart w:id="49" w:name="_Toc242824041"/>
       <w:r>
         <w:lastRenderedPageBreak/>
         <w:t>Chương 5 Tổng hợp kết quả và chi phí Tuần 1</w:t>
@@ -14681,7 +14679,7 @@
         <w:pStyle w:val="Heading2"/>
       </w:pPr>
       <w:bookmarkStart w:id="50" w:name="_Toc242299360"/>
-      <w:bookmarkStart w:id="51" w:name="_Toc242814959"/>
+      <w:bookmarkStart w:id="51" w:name="_Toc242824042"/>
       <w:r>
         <w:t>5.1 Mức độ hoàn thành theo sản phẩm</w:t>
       </w:r>
@@ -14702,7 +14700,7 @@
         <w:pStyle w:val="Heading2"/>
       </w:pPr>
       <w:bookmarkStart w:id="52" w:name="_Toc242299361"/>
-      <w:bookmarkStart w:id="53" w:name="_Toc242814960"/>
+      <w:bookmarkStart w:id="53" w:name="_Toc242824043"/>
       <w:r>
         <w:t>5.2 Quản lý chi phí</w:t>
       </w:r>
@@ -15240,7 +15238,7 @@
         <w:pStyle w:val="Heading2"/>
       </w:pPr>
       <w:bookmarkStart w:id="54" w:name="_Toc242299362"/>
-      <w:bookmarkStart w:id="55" w:name="_Toc242814961"/>
+      <w:bookmarkStart w:id="55" w:name="_Toc242824044"/>
       <w:r>
         <w:t>5.3 Kết luận</w:t>
       </w:r>
@@ -15535,9 +15533,9 @@
     </w:lvl>
   </w:abstractNum>
   <w:abstractNum w:abstractNumId="9" w15:restartNumberingAfterBreak="0">
-    <w:nsid w:val="59571628"/>
+    <w:nsid w:val="04FF4E41"/>
     <w:multiLevelType w:val="multilevel"/>
-    <w:tmpl w:val="4FA4CAF4"/>
+    <w:tmpl w:val="8C481B76"/>
     <w:lvl w:ilvl="0">
       <w:start w:val="1"/>
       <w:numFmt w:val="bullet"/>
@@ -15586,7 +15584,7 @@
       <w:lvlJc w:val="left"/>
     </w:lvl>
   </w:abstractNum>
-  <w:num w:numId="1" w16cid:durableId="2015499321">
+  <w:num w:numId="1" w16cid:durableId="2062702042">
     <w:abstractNumId w:val="9"/>
   </w:num>
 </w:numbering>

</xml_diff>

<commit_message>
docs: reconcile confirmed hours and saved AWS evidence
</commit_message>
<xml_diff>
--- a/tuan_1/docs/Bao_cao_tuan_1_Dien_toan_dam_may_Nhom_05.docx
+++ b/tuan_1/docs/Bao_cao_tuan_1_Dien_toan_dam_may_Nhom_05.docx
@@ -534,7 +534,7 @@
         </w:rPr>
         <w:fldChar w:fldCharType="separate"/>
       </w:r>
-      <w:hyperlink w:anchor="_Toc242824017" w:history="1">
+      <w:hyperlink w:anchor="_Toc242827603" w:history="1">
         <w:r>
           <w:rPr>
             <w:rStyle w:val="Hyperlink"/>
@@ -561,7 +561,7 @@
             <w:noProof/>
             <w:webHidden/>
           </w:rPr>
-          <w:instrText xml:space="preserve"> PAGEREF _Toc242824017 \h </w:instrText>
+          <w:instrText xml:space="preserve"> PAGEREF _Toc242827603 \h </w:instrText>
         </w:r>
         <w:r>
           <w:rPr>
@@ -608,7 +608,7 @@
           <w14:ligatures w14:val="standardContextual"/>
         </w:rPr>
       </w:pPr>
-      <w:hyperlink w:anchor="_Toc242824018" w:history="1">
+      <w:hyperlink w:anchor="_Toc242827604" w:history="1">
         <w:r>
           <w:rPr>
             <w:rStyle w:val="Hyperlink"/>
@@ -635,7 +635,7 @@
             <w:noProof/>
             <w:webHidden/>
           </w:rPr>
-          <w:instrText xml:space="preserve"> PAGEREF _Toc242824018 \h </w:instrText>
+          <w:instrText xml:space="preserve"> PAGEREF _Toc242827604 \h </w:instrText>
         </w:r>
         <w:r>
           <w:rPr>
@@ -682,7 +682,7 @@
           <w14:ligatures w14:val="standardContextual"/>
         </w:rPr>
       </w:pPr>
-      <w:hyperlink w:anchor="_Toc242824019" w:history="1">
+      <w:hyperlink w:anchor="_Toc242827605" w:history="1">
         <w:r>
           <w:rPr>
             <w:rStyle w:val="Hyperlink"/>
@@ -709,7 +709,7 @@
             <w:noProof/>
             <w:webHidden/>
           </w:rPr>
-          <w:instrText xml:space="preserve"> PAGEREF _Toc242824019 \h </w:instrText>
+          <w:instrText xml:space="preserve"> PAGEREF _Toc242827605 \h </w:instrText>
         </w:r>
         <w:r>
           <w:rPr>
@@ -756,7 +756,7 @@
           <w14:ligatures w14:val="standardContextual"/>
         </w:rPr>
       </w:pPr>
-      <w:hyperlink w:anchor="_Toc242824020" w:history="1">
+      <w:hyperlink w:anchor="_Toc242827606" w:history="1">
         <w:r>
           <w:rPr>
             <w:rStyle w:val="Hyperlink"/>
@@ -783,7 +783,7 @@
             <w:noProof/>
             <w:webHidden/>
           </w:rPr>
-          <w:instrText xml:space="preserve"> PAGEREF _Toc242824020 \h </w:instrText>
+          <w:instrText xml:space="preserve"> PAGEREF _Toc242827606 \h </w:instrText>
         </w:r>
         <w:r>
           <w:rPr>
@@ -830,7 +830,7 @@
           <w14:ligatures w14:val="standardContextual"/>
         </w:rPr>
       </w:pPr>
-      <w:hyperlink w:anchor="_Toc242824021" w:history="1">
+      <w:hyperlink w:anchor="_Toc242827607" w:history="1">
         <w:r>
           <w:rPr>
             <w:rStyle w:val="Hyperlink"/>
@@ -857,7 +857,7 @@
             <w:noProof/>
             <w:webHidden/>
           </w:rPr>
-          <w:instrText xml:space="preserve"> PAGEREF _Toc242824021 \h </w:instrText>
+          <w:instrText xml:space="preserve"> PAGEREF _Toc242827607 \h </w:instrText>
         </w:r>
         <w:r>
           <w:rPr>
@@ -905,7 +905,7 @@
           <w14:ligatures w14:val="standardContextual"/>
         </w:rPr>
       </w:pPr>
-      <w:hyperlink w:anchor="_Toc242824022" w:history="1">
+      <w:hyperlink w:anchor="_Toc242827608" w:history="1">
         <w:r>
           <w:rPr>
             <w:rStyle w:val="Hyperlink"/>
@@ -932,7 +932,7 @@
             <w:noProof/>
             <w:webHidden/>
           </w:rPr>
-          <w:instrText xml:space="preserve"> PAGEREF _Toc242824022 \h </w:instrText>
+          <w:instrText xml:space="preserve"> PAGEREF _Toc242827608 \h </w:instrText>
         </w:r>
         <w:r>
           <w:rPr>
@@ -979,7 +979,7 @@
           <w14:ligatures w14:val="standardContextual"/>
         </w:rPr>
       </w:pPr>
-      <w:hyperlink w:anchor="_Toc242824023" w:history="1">
+      <w:hyperlink w:anchor="_Toc242827609" w:history="1">
         <w:r>
           <w:rPr>
             <w:rStyle w:val="Hyperlink"/>
@@ -1006,7 +1006,7 @@
             <w:noProof/>
             <w:webHidden/>
           </w:rPr>
-          <w:instrText xml:space="preserve"> PAGEREF _Toc242824023 \h </w:instrText>
+          <w:instrText xml:space="preserve"> PAGEREF _Toc242827609 \h </w:instrText>
         </w:r>
         <w:r>
           <w:rPr>
@@ -1053,7 +1053,7 @@
           <w14:ligatures w14:val="standardContextual"/>
         </w:rPr>
       </w:pPr>
-      <w:hyperlink w:anchor="_Toc242824024" w:history="1">
+      <w:hyperlink w:anchor="_Toc242827610" w:history="1">
         <w:r>
           <w:rPr>
             <w:rStyle w:val="Hyperlink"/>
@@ -1080,7 +1080,7 @@
             <w:noProof/>
             <w:webHidden/>
           </w:rPr>
-          <w:instrText xml:space="preserve"> PAGEREF _Toc242824024 \h </w:instrText>
+          <w:instrText xml:space="preserve"> PAGEREF _Toc242827610 \h </w:instrText>
         </w:r>
         <w:r>
           <w:rPr>
@@ -1127,7 +1127,7 @@
           <w14:ligatures w14:val="standardContextual"/>
         </w:rPr>
       </w:pPr>
-      <w:hyperlink w:anchor="_Toc242824025" w:history="1">
+      <w:hyperlink w:anchor="_Toc242827611" w:history="1">
         <w:r>
           <w:rPr>
             <w:rStyle w:val="Hyperlink"/>
@@ -1154,7 +1154,7 @@
             <w:noProof/>
             <w:webHidden/>
           </w:rPr>
-          <w:instrText xml:space="preserve"> PAGEREF _Toc242824025 \h </w:instrText>
+          <w:instrText xml:space="preserve"> PAGEREF _Toc242827611 \h </w:instrText>
         </w:r>
         <w:r>
           <w:rPr>
@@ -1202,7 +1202,7 @@
           <w14:ligatures w14:val="standardContextual"/>
         </w:rPr>
       </w:pPr>
-      <w:hyperlink w:anchor="_Toc242824026" w:history="1">
+      <w:hyperlink w:anchor="_Toc242827612" w:history="1">
         <w:r>
           <w:rPr>
             <w:rStyle w:val="Hyperlink"/>
@@ -1229,7 +1229,7 @@
             <w:noProof/>
             <w:webHidden/>
           </w:rPr>
-          <w:instrText xml:space="preserve"> PAGEREF _Toc242824026 \h </w:instrText>
+          <w:instrText xml:space="preserve"> PAGEREF _Toc242827612 \h </w:instrText>
         </w:r>
         <w:r>
           <w:rPr>
@@ -1276,7 +1276,7 @@
           <w14:ligatures w14:val="standardContextual"/>
         </w:rPr>
       </w:pPr>
-      <w:hyperlink w:anchor="_Toc242824027" w:history="1">
+      <w:hyperlink w:anchor="_Toc242827613" w:history="1">
         <w:r>
           <w:rPr>
             <w:rStyle w:val="Hyperlink"/>
@@ -1303,7 +1303,7 @@
             <w:noProof/>
             <w:webHidden/>
           </w:rPr>
-          <w:instrText xml:space="preserve"> PAGEREF _Toc242824027 \h </w:instrText>
+          <w:instrText xml:space="preserve"> PAGEREF _Toc242827613 \h </w:instrText>
         </w:r>
         <w:r>
           <w:rPr>
@@ -1350,7 +1350,7 @@
           <w14:ligatures w14:val="standardContextual"/>
         </w:rPr>
       </w:pPr>
-      <w:hyperlink w:anchor="_Toc242824028" w:history="1">
+      <w:hyperlink w:anchor="_Toc242827614" w:history="1">
         <w:r>
           <w:rPr>
             <w:rStyle w:val="Hyperlink"/>
@@ -1377,7 +1377,7 @@
             <w:noProof/>
             <w:webHidden/>
           </w:rPr>
-          <w:instrText xml:space="preserve"> PAGEREF _Toc242824028 \h </w:instrText>
+          <w:instrText xml:space="preserve"> PAGEREF _Toc242827614 \h </w:instrText>
         </w:r>
         <w:r>
           <w:rPr>
@@ -1424,7 +1424,7 @@
           <w14:ligatures w14:val="standardContextual"/>
         </w:rPr>
       </w:pPr>
-      <w:hyperlink w:anchor="_Toc242824029" w:history="1">
+      <w:hyperlink w:anchor="_Toc242827615" w:history="1">
         <w:r>
           <w:rPr>
             <w:rStyle w:val="Hyperlink"/>
@@ -1451,7 +1451,7 @@
             <w:noProof/>
             <w:webHidden/>
           </w:rPr>
-          <w:instrText xml:space="preserve"> PAGEREF _Toc242824029 \h </w:instrText>
+          <w:instrText xml:space="preserve"> PAGEREF _Toc242827615 \h </w:instrText>
         </w:r>
         <w:r>
           <w:rPr>
@@ -1498,7 +1498,7 @@
           <w14:ligatures w14:val="standardContextual"/>
         </w:rPr>
       </w:pPr>
-      <w:hyperlink w:anchor="_Toc242824030" w:history="1">
+      <w:hyperlink w:anchor="_Toc242827616" w:history="1">
         <w:r>
           <w:rPr>
             <w:rStyle w:val="Hyperlink"/>
@@ -1525,7 +1525,7 @@
             <w:noProof/>
             <w:webHidden/>
           </w:rPr>
-          <w:instrText xml:space="preserve"> PAGEREF _Toc242824030 \h </w:instrText>
+          <w:instrText xml:space="preserve"> PAGEREF _Toc242827616 \h </w:instrText>
         </w:r>
         <w:r>
           <w:rPr>
@@ -1572,7 +1572,7 @@
           <w14:ligatures w14:val="standardContextual"/>
         </w:rPr>
       </w:pPr>
-      <w:hyperlink w:anchor="_Toc242824031" w:history="1">
+      <w:hyperlink w:anchor="_Toc242827617" w:history="1">
         <w:r>
           <w:rPr>
             <w:rStyle w:val="Hyperlink"/>
@@ -1599,7 +1599,7 @@
             <w:noProof/>
             <w:webHidden/>
           </w:rPr>
-          <w:instrText xml:space="preserve"> PAGEREF _Toc242824031 \h </w:instrText>
+          <w:instrText xml:space="preserve"> PAGEREF _Toc242827617 \h </w:instrText>
         </w:r>
         <w:r>
           <w:rPr>
@@ -1646,7 +1646,7 @@
           <w14:ligatures w14:val="standardContextual"/>
         </w:rPr>
       </w:pPr>
-      <w:hyperlink w:anchor="_Toc242824032" w:history="1">
+      <w:hyperlink w:anchor="_Toc242827618" w:history="1">
         <w:r>
           <w:rPr>
             <w:rStyle w:val="Hyperlink"/>
@@ -1673,7 +1673,7 @@
             <w:noProof/>
             <w:webHidden/>
           </w:rPr>
-          <w:instrText xml:space="preserve"> PAGEREF _Toc242824032 \h </w:instrText>
+          <w:instrText xml:space="preserve"> PAGEREF _Toc242827618 \h </w:instrText>
         </w:r>
         <w:r>
           <w:rPr>
@@ -1720,7 +1720,7 @@
           <w14:ligatures w14:val="standardContextual"/>
         </w:rPr>
       </w:pPr>
-      <w:hyperlink w:anchor="_Toc242824033" w:history="1">
+      <w:hyperlink w:anchor="_Toc242827619" w:history="1">
         <w:r>
           <w:rPr>
             <w:rStyle w:val="Hyperlink"/>
@@ -1747,7 +1747,7 @@
             <w:noProof/>
             <w:webHidden/>
           </w:rPr>
-          <w:instrText xml:space="preserve"> PAGEREF _Toc242824033 \h </w:instrText>
+          <w:instrText xml:space="preserve"> PAGEREF _Toc242827619 \h </w:instrText>
         </w:r>
         <w:r>
           <w:rPr>
@@ -1795,7 +1795,7 @@
           <w14:ligatures w14:val="standardContextual"/>
         </w:rPr>
       </w:pPr>
-      <w:hyperlink w:anchor="_Toc242824034" w:history="1">
+      <w:hyperlink w:anchor="_Toc242827620" w:history="1">
         <w:r>
           <w:rPr>
             <w:rStyle w:val="Hyperlink"/>
@@ -1822,7 +1822,7 @@
             <w:noProof/>
             <w:webHidden/>
           </w:rPr>
-          <w:instrText xml:space="preserve"> PAGEREF _Toc242824034 \h </w:instrText>
+          <w:instrText xml:space="preserve"> PAGEREF _Toc242827620 \h </w:instrText>
         </w:r>
         <w:r>
           <w:rPr>
@@ -1869,7 +1869,7 @@
           <w14:ligatures w14:val="standardContextual"/>
         </w:rPr>
       </w:pPr>
-      <w:hyperlink w:anchor="_Toc242824035" w:history="1">
+      <w:hyperlink w:anchor="_Toc242827621" w:history="1">
         <w:r>
           <w:rPr>
             <w:rStyle w:val="Hyperlink"/>
@@ -1896,7 +1896,7 @@
             <w:noProof/>
             <w:webHidden/>
           </w:rPr>
-          <w:instrText xml:space="preserve"> PAGEREF _Toc242824035 \h </w:instrText>
+          <w:instrText xml:space="preserve"> PAGEREF _Toc242827621 \h </w:instrText>
         </w:r>
         <w:r>
           <w:rPr>
@@ -1943,7 +1943,7 @@
           <w14:ligatures w14:val="standardContextual"/>
         </w:rPr>
       </w:pPr>
-      <w:hyperlink w:anchor="_Toc242824036" w:history="1">
+      <w:hyperlink w:anchor="_Toc242827622" w:history="1">
         <w:r>
           <w:rPr>
             <w:rStyle w:val="Hyperlink"/>
@@ -1970,7 +1970,7 @@
             <w:noProof/>
             <w:webHidden/>
           </w:rPr>
-          <w:instrText xml:space="preserve"> PAGEREF _Toc242824036 \h </w:instrText>
+          <w:instrText xml:space="preserve"> PAGEREF _Toc242827622 \h </w:instrText>
         </w:r>
         <w:r>
           <w:rPr>
@@ -2017,7 +2017,7 @@
           <w14:ligatures w14:val="standardContextual"/>
         </w:rPr>
       </w:pPr>
-      <w:hyperlink w:anchor="_Toc242824037" w:history="1">
+      <w:hyperlink w:anchor="_Toc242827623" w:history="1">
         <w:r>
           <w:rPr>
             <w:rStyle w:val="Hyperlink"/>
@@ -2044,7 +2044,7 @@
             <w:noProof/>
             <w:webHidden/>
           </w:rPr>
-          <w:instrText xml:space="preserve"> PAGEREF _Toc242824037 \h </w:instrText>
+          <w:instrText xml:space="preserve"> PAGEREF _Toc242827623 \h </w:instrText>
         </w:r>
         <w:r>
           <w:rPr>
@@ -2091,7 +2091,7 @@
           <w14:ligatures w14:val="standardContextual"/>
         </w:rPr>
       </w:pPr>
-      <w:hyperlink w:anchor="_Toc242824038" w:history="1">
+      <w:hyperlink w:anchor="_Toc242827624" w:history="1">
         <w:r>
           <w:rPr>
             <w:rStyle w:val="Hyperlink"/>
@@ -2118,7 +2118,7 @@
             <w:noProof/>
             <w:webHidden/>
           </w:rPr>
-          <w:instrText xml:space="preserve"> PAGEREF _Toc242824038 \h </w:instrText>
+          <w:instrText xml:space="preserve"> PAGEREF _Toc242827624 \h </w:instrText>
         </w:r>
         <w:r>
           <w:rPr>
@@ -2165,7 +2165,7 @@
           <w14:ligatures w14:val="standardContextual"/>
         </w:rPr>
       </w:pPr>
-      <w:hyperlink w:anchor="_Toc242824039" w:history="1">
+      <w:hyperlink w:anchor="_Toc242827625" w:history="1">
         <w:r>
           <w:rPr>
             <w:rStyle w:val="Hyperlink"/>
@@ -2192,7 +2192,7 @@
             <w:noProof/>
             <w:webHidden/>
           </w:rPr>
-          <w:instrText xml:space="preserve"> PAGEREF _Toc242824039 \h </w:instrText>
+          <w:instrText xml:space="preserve"> PAGEREF _Toc242827625 \h </w:instrText>
         </w:r>
         <w:r>
           <w:rPr>
@@ -2239,7 +2239,7 @@
           <w14:ligatures w14:val="standardContextual"/>
         </w:rPr>
       </w:pPr>
-      <w:hyperlink w:anchor="_Toc242824040" w:history="1">
+      <w:hyperlink w:anchor="_Toc242827626" w:history="1">
         <w:r>
           <w:rPr>
             <w:rStyle w:val="Hyperlink"/>
@@ -2266,7 +2266,7 @@
             <w:noProof/>
             <w:webHidden/>
           </w:rPr>
-          <w:instrText xml:space="preserve"> PAGEREF _Toc242824040 \h </w:instrText>
+          <w:instrText xml:space="preserve"> PAGEREF _Toc242827626 \h </w:instrText>
         </w:r>
         <w:r>
           <w:rPr>
@@ -2314,7 +2314,7 @@
           <w14:ligatures w14:val="standardContextual"/>
         </w:rPr>
       </w:pPr>
-      <w:hyperlink w:anchor="_Toc242824041" w:history="1">
+      <w:hyperlink w:anchor="_Toc242827627" w:history="1">
         <w:r>
           <w:rPr>
             <w:rStyle w:val="Hyperlink"/>
@@ -2341,7 +2341,7 @@
             <w:noProof/>
             <w:webHidden/>
           </w:rPr>
-          <w:instrText xml:space="preserve"> PAGEREF _Toc242824041 \h </w:instrText>
+          <w:instrText xml:space="preserve"> PAGEREF _Toc242827627 \h </w:instrText>
         </w:r>
         <w:r>
           <w:rPr>
@@ -2388,7 +2388,7 @@
           <w14:ligatures w14:val="standardContextual"/>
         </w:rPr>
       </w:pPr>
-      <w:hyperlink w:anchor="_Toc242824042" w:history="1">
+      <w:hyperlink w:anchor="_Toc242827628" w:history="1">
         <w:r>
           <w:rPr>
             <w:rStyle w:val="Hyperlink"/>
@@ -2415,7 +2415,7 @@
             <w:noProof/>
             <w:webHidden/>
           </w:rPr>
-          <w:instrText xml:space="preserve"> PAGEREF _Toc242824042 \h </w:instrText>
+          <w:instrText xml:space="preserve"> PAGEREF _Toc242827628 \h </w:instrText>
         </w:r>
         <w:r>
           <w:rPr>
@@ -2462,7 +2462,7 @@
           <w14:ligatures w14:val="standardContextual"/>
         </w:rPr>
       </w:pPr>
-      <w:hyperlink w:anchor="_Toc242824043" w:history="1">
+      <w:hyperlink w:anchor="_Toc242827629" w:history="1">
         <w:r>
           <w:rPr>
             <w:rStyle w:val="Hyperlink"/>
@@ -2489,7 +2489,7 @@
             <w:noProof/>
             <w:webHidden/>
           </w:rPr>
-          <w:instrText xml:space="preserve"> PAGEREF _Toc242824043 \h </w:instrText>
+          <w:instrText xml:space="preserve"> PAGEREF _Toc242827629 \h </w:instrText>
         </w:r>
         <w:r>
           <w:rPr>
@@ -2536,7 +2536,7 @@
           <w14:ligatures w14:val="standardContextual"/>
         </w:rPr>
       </w:pPr>
-      <w:hyperlink w:anchor="_Toc242824044" w:history="1">
+      <w:hyperlink w:anchor="_Toc242827630" w:history="1">
         <w:r>
           <w:rPr>
             <w:rStyle w:val="Hyperlink"/>
@@ -2563,7 +2563,7 @@
             <w:noProof/>
             <w:webHidden/>
           </w:rPr>
-          <w:instrText xml:space="preserve"> PAGEREF _Toc242824044 \h </w:instrText>
+          <w:instrText xml:space="preserve"> PAGEREF _Toc242827630 \h </w:instrText>
         </w:r>
         <w:r>
           <w:rPr>
@@ -2620,7 +2620,7 @@
         <w:jc w:val="left"/>
       </w:pPr>
       <w:bookmarkStart w:id="0" w:name="_Toc242299335"/>
-      <w:bookmarkStart w:id="1" w:name="_Toc242824017"/>
+      <w:bookmarkStart w:id="1" w:name="_Toc242827603"/>
       <w:r>
         <w:lastRenderedPageBreak/>
         <w:t>Chương 1 Tổng quan đề tài và yêu cầu học phần</w:t>
@@ -2633,7 +2633,7 @@
         <w:pStyle w:val="Heading2"/>
       </w:pPr>
       <w:bookmarkStart w:id="2" w:name="_Toc242299336"/>
-      <w:bookmarkStart w:id="3" w:name="_Toc242824018"/>
+      <w:bookmarkStart w:id="3" w:name="_Toc242827604"/>
       <w:r>
         <w:t>1.1 Bối cảnh, mục tiêu và phạm vi</w:t>
       </w:r>
@@ -2706,7 +2706,7 @@
         <w:pStyle w:val="Heading2"/>
       </w:pPr>
       <w:bookmarkStart w:id="4" w:name="_Toc242299337"/>
-      <w:bookmarkStart w:id="5" w:name="_Toc242824019"/>
+      <w:bookmarkStart w:id="5" w:name="_Toc242827605"/>
       <w:r>
         <w:t>1.2 Yêu cầu chức năng và kết quả triển khai</w:t>
       </w:r>
@@ -3304,7 +3304,7 @@
         <w:pStyle w:val="Heading2"/>
       </w:pPr>
       <w:bookmarkStart w:id="6" w:name="_Toc242299338"/>
-      <w:bookmarkStart w:id="7" w:name="_Toc242824020"/>
+      <w:bookmarkStart w:id="7" w:name="_Toc242827606"/>
       <w:r>
         <w:lastRenderedPageBreak/>
         <w:t>1.3 Kiến trúc tổng thể</w:t>
@@ -3323,7 +3323,7 @@
           <w:noProof/>
         </w:rPr>
         <w:drawing>
-          <wp:inline distT="0" distB="0" distL="0" distR="0" wp14:anchorId="5F487AFD" wp14:editId="7AA32674">
+          <wp:inline distT="0" distB="0" distL="0" distR="0" wp14:anchorId="0B6F9988" wp14:editId="5361BE30">
             <wp:extent cx="6126480" cy="4778654"/>
             <wp:effectExtent l="0" t="0" r="0" b="0"/>
             <wp:docPr id="7" name="Picture 7"/>
@@ -3384,7 +3384,7 @@
         <w:pageBreakBefore/>
       </w:pPr>
       <w:bookmarkStart w:id="8" w:name="_Toc242299339"/>
-      <w:bookmarkStart w:id="9" w:name="_Toc242824021"/>
+      <w:bookmarkStart w:id="9" w:name="_Toc242827607"/>
       <w:r>
         <w:lastRenderedPageBreak/>
         <w:t>1.4 Nguồn số liệu và mốc đo</w:t>
@@ -4263,7 +4263,7 @@
         <w:jc w:val="left"/>
       </w:pPr>
       <w:bookmarkStart w:id="10" w:name="_Toc242299340"/>
-      <w:bookmarkStart w:id="11" w:name="_Toc242824022"/>
+      <w:bookmarkStart w:id="11" w:name="_Toc242827608"/>
       <w:r>
         <w:lastRenderedPageBreak/>
         <w:t>Chương 2 Báo cáo tiến độ Tuần 1</w:t>
@@ -4285,7 +4285,7 @@
         <w:pStyle w:val="Heading2"/>
       </w:pPr>
       <w:bookmarkStart w:id="12" w:name="_Toc242299341"/>
-      <w:bookmarkStart w:id="13" w:name="_Toc242824023"/>
+      <w:bookmarkStart w:id="13" w:name="_Toc242827609"/>
       <w:r>
         <w:t>2.1 Mục tiêu và phân công thực hiện</w:t>
       </w:r>
@@ -4321,9 +4321,10 @@
         <w:tblLook w:val="04A0" w:firstRow="1" w:lastRow="0" w:firstColumn="1" w:lastColumn="0" w:noHBand="0" w:noVBand="1"/>
       </w:tblPr>
       <w:tblGrid>
-        <w:gridCol w:w="2232"/>
-        <w:gridCol w:w="4392"/>
-        <w:gridCol w:w="3312"/>
+        <w:gridCol w:w="2376"/>
+        <w:gridCol w:w="3672"/>
+        <w:gridCol w:w="3024"/>
+        <w:gridCol w:w="864"/>
       </w:tblGrid>
       <w:tr>
         <w:trPr>
@@ -4333,7 +4334,7 @@
         </w:trPr>
         <w:tc>
           <w:tcPr>
-            <w:tcW w:w="2232" w:type="dxa"/>
+            <w:tcW w:w="2376" w:type="dxa"/>
             <w:shd w:val="clear" w:color="auto" w:fill="E7E7E7"/>
             <w:vAlign w:val="center"/>
           </w:tcPr>
@@ -4354,7 +4355,7 @@
         </w:tc>
         <w:tc>
           <w:tcPr>
-            <w:tcW w:w="4392" w:type="dxa"/>
+            <w:tcW w:w="3672" w:type="dxa"/>
             <w:shd w:val="clear" w:color="auto" w:fill="E7E7E7"/>
             <w:vAlign w:val="center"/>
           </w:tcPr>
@@ -4375,7 +4376,7 @@
         </w:tc>
         <w:tc>
           <w:tcPr>
-            <w:tcW w:w="3312" w:type="dxa"/>
+            <w:tcW w:w="3024" w:type="dxa"/>
             <w:shd w:val="clear" w:color="auto" w:fill="E7E7E7"/>
             <w:vAlign w:val="center"/>
           </w:tcPr>
@@ -4391,6 +4392,27 @@
                 <w:sz w:val="22"/>
               </w:rPr>
               <w:t>Phần phối hợp</w:t>
+            </w:r>
+          </w:p>
+        </w:tc>
+        <w:tc>
+          <w:tcPr>
+            <w:tcW w:w="864" w:type="dxa"/>
+            <w:shd w:val="clear" w:color="auto" w:fill="E7E7E7"/>
+            <w:vAlign w:val="center"/>
+          </w:tcPr>
+          <w:p>
+            <w:pPr>
+              <w:keepNext/>
+              <w:spacing w:before="60" w:after="60" w:line="264" w:lineRule="auto"/>
+              <w:jc w:val="center"/>
+            </w:pPr>
+            <w:r>
+              <w:rPr>
+                <w:b/>
+                <w:sz w:val="22"/>
+              </w:rPr>
+              <w:t>Giờ</w:t>
             </w:r>
           </w:p>
         </w:tc>
@@ -4402,7 +4424,7 @@
         </w:trPr>
         <w:tc>
           <w:tcPr>
-            <w:tcW w:w="2232" w:type="dxa"/>
+            <w:tcW w:w="2376" w:type="dxa"/>
             <w:shd w:val="clear" w:color="auto" w:fill="FFFFFF"/>
             <w:vAlign w:val="center"/>
           </w:tcPr>
@@ -4428,7 +4450,7 @@
         </w:tc>
         <w:tc>
           <w:tcPr>
-            <w:tcW w:w="4392" w:type="dxa"/>
+            <w:tcW w:w="3672" w:type="dxa"/>
             <w:shd w:val="clear" w:color="auto" w:fill="FFFFFF"/>
             <w:vAlign w:val="center"/>
           </w:tcPr>
@@ -4447,7 +4469,7 @@
         </w:tc>
         <w:tc>
           <w:tcPr>
-            <w:tcW w:w="3312" w:type="dxa"/>
+            <w:tcW w:w="3024" w:type="dxa"/>
             <w:shd w:val="clear" w:color="auto" w:fill="FFFFFF"/>
             <w:vAlign w:val="center"/>
           </w:tcPr>
@@ -4461,6 +4483,25 @@
                 <w:sz w:val="22"/>
               </w:rPr>
               <w:t>Kiến trúc, tích hợp và báo cáo.</w:t>
+            </w:r>
+          </w:p>
+        </w:tc>
+        <w:tc>
+          <w:tcPr>
+            <w:tcW w:w="864" w:type="dxa"/>
+            <w:shd w:val="clear" w:color="auto" w:fill="FFFFFF"/>
+            <w:vAlign w:val="center"/>
+          </w:tcPr>
+          <w:p>
+            <w:pPr>
+              <w:keepNext/>
+              <w:spacing w:before="60" w:after="60" w:line="264" w:lineRule="auto"/>
+            </w:pPr>
+            <w:r>
+              <w:rPr>
+                <w:sz w:val="22"/>
+              </w:rPr>
+              <w:t>9,5</w:t>
             </w:r>
           </w:p>
         </w:tc>
@@ -4472,7 +4513,7 @@
         </w:trPr>
         <w:tc>
           <w:tcPr>
-            <w:tcW w:w="2232" w:type="dxa"/>
+            <w:tcW w:w="2376" w:type="dxa"/>
             <w:shd w:val="clear" w:color="auto" w:fill="FFFFFF"/>
             <w:vAlign w:val="center"/>
           </w:tcPr>
@@ -4497,7 +4538,7 @@
         </w:tc>
         <w:tc>
           <w:tcPr>
-            <w:tcW w:w="4392" w:type="dxa"/>
+            <w:tcW w:w="3672" w:type="dxa"/>
             <w:shd w:val="clear" w:color="auto" w:fill="FFFFFF"/>
             <w:vAlign w:val="center"/>
           </w:tcPr>
@@ -4515,7 +4556,7 @@
         </w:tc>
         <w:tc>
           <w:tcPr>
-            <w:tcW w:w="3312" w:type="dxa"/>
+            <w:tcW w:w="3024" w:type="dxa"/>
             <w:shd w:val="clear" w:color="auto" w:fill="FFFFFF"/>
             <w:vAlign w:val="center"/>
           </w:tcPr>
@@ -4528,6 +4569,24 @@
                 <w:sz w:val="22"/>
               </w:rPr>
               <w:t>Kiến trúc, tích hợp và báo cáo.</w:t>
+            </w:r>
+          </w:p>
+        </w:tc>
+        <w:tc>
+          <w:tcPr>
+            <w:tcW w:w="864" w:type="dxa"/>
+            <w:shd w:val="clear" w:color="auto" w:fill="FFFFFF"/>
+            <w:vAlign w:val="center"/>
+          </w:tcPr>
+          <w:p>
+            <w:pPr>
+              <w:spacing w:before="60" w:after="60" w:line="264" w:lineRule="auto"/>
+            </w:pPr>
+            <w:r>
+              <w:rPr>
+                <w:sz w:val="22"/>
+              </w:rPr>
+              <w:t>9,0</w:t>
             </w:r>
           </w:p>
         </w:tc>
@@ -4544,7 +4603,7 @@
         <w:ind w:firstLine="504"/>
       </w:pPr>
       <w:r>
-        <w:t>Hai thành viên cùng thiết kế kiến trúc, tích hợp các dịch vụ và rà soát báo cáo. Mỗi thành viên phụ trách một nhóm chức năng và cùng đối chiếu số liệu với kết quả truy vấn Athena.</w:t>
+        <w:t>Hai thành viên cùng thiết kế kiến trúc, tích hợp các dịch vụ và rà soát báo cáo. Theo nhật ký nhóm xác nhận, Nguyễn Tiến Sơn thực hiện 9,5 giờ và Trần Thị Ngọc Quyên thực hiện 9,0 giờ trong Tuần 1, tổng cộng 18,5 giờ. Phần việc chính được trình bày tại Bảng 2.1.</w:t>
       </w:r>
     </w:p>
     <w:p>
@@ -4552,7 +4611,7 @@
         <w:pStyle w:val="Heading2"/>
       </w:pPr>
       <w:bookmarkStart w:id="14" w:name="_Toc242299342"/>
-      <w:bookmarkStart w:id="15" w:name="_Toc242824024"/>
+      <w:bookmarkStart w:id="15" w:name="_Toc242827610"/>
       <w:r>
         <w:t>2.2 Phạm vi và luồng dữ liệu đo</w:t>
       </w:r>
@@ -5004,7 +5063,6 @@
         <w:ind w:firstLine="504"/>
       </w:pPr>
       <w:r>
-        <w:lastRenderedPageBreak/>
         <w:t>Tập dữ liệu xuất trong Tuần 1 có 156 dòng: 52 dòng cho mỗi đô thị và lần lượt 72, 72, 12 dòng ở ba phân vùng UTC. Các phép tổng hợp theo đô thị, giờ và cấp AQI đều cộng về 156. Phân tích tương quan sử dụng cùng tập dữ liệu này theo từng đô thị.</w:t>
       </w:r>
     </w:p>
@@ -5013,7 +5071,7 @@
         <w:pStyle w:val="Heading2"/>
       </w:pPr>
       <w:bookmarkStart w:id="16" w:name="_Toc242299343"/>
-      <w:bookmarkStart w:id="17" w:name="_Toc242824025"/>
+      <w:bookmarkStart w:id="17" w:name="_Toc242827611"/>
       <w:r>
         <w:t>2.3 Kết quả định lượng</w:t>
       </w:r>
@@ -5544,7 +5602,7 @@
         <w:jc w:val="left"/>
       </w:pPr>
       <w:bookmarkStart w:id="18" w:name="_Toc242299344"/>
-      <w:bookmarkStart w:id="19" w:name="_Toc242824026"/>
+      <w:bookmarkStart w:id="19" w:name="_Toc242827612"/>
       <w:r>
         <w:lastRenderedPageBreak/>
         <w:t>Chương 3 Thiết kế và triển khai trên AWS Learner Lab</w:t>
@@ -5557,7 +5615,7 @@
         <w:pStyle w:val="Heading2"/>
       </w:pPr>
       <w:bookmarkStart w:id="20" w:name="_Toc242299345"/>
-      <w:bookmarkStart w:id="21" w:name="_Toc242824027"/>
+      <w:bookmarkStart w:id="21" w:name="_Toc242827613"/>
       <w:r>
         <w:t>3.1 Danh mục dịch vụ và cấu hình thực tế</w:t>
       </w:r>
@@ -6311,7 +6369,7 @@
         <w:pStyle w:val="Heading2"/>
       </w:pPr>
       <w:bookmarkStart w:id="22" w:name="_Toc242299346"/>
-      <w:bookmarkStart w:id="23" w:name="_Toc242824028"/>
+      <w:bookmarkStart w:id="23" w:name="_Toc242827614"/>
       <w:r>
         <w:t>3.2 Dữ liệu và phân vùng S3</w:t>
       </w:r>
@@ -6395,7 +6453,7 @@
         <w:pStyle w:val="Heading2"/>
       </w:pPr>
       <w:bookmarkStart w:id="24" w:name="_Toc242299347"/>
-      <w:bookmarkStart w:id="25" w:name="_Toc242824029"/>
+      <w:bookmarkStart w:id="25" w:name="_Toc242827615"/>
       <w:r>
         <w:t>3.3 An toàn cấu hình và vận hành</w:t>
       </w:r>
@@ -6416,7 +6474,7 @@
         <w:pStyle w:val="Heading2"/>
       </w:pPr>
       <w:bookmarkStart w:id="26" w:name="_Toc242299348"/>
-      <w:bookmarkStart w:id="27" w:name="_Toc242824030"/>
+      <w:bookmarkStart w:id="27" w:name="_Toc242827616"/>
       <w:r>
         <w:lastRenderedPageBreak/>
         <w:t>3.4 Trình tự xử lý của Lambda</w:t>
@@ -6456,7 +6514,7 @@
         <w:pStyle w:val="Heading2"/>
       </w:pPr>
       <w:bookmarkStart w:id="28" w:name="_Toc242299349"/>
-      <w:bookmarkStart w:id="29" w:name="_Toc242824031"/>
+      <w:bookmarkStart w:id="29" w:name="_Toc242827617"/>
       <w:r>
         <w:t>3.5 Truy vấn Athena và khả năng tái lập</w:t>
       </w:r>
@@ -6718,7 +6776,7 @@
         <w:pStyle w:val="Heading2"/>
       </w:pPr>
       <w:bookmarkStart w:id="30" w:name="_Toc242299350"/>
-      <w:bookmarkStart w:id="31" w:name="_Toc242824032"/>
+      <w:bookmarkStart w:id="31" w:name="_Toc242827618"/>
       <w:r>
         <w:t>3.6 Lược đồ bản ghi và chất lượng dữ liệu</w:t>
       </w:r>
@@ -7412,7 +7470,7 @@
         <w:pStyle w:val="Heading2"/>
       </w:pPr>
       <w:bookmarkStart w:id="32" w:name="_Toc242299351"/>
-      <w:bookmarkStart w:id="33" w:name="_Toc242824033"/>
+      <w:bookmarkStart w:id="33" w:name="_Toc242827619"/>
       <w:r>
         <w:lastRenderedPageBreak/>
         <w:t>3.7 Tần suất gọi Open-Meteo và yêu cầu khóa API</w:t>
@@ -7445,7 +7503,7 @@
         <w:jc w:val="left"/>
       </w:pPr>
       <w:bookmarkStart w:id="34" w:name="_Toc242299352"/>
-      <w:bookmarkStart w:id="35" w:name="_Toc242824034"/>
+      <w:bookmarkStart w:id="35" w:name="_Toc242827620"/>
       <w:r>
         <w:lastRenderedPageBreak/>
         <w:t>Chương 4 Kết quả kiểm tra và phân tích dữ liệu</w:t>
@@ -7458,7 +7516,7 @@
         <w:pStyle w:val="Heading2"/>
       </w:pPr>
       <w:bookmarkStart w:id="36" w:name="_Toc242299353"/>
-      <w:bookmarkStart w:id="37" w:name="_Toc242824035"/>
+      <w:bookmarkStart w:id="37" w:name="_Toc242827621"/>
       <w:r>
         <w:t>4.1 Mốc dữ liệu và số đo vận hành AWS</w:t>
       </w:r>
@@ -8150,7 +8208,7 @@
         <w:pageBreakBefore/>
       </w:pPr>
       <w:bookmarkStart w:id="38" w:name="_Toc242299354"/>
-      <w:bookmarkStart w:id="39" w:name="_Toc242824036"/>
+      <w:bookmarkStart w:id="39" w:name="_Toc242827622"/>
       <w:r>
         <w:lastRenderedPageBreak/>
         <w:t>4.2 So sánh ba đô thị từ Athena</w:t>
@@ -9363,7 +9421,7 @@
         <w:pStyle w:val="Heading2"/>
       </w:pPr>
       <w:bookmarkStart w:id="40" w:name="_Toc242299355"/>
-      <w:bookmarkStart w:id="41" w:name="_Toc242824037"/>
+      <w:bookmarkStart w:id="41" w:name="_Toc242827623"/>
       <w:r>
         <w:t>4.3 Biến thiên theo 24 giờ UTC</w:t>
       </w:r>
@@ -12640,7 +12698,7 @@
         <w:pStyle w:val="Heading2"/>
       </w:pPr>
       <w:bookmarkStart w:id="42" w:name="_Toc242299356"/>
-      <w:bookmarkStart w:id="43" w:name="_Toc242824038"/>
+      <w:bookmarkStart w:id="43" w:name="_Toc242827624"/>
       <w:r>
         <w:t>4.4 Phân bố cấp chất lượng không khí</w:t>
       </w:r>
@@ -13281,7 +13339,7 @@
         <w:pStyle w:val="Heading2"/>
       </w:pPr>
       <w:bookmarkStart w:id="44" w:name="_Toc242299357"/>
-      <w:bookmarkStart w:id="45" w:name="_Toc242824039"/>
+      <w:bookmarkStart w:id="45" w:name="_Toc242827625"/>
       <w:r>
         <w:t>4.5 Tương quan PM2.5 với yếu tố khí tượng</w:t>
       </w:r>
@@ -13820,7 +13878,7 @@
         <w:pageBreakBefore/>
       </w:pPr>
       <w:bookmarkStart w:id="46" w:name="_Toc242299358"/>
-      <w:bookmarkStart w:id="47" w:name="_Toc242824040"/>
+      <w:bookmarkStart w:id="47" w:name="_Toc242827626"/>
       <w:r>
         <w:lastRenderedPageBreak/>
         <w:t>4.6 Thời gian và dung lượng quét của năm truy vấn</w:t>
@@ -14666,7 +14724,7 @@
         <w:jc w:val="left"/>
       </w:pPr>
       <w:bookmarkStart w:id="48" w:name="_Toc242299359"/>
-      <w:bookmarkStart w:id="49" w:name="_Toc242824041"/>
+      <w:bookmarkStart w:id="49" w:name="_Toc242827627"/>
       <w:r>
         <w:lastRenderedPageBreak/>
         <w:t>Chương 5 Tổng hợp kết quả và chi phí Tuần 1</w:t>
@@ -14679,7 +14737,7 @@
         <w:pStyle w:val="Heading2"/>
       </w:pPr>
       <w:bookmarkStart w:id="50" w:name="_Toc242299360"/>
-      <w:bookmarkStart w:id="51" w:name="_Toc242824042"/>
+      <w:bookmarkStart w:id="51" w:name="_Toc242827628"/>
       <w:r>
         <w:t>5.1 Mức độ hoàn thành theo sản phẩm</w:t>
       </w:r>
@@ -14700,7 +14758,7 @@
         <w:pStyle w:val="Heading2"/>
       </w:pPr>
       <w:bookmarkStart w:id="52" w:name="_Toc242299361"/>
-      <w:bookmarkStart w:id="53" w:name="_Toc242824043"/>
+      <w:bookmarkStart w:id="53" w:name="_Toc242827629"/>
       <w:r>
         <w:t>5.2 Quản lý chi phí</w:t>
       </w:r>
@@ -15238,7 +15296,7 @@
         <w:pStyle w:val="Heading2"/>
       </w:pPr>
       <w:bookmarkStart w:id="54" w:name="_Toc242299362"/>
-      <w:bookmarkStart w:id="55" w:name="_Toc242824044"/>
+      <w:bookmarkStart w:id="55" w:name="_Toc242827630"/>
       <w:r>
         <w:t>5.3 Kết luận</w:t>
       </w:r>
@@ -15533,9 +15591,9 @@
     </w:lvl>
   </w:abstractNum>
   <w:abstractNum w:abstractNumId="9" w15:restartNumberingAfterBreak="0">
-    <w:nsid w:val="04FF4E41"/>
+    <w:nsid w:val="349F03F1"/>
     <w:multiLevelType w:val="multilevel"/>
-    <w:tmpl w:val="8C481B76"/>
+    <w:tmpl w:val="B886A534"/>
     <w:lvl w:ilvl="0">
       <w:start w:val="1"/>
       <w:numFmt w:val="bullet"/>
@@ -15584,7 +15642,7 @@
       <w:lvlJc w:val="left"/>
     </w:lvl>
   </w:abstractNum>
-  <w:num w:numId="1" w16cid:durableId="2062702042">
+  <w:num w:numId="1" w16cid:durableId="1637759220">
     <w:abstractNumId w:val="9"/>
   </w:num>
 </w:numbering>

</xml_diff>

<commit_message>
fix(report): reconcile weekly snapshots and source provenance
</commit_message>
<xml_diff>
--- a/tuan_1/docs/Bao_cao_tuan_1_Dien_toan_dam_may_Nhom_05.docx
+++ b/tuan_1/docs/Bao_cao_tuan_1_Dien_toan_dam_may_Nhom_05.docx
@@ -534,7 +534,7 @@
         </w:rPr>
         <w:fldChar w:fldCharType="separate"/>
       </w:r>
-      <w:hyperlink w:anchor="_Toc242827603" w:history="1">
+      <w:hyperlink w:anchor="_Toc242871456" w:history="1">
         <w:r>
           <w:rPr>
             <w:rStyle w:val="Hyperlink"/>
@@ -561,7 +561,7 @@
             <w:noProof/>
             <w:webHidden/>
           </w:rPr>
-          <w:instrText xml:space="preserve"> PAGEREF _Toc242827603 \h </w:instrText>
+          <w:instrText xml:space="preserve"> PAGEREF _Toc242871456 \h </w:instrText>
         </w:r>
         <w:r>
           <w:rPr>
@@ -608,7 +608,7 @@
           <w14:ligatures w14:val="standardContextual"/>
         </w:rPr>
       </w:pPr>
-      <w:hyperlink w:anchor="_Toc242827604" w:history="1">
+      <w:hyperlink w:anchor="_Toc242871457" w:history="1">
         <w:r>
           <w:rPr>
             <w:rStyle w:val="Hyperlink"/>
@@ -635,7 +635,7 @@
             <w:noProof/>
             <w:webHidden/>
           </w:rPr>
-          <w:instrText xml:space="preserve"> PAGEREF _Toc242827604 \h </w:instrText>
+          <w:instrText xml:space="preserve"> PAGEREF _Toc242871457 \h </w:instrText>
         </w:r>
         <w:r>
           <w:rPr>
@@ -682,7 +682,7 @@
           <w14:ligatures w14:val="standardContextual"/>
         </w:rPr>
       </w:pPr>
-      <w:hyperlink w:anchor="_Toc242827605" w:history="1">
+      <w:hyperlink w:anchor="_Toc242871458" w:history="1">
         <w:r>
           <w:rPr>
             <w:rStyle w:val="Hyperlink"/>
@@ -709,7 +709,7 @@
             <w:noProof/>
             <w:webHidden/>
           </w:rPr>
-          <w:instrText xml:space="preserve"> PAGEREF _Toc242827605 \h </w:instrText>
+          <w:instrText xml:space="preserve"> PAGEREF _Toc242871458 \h </w:instrText>
         </w:r>
         <w:r>
           <w:rPr>
@@ -756,7 +756,7 @@
           <w14:ligatures w14:val="standardContextual"/>
         </w:rPr>
       </w:pPr>
-      <w:hyperlink w:anchor="_Toc242827606" w:history="1">
+      <w:hyperlink w:anchor="_Toc242871459" w:history="1">
         <w:r>
           <w:rPr>
             <w:rStyle w:val="Hyperlink"/>
@@ -783,7 +783,7 @@
             <w:noProof/>
             <w:webHidden/>
           </w:rPr>
-          <w:instrText xml:space="preserve"> PAGEREF _Toc242827606 \h </w:instrText>
+          <w:instrText xml:space="preserve"> PAGEREF _Toc242871459 \h </w:instrText>
         </w:r>
         <w:r>
           <w:rPr>
@@ -830,7 +830,7 @@
           <w14:ligatures w14:val="standardContextual"/>
         </w:rPr>
       </w:pPr>
-      <w:hyperlink w:anchor="_Toc242827607" w:history="1">
+      <w:hyperlink w:anchor="_Toc242871460" w:history="1">
         <w:r>
           <w:rPr>
             <w:rStyle w:val="Hyperlink"/>
@@ -857,7 +857,7 @@
             <w:noProof/>
             <w:webHidden/>
           </w:rPr>
-          <w:instrText xml:space="preserve"> PAGEREF _Toc242827607 \h </w:instrText>
+          <w:instrText xml:space="preserve"> PAGEREF _Toc242871460 \h </w:instrText>
         </w:r>
         <w:r>
           <w:rPr>
@@ -905,7 +905,7 @@
           <w14:ligatures w14:val="standardContextual"/>
         </w:rPr>
       </w:pPr>
-      <w:hyperlink w:anchor="_Toc242827608" w:history="1">
+      <w:hyperlink w:anchor="_Toc242871461" w:history="1">
         <w:r>
           <w:rPr>
             <w:rStyle w:val="Hyperlink"/>
@@ -932,7 +932,7 @@
             <w:noProof/>
             <w:webHidden/>
           </w:rPr>
-          <w:instrText xml:space="preserve"> PAGEREF _Toc242827608 \h </w:instrText>
+          <w:instrText xml:space="preserve"> PAGEREF _Toc242871461 \h </w:instrText>
         </w:r>
         <w:r>
           <w:rPr>
@@ -979,7 +979,7 @@
           <w14:ligatures w14:val="standardContextual"/>
         </w:rPr>
       </w:pPr>
-      <w:hyperlink w:anchor="_Toc242827609" w:history="1">
+      <w:hyperlink w:anchor="_Toc242871462" w:history="1">
         <w:r>
           <w:rPr>
             <w:rStyle w:val="Hyperlink"/>
@@ -1006,7 +1006,7 @@
             <w:noProof/>
             <w:webHidden/>
           </w:rPr>
-          <w:instrText xml:space="preserve"> PAGEREF _Toc242827609 \h </w:instrText>
+          <w:instrText xml:space="preserve"> PAGEREF _Toc242871462 \h </w:instrText>
         </w:r>
         <w:r>
           <w:rPr>
@@ -1053,7 +1053,7 @@
           <w14:ligatures w14:val="standardContextual"/>
         </w:rPr>
       </w:pPr>
-      <w:hyperlink w:anchor="_Toc242827610" w:history="1">
+      <w:hyperlink w:anchor="_Toc242871463" w:history="1">
         <w:r>
           <w:rPr>
             <w:rStyle w:val="Hyperlink"/>
@@ -1080,7 +1080,7 @@
             <w:noProof/>
             <w:webHidden/>
           </w:rPr>
-          <w:instrText xml:space="preserve"> PAGEREF _Toc242827610 \h </w:instrText>
+          <w:instrText xml:space="preserve"> PAGEREF _Toc242871463 \h </w:instrText>
         </w:r>
         <w:r>
           <w:rPr>
@@ -1127,7 +1127,7 @@
           <w14:ligatures w14:val="standardContextual"/>
         </w:rPr>
       </w:pPr>
-      <w:hyperlink w:anchor="_Toc242827611" w:history="1">
+      <w:hyperlink w:anchor="_Toc242871464" w:history="1">
         <w:r>
           <w:rPr>
             <w:rStyle w:val="Hyperlink"/>
@@ -1154,7 +1154,7 @@
             <w:noProof/>
             <w:webHidden/>
           </w:rPr>
-          <w:instrText xml:space="preserve"> PAGEREF _Toc242827611 \h </w:instrText>
+          <w:instrText xml:space="preserve"> PAGEREF _Toc242871464 \h </w:instrText>
         </w:r>
         <w:r>
           <w:rPr>
@@ -1202,7 +1202,7 @@
           <w14:ligatures w14:val="standardContextual"/>
         </w:rPr>
       </w:pPr>
-      <w:hyperlink w:anchor="_Toc242827612" w:history="1">
+      <w:hyperlink w:anchor="_Toc242871465" w:history="1">
         <w:r>
           <w:rPr>
             <w:rStyle w:val="Hyperlink"/>
@@ -1229,7 +1229,7 @@
             <w:noProof/>
             <w:webHidden/>
           </w:rPr>
-          <w:instrText xml:space="preserve"> PAGEREF _Toc242827612 \h </w:instrText>
+          <w:instrText xml:space="preserve"> PAGEREF _Toc242871465 \h </w:instrText>
         </w:r>
         <w:r>
           <w:rPr>
@@ -1276,7 +1276,7 @@
           <w14:ligatures w14:val="standardContextual"/>
         </w:rPr>
       </w:pPr>
-      <w:hyperlink w:anchor="_Toc242827613" w:history="1">
+      <w:hyperlink w:anchor="_Toc242871466" w:history="1">
         <w:r>
           <w:rPr>
             <w:rStyle w:val="Hyperlink"/>
@@ -1303,7 +1303,7 @@
             <w:noProof/>
             <w:webHidden/>
           </w:rPr>
-          <w:instrText xml:space="preserve"> PAGEREF _Toc242827613 \h </w:instrText>
+          <w:instrText xml:space="preserve"> PAGEREF _Toc242871466 \h </w:instrText>
         </w:r>
         <w:r>
           <w:rPr>
@@ -1350,7 +1350,7 @@
           <w14:ligatures w14:val="standardContextual"/>
         </w:rPr>
       </w:pPr>
-      <w:hyperlink w:anchor="_Toc242827614" w:history="1">
+      <w:hyperlink w:anchor="_Toc242871467" w:history="1">
         <w:r>
           <w:rPr>
             <w:rStyle w:val="Hyperlink"/>
@@ -1377,7 +1377,7 @@
             <w:noProof/>
             <w:webHidden/>
           </w:rPr>
-          <w:instrText xml:space="preserve"> PAGEREF _Toc242827614 \h </w:instrText>
+          <w:instrText xml:space="preserve"> PAGEREF _Toc242871467 \h </w:instrText>
         </w:r>
         <w:r>
           <w:rPr>
@@ -1424,7 +1424,7 @@
           <w14:ligatures w14:val="standardContextual"/>
         </w:rPr>
       </w:pPr>
-      <w:hyperlink w:anchor="_Toc242827615" w:history="1">
+      <w:hyperlink w:anchor="_Toc242871468" w:history="1">
         <w:r>
           <w:rPr>
             <w:rStyle w:val="Hyperlink"/>
@@ -1451,7 +1451,7 @@
             <w:noProof/>
             <w:webHidden/>
           </w:rPr>
-          <w:instrText xml:space="preserve"> PAGEREF _Toc242827615 \h </w:instrText>
+          <w:instrText xml:space="preserve"> PAGEREF _Toc242871468 \h </w:instrText>
         </w:r>
         <w:r>
           <w:rPr>
@@ -1498,7 +1498,7 @@
           <w14:ligatures w14:val="standardContextual"/>
         </w:rPr>
       </w:pPr>
-      <w:hyperlink w:anchor="_Toc242827616" w:history="1">
+      <w:hyperlink w:anchor="_Toc242871469" w:history="1">
         <w:r>
           <w:rPr>
             <w:rStyle w:val="Hyperlink"/>
@@ -1525,7 +1525,7 @@
             <w:noProof/>
             <w:webHidden/>
           </w:rPr>
-          <w:instrText xml:space="preserve"> PAGEREF _Toc242827616 \h </w:instrText>
+          <w:instrText xml:space="preserve"> PAGEREF _Toc242871469 \h </w:instrText>
         </w:r>
         <w:r>
           <w:rPr>
@@ -1572,7 +1572,7 @@
           <w14:ligatures w14:val="standardContextual"/>
         </w:rPr>
       </w:pPr>
-      <w:hyperlink w:anchor="_Toc242827617" w:history="1">
+      <w:hyperlink w:anchor="_Toc242871470" w:history="1">
         <w:r>
           <w:rPr>
             <w:rStyle w:val="Hyperlink"/>
@@ -1599,7 +1599,7 @@
             <w:noProof/>
             <w:webHidden/>
           </w:rPr>
-          <w:instrText xml:space="preserve"> PAGEREF _Toc242827617 \h </w:instrText>
+          <w:instrText xml:space="preserve"> PAGEREF _Toc242871470 \h </w:instrText>
         </w:r>
         <w:r>
           <w:rPr>
@@ -1646,7 +1646,7 @@
           <w14:ligatures w14:val="standardContextual"/>
         </w:rPr>
       </w:pPr>
-      <w:hyperlink w:anchor="_Toc242827618" w:history="1">
+      <w:hyperlink w:anchor="_Toc242871471" w:history="1">
         <w:r>
           <w:rPr>
             <w:rStyle w:val="Hyperlink"/>
@@ -1673,7 +1673,7 @@
             <w:noProof/>
             <w:webHidden/>
           </w:rPr>
-          <w:instrText xml:space="preserve"> PAGEREF _Toc242827618 \h </w:instrText>
+          <w:instrText xml:space="preserve"> PAGEREF _Toc242871471 \h </w:instrText>
         </w:r>
         <w:r>
           <w:rPr>
@@ -1720,7 +1720,7 @@
           <w14:ligatures w14:val="standardContextual"/>
         </w:rPr>
       </w:pPr>
-      <w:hyperlink w:anchor="_Toc242827619" w:history="1">
+      <w:hyperlink w:anchor="_Toc242871472" w:history="1">
         <w:r>
           <w:rPr>
             <w:rStyle w:val="Hyperlink"/>
@@ -1747,7 +1747,7 @@
             <w:noProof/>
             <w:webHidden/>
           </w:rPr>
-          <w:instrText xml:space="preserve"> PAGEREF _Toc242827619 \h </w:instrText>
+          <w:instrText xml:space="preserve"> PAGEREF _Toc242871472 \h </w:instrText>
         </w:r>
         <w:r>
           <w:rPr>
@@ -1795,7 +1795,7 @@
           <w14:ligatures w14:val="standardContextual"/>
         </w:rPr>
       </w:pPr>
-      <w:hyperlink w:anchor="_Toc242827620" w:history="1">
+      <w:hyperlink w:anchor="_Toc242871473" w:history="1">
         <w:r>
           <w:rPr>
             <w:rStyle w:val="Hyperlink"/>
@@ -1822,7 +1822,7 @@
             <w:noProof/>
             <w:webHidden/>
           </w:rPr>
-          <w:instrText xml:space="preserve"> PAGEREF _Toc242827620 \h </w:instrText>
+          <w:instrText xml:space="preserve"> PAGEREF _Toc242871473 \h </w:instrText>
         </w:r>
         <w:r>
           <w:rPr>
@@ -1869,7 +1869,7 @@
           <w14:ligatures w14:val="standardContextual"/>
         </w:rPr>
       </w:pPr>
-      <w:hyperlink w:anchor="_Toc242827621" w:history="1">
+      <w:hyperlink w:anchor="_Toc242871474" w:history="1">
         <w:r>
           <w:rPr>
             <w:rStyle w:val="Hyperlink"/>
@@ -1896,7 +1896,7 @@
             <w:noProof/>
             <w:webHidden/>
           </w:rPr>
-          <w:instrText xml:space="preserve"> PAGEREF _Toc242827621 \h </w:instrText>
+          <w:instrText xml:space="preserve"> PAGEREF _Toc242871474 \h </w:instrText>
         </w:r>
         <w:r>
           <w:rPr>
@@ -1943,7 +1943,7 @@
           <w14:ligatures w14:val="standardContextual"/>
         </w:rPr>
       </w:pPr>
-      <w:hyperlink w:anchor="_Toc242827622" w:history="1">
+      <w:hyperlink w:anchor="_Toc242871475" w:history="1">
         <w:r>
           <w:rPr>
             <w:rStyle w:val="Hyperlink"/>
@@ -1970,7 +1970,7 @@
             <w:noProof/>
             <w:webHidden/>
           </w:rPr>
-          <w:instrText xml:space="preserve"> PAGEREF _Toc242827622 \h </w:instrText>
+          <w:instrText xml:space="preserve"> PAGEREF _Toc242871475 \h </w:instrText>
         </w:r>
         <w:r>
           <w:rPr>
@@ -2017,7 +2017,7 @@
           <w14:ligatures w14:val="standardContextual"/>
         </w:rPr>
       </w:pPr>
-      <w:hyperlink w:anchor="_Toc242827623" w:history="1">
+      <w:hyperlink w:anchor="_Toc242871476" w:history="1">
         <w:r>
           <w:rPr>
             <w:rStyle w:val="Hyperlink"/>
@@ -2044,7 +2044,7 @@
             <w:noProof/>
             <w:webHidden/>
           </w:rPr>
-          <w:instrText xml:space="preserve"> PAGEREF _Toc242827623 \h </w:instrText>
+          <w:instrText xml:space="preserve"> PAGEREF _Toc242871476 \h </w:instrText>
         </w:r>
         <w:r>
           <w:rPr>
@@ -2091,7 +2091,7 @@
           <w14:ligatures w14:val="standardContextual"/>
         </w:rPr>
       </w:pPr>
-      <w:hyperlink w:anchor="_Toc242827624" w:history="1">
+      <w:hyperlink w:anchor="_Toc242871477" w:history="1">
         <w:r>
           <w:rPr>
             <w:rStyle w:val="Hyperlink"/>
@@ -2118,7 +2118,7 @@
             <w:noProof/>
             <w:webHidden/>
           </w:rPr>
-          <w:instrText xml:space="preserve"> PAGEREF _Toc242827624 \h </w:instrText>
+          <w:instrText xml:space="preserve"> PAGEREF _Toc242871477 \h </w:instrText>
         </w:r>
         <w:r>
           <w:rPr>
@@ -2165,7 +2165,7 @@
           <w14:ligatures w14:val="standardContextual"/>
         </w:rPr>
       </w:pPr>
-      <w:hyperlink w:anchor="_Toc242827625" w:history="1">
+      <w:hyperlink w:anchor="_Toc242871478" w:history="1">
         <w:r>
           <w:rPr>
             <w:rStyle w:val="Hyperlink"/>
@@ -2192,7 +2192,7 @@
             <w:noProof/>
             <w:webHidden/>
           </w:rPr>
-          <w:instrText xml:space="preserve"> PAGEREF _Toc242827625 \h </w:instrText>
+          <w:instrText xml:space="preserve"> PAGEREF _Toc242871478 \h </w:instrText>
         </w:r>
         <w:r>
           <w:rPr>
@@ -2239,7 +2239,7 @@
           <w14:ligatures w14:val="standardContextual"/>
         </w:rPr>
       </w:pPr>
-      <w:hyperlink w:anchor="_Toc242827626" w:history="1">
+      <w:hyperlink w:anchor="_Toc242871479" w:history="1">
         <w:r>
           <w:rPr>
             <w:rStyle w:val="Hyperlink"/>
@@ -2266,7 +2266,7 @@
             <w:noProof/>
             <w:webHidden/>
           </w:rPr>
-          <w:instrText xml:space="preserve"> PAGEREF _Toc242827626 \h </w:instrText>
+          <w:instrText xml:space="preserve"> PAGEREF _Toc242871479 \h </w:instrText>
         </w:r>
         <w:r>
           <w:rPr>
@@ -2314,7 +2314,7 @@
           <w14:ligatures w14:val="standardContextual"/>
         </w:rPr>
       </w:pPr>
-      <w:hyperlink w:anchor="_Toc242827627" w:history="1">
+      <w:hyperlink w:anchor="_Toc242871480" w:history="1">
         <w:r>
           <w:rPr>
             <w:rStyle w:val="Hyperlink"/>
@@ -2341,7 +2341,7 @@
             <w:noProof/>
             <w:webHidden/>
           </w:rPr>
-          <w:instrText xml:space="preserve"> PAGEREF _Toc242827627 \h </w:instrText>
+          <w:instrText xml:space="preserve"> PAGEREF _Toc242871480 \h </w:instrText>
         </w:r>
         <w:r>
           <w:rPr>
@@ -2388,7 +2388,7 @@
           <w14:ligatures w14:val="standardContextual"/>
         </w:rPr>
       </w:pPr>
-      <w:hyperlink w:anchor="_Toc242827628" w:history="1">
+      <w:hyperlink w:anchor="_Toc242871481" w:history="1">
         <w:r>
           <w:rPr>
             <w:rStyle w:val="Hyperlink"/>
@@ -2415,7 +2415,7 @@
             <w:noProof/>
             <w:webHidden/>
           </w:rPr>
-          <w:instrText xml:space="preserve"> PAGEREF _Toc242827628 \h </w:instrText>
+          <w:instrText xml:space="preserve"> PAGEREF _Toc242871481 \h </w:instrText>
         </w:r>
         <w:r>
           <w:rPr>
@@ -2462,7 +2462,7 @@
           <w14:ligatures w14:val="standardContextual"/>
         </w:rPr>
       </w:pPr>
-      <w:hyperlink w:anchor="_Toc242827629" w:history="1">
+      <w:hyperlink w:anchor="_Toc242871482" w:history="1">
         <w:r>
           <w:rPr>
             <w:rStyle w:val="Hyperlink"/>
@@ -2489,7 +2489,7 @@
             <w:noProof/>
             <w:webHidden/>
           </w:rPr>
-          <w:instrText xml:space="preserve"> PAGEREF _Toc242827629 \h </w:instrText>
+          <w:instrText xml:space="preserve"> PAGEREF _Toc242871482 \h </w:instrText>
         </w:r>
         <w:r>
           <w:rPr>
@@ -2536,7 +2536,7 @@
           <w14:ligatures w14:val="standardContextual"/>
         </w:rPr>
       </w:pPr>
-      <w:hyperlink w:anchor="_Toc242827630" w:history="1">
+      <w:hyperlink w:anchor="_Toc242871483" w:history="1">
         <w:r>
           <w:rPr>
             <w:rStyle w:val="Hyperlink"/>
@@ -2563,7 +2563,7 @@
             <w:noProof/>
             <w:webHidden/>
           </w:rPr>
-          <w:instrText xml:space="preserve"> PAGEREF _Toc242827630 \h </w:instrText>
+          <w:instrText xml:space="preserve"> PAGEREF _Toc242871483 \h </w:instrText>
         </w:r>
         <w:r>
           <w:rPr>
@@ -2621,24 +2621,28 @@
       </w:pPr>
       <w:bookmarkStart w:id="0" w:name="_Toc242299335"/>
       <w:bookmarkStart w:id="1" w:name="_Toc242827603"/>
+      <w:bookmarkStart w:id="2" w:name="_Toc242871456"/>
       <w:r>
         <w:lastRenderedPageBreak/>
         <w:t>Chương 1 Tổng quan đề tài và yêu cầu học phần</w:t>
       </w:r>
       <w:bookmarkEnd w:id="0"/>
       <w:bookmarkEnd w:id="1"/>
+      <w:bookmarkEnd w:id="2"/>
     </w:p>
     <w:p>
       <w:pPr>
         <w:pStyle w:val="Heading2"/>
       </w:pPr>
-      <w:bookmarkStart w:id="2" w:name="_Toc242299336"/>
-      <w:bookmarkStart w:id="3" w:name="_Toc242827604"/>
+      <w:bookmarkStart w:id="3" w:name="_Toc242299336"/>
+      <w:bookmarkStart w:id="4" w:name="_Toc242827604"/>
+      <w:bookmarkStart w:id="5" w:name="_Toc242871457"/>
       <w:r>
         <w:t>1.1 Bối cảnh, mục tiêu và phạm vi</w:t>
       </w:r>
-      <w:bookmarkEnd w:id="2"/>
       <w:bookmarkEnd w:id="3"/>
+      <w:bookmarkEnd w:id="4"/>
+      <w:bookmarkEnd w:id="5"/>
     </w:p>
     <w:p>
       <w:pPr>
@@ -2705,13 +2709,15 @@
       <w:pPr>
         <w:pStyle w:val="Heading2"/>
       </w:pPr>
-      <w:bookmarkStart w:id="4" w:name="_Toc242299337"/>
-      <w:bookmarkStart w:id="5" w:name="_Toc242827605"/>
+      <w:bookmarkStart w:id="6" w:name="_Toc242299337"/>
+      <w:bookmarkStart w:id="7" w:name="_Toc242827605"/>
+      <w:bookmarkStart w:id="8" w:name="_Toc242871458"/>
       <w:r>
         <w:t>1.2 Yêu cầu chức năng và kết quả triển khai</w:t>
       </w:r>
-      <w:bookmarkEnd w:id="4"/>
-      <w:bookmarkEnd w:id="5"/>
+      <w:bookmarkEnd w:id="6"/>
+      <w:bookmarkEnd w:id="7"/>
+      <w:bookmarkEnd w:id="8"/>
     </w:p>
     <w:p>
       <w:pPr>
@@ -3303,14 +3309,16 @@
       <w:pPr>
         <w:pStyle w:val="Heading2"/>
       </w:pPr>
-      <w:bookmarkStart w:id="6" w:name="_Toc242299338"/>
-      <w:bookmarkStart w:id="7" w:name="_Toc242827606"/>
+      <w:bookmarkStart w:id="9" w:name="_Toc242299338"/>
+      <w:bookmarkStart w:id="10" w:name="_Toc242827606"/>
+      <w:bookmarkStart w:id="11" w:name="_Toc242871459"/>
       <w:r>
         <w:lastRenderedPageBreak/>
         <w:t>1.3 Kiến trúc tổng thể</w:t>
       </w:r>
-      <w:bookmarkEnd w:id="6"/>
-      <w:bookmarkEnd w:id="7"/>
+      <w:bookmarkEnd w:id="9"/>
+      <w:bookmarkEnd w:id="10"/>
+      <w:bookmarkEnd w:id="11"/>
     </w:p>
     <w:p>
       <w:pPr>
@@ -3383,14 +3391,16 @@
         <w:pStyle w:val="Heading2"/>
         <w:pageBreakBefore/>
       </w:pPr>
-      <w:bookmarkStart w:id="8" w:name="_Toc242299339"/>
-      <w:bookmarkStart w:id="9" w:name="_Toc242827607"/>
+      <w:bookmarkStart w:id="12" w:name="_Toc242299339"/>
+      <w:bookmarkStart w:id="13" w:name="_Toc242827607"/>
+      <w:bookmarkStart w:id="14" w:name="_Toc242871460"/>
       <w:r>
         <w:lastRenderedPageBreak/>
         <w:t>1.4 Nguồn số liệu và mốc đo</w:t>
       </w:r>
-      <w:bookmarkEnd w:id="8"/>
-      <w:bookmarkEnd w:id="9"/>
+      <w:bookmarkEnd w:id="12"/>
+      <w:bookmarkEnd w:id="13"/>
+      <w:bookmarkEnd w:id="14"/>
     </w:p>
     <w:p>
       <w:pPr>
@@ -3398,7 +3408,7 @@
         <w:ind w:firstLine="504"/>
       </w:pPr>
       <w:r>
-        <w:t>Các bảng phân tích sử dụng bốn CSV tổng hợp, CSV chứa 156 bản ghi gốc và bảng chỉ số truy vấn đã lưu trong Tuần 1. Số liệu S3, Lambda và CloudWatch được đọc ở các mốc quan sát riêng. Báo cáo đối chiếu số dòng giữa bảng đô thị, bảng giờ, bảng cấp AQI và dữ liệu gốc. Dữ liệu chất lượng không khí được lấy từ Open-Meteo Air Quality API, dựa trên sản phẩm mô hình khí quyển CAMS, không phải phép đo trực tiếp tại một trạm. Nguồn dữ liệu: https://open-meteo.com/en/docs/air-quality-api.</w:t>
+        <w:t>Các bảng phân tích sử dụng bốn CSV tổng hợp, CSV chứa 156 bản ghi gốc và bảng chỉ số truy vấn đã lưu trong Tuần 1. Số liệu S3, Lambda và CloudWatch được đọc ở các mốc quan sát riêng. Báo cáo đối chiếu số dòng giữa bảng đô thị, bảng giờ, bảng cấp AQI và dữ liệu gốc. Dữ liệu chất lượng không khí được lấy từ Open-Meteo Air Quality API, dựa trên sản phẩm mô hình khí quyển CAMS, không phải phép đo trực tiếp tại một trạm. Nguồn dữ liệu: https://open-meteo.com/en/docs/air-quality-api. Bộ xuất dùng trong báo cáo bao gồm dữ liệu lịch sử được nạp bổ sung; phạm vi này được phân biệt với bộ lọc theo ranh giới tuần.</w:t>
       </w:r>
     </w:p>
     <w:p>
@@ -4262,14 +4272,16 @@
         <w:pageBreakBefore/>
         <w:jc w:val="left"/>
       </w:pPr>
-      <w:bookmarkStart w:id="10" w:name="_Toc242299340"/>
-      <w:bookmarkStart w:id="11" w:name="_Toc242827608"/>
+      <w:bookmarkStart w:id="15" w:name="_Toc242299340"/>
+      <w:bookmarkStart w:id="16" w:name="_Toc242827608"/>
+      <w:bookmarkStart w:id="17" w:name="_Toc242871461"/>
       <w:r>
         <w:lastRenderedPageBreak/>
         <w:t>Chương 2 Báo cáo tiến độ Tuần 1</w:t>
       </w:r>
-      <w:bookmarkEnd w:id="10"/>
-      <w:bookmarkEnd w:id="11"/>
+      <w:bookmarkEnd w:id="15"/>
+      <w:bookmarkEnd w:id="16"/>
+      <w:bookmarkEnd w:id="17"/>
     </w:p>
     <w:p>
       <w:pPr>
@@ -4284,13 +4296,15 @@
       <w:pPr>
         <w:pStyle w:val="Heading2"/>
       </w:pPr>
-      <w:bookmarkStart w:id="12" w:name="_Toc242299341"/>
-      <w:bookmarkStart w:id="13" w:name="_Toc242827609"/>
+      <w:bookmarkStart w:id="18" w:name="_Toc242299341"/>
+      <w:bookmarkStart w:id="19" w:name="_Toc242827609"/>
+      <w:bookmarkStart w:id="20" w:name="_Toc242871462"/>
       <w:r>
         <w:t>2.1 Mục tiêu và phân công thực hiện</w:t>
       </w:r>
-      <w:bookmarkEnd w:id="12"/>
-      <w:bookmarkEnd w:id="13"/>
+      <w:bookmarkEnd w:id="18"/>
+      <w:bookmarkEnd w:id="19"/>
+      <w:bookmarkEnd w:id="20"/>
     </w:p>
     <w:p>
       <w:pPr>
@@ -4610,13 +4624,15 @@
       <w:pPr>
         <w:pStyle w:val="Heading2"/>
       </w:pPr>
-      <w:bookmarkStart w:id="14" w:name="_Toc242299342"/>
-      <w:bookmarkStart w:id="15" w:name="_Toc242827610"/>
+      <w:bookmarkStart w:id="21" w:name="_Toc242299342"/>
+      <w:bookmarkStart w:id="22" w:name="_Toc242827610"/>
+      <w:bookmarkStart w:id="23" w:name="_Toc242871463"/>
       <w:r>
         <w:t>2.2 Phạm vi và luồng dữ liệu đo</w:t>
       </w:r>
-      <w:bookmarkEnd w:id="14"/>
-      <w:bookmarkEnd w:id="15"/>
+      <w:bookmarkEnd w:id="21"/>
+      <w:bookmarkEnd w:id="22"/>
+      <w:bookmarkEnd w:id="23"/>
     </w:p>
     <w:p>
       <w:pPr>
@@ -5063,20 +5079,22 @@
         <w:ind w:firstLine="504"/>
       </w:pPr>
       <w:r>
-        <w:t>Tập dữ liệu xuất trong Tuần 1 có 156 dòng: 52 dòng cho mỗi đô thị và lần lượt 72, 72, 12 dòng ở ba phân vùng UTC. Các phép tổng hợp theo đô thị, giờ và cấp AQI đều cộng về 156. Phân tích tương quan sử dụng cùng tập dữ liệu này theo từng đô thị.</w:t>
+        <w:t>Bộ dữ liệu dùng cho báo cáo Tuần 1 có 156 dòng: 52 dòng cho mỗi đô thị và lần lượt 72, 72, 12 dòng ở ba phân vùng UTC. Mỗi đô thị có 52 mốc giờ quan trắc liên tiếp, được tổng hợp thành 24 nhóm giờ trong ngày. Trong bộ xuất này, 51 dòng là dữ liệu lịch sử trước ranh giới Tuần 1 và 105 dòng thuộc ranh giới Tuần 1 theo giờ Việt Nam. Các bảng và biểu đồ giữ đủ 156 dòng để thống nhất với bộ CSV đã lưu; chúng không mô tả toàn bộ bảy ngày của tuần.</w:t>
       </w:r>
     </w:p>
     <w:p>
       <w:pPr>
         <w:pStyle w:val="Heading2"/>
       </w:pPr>
-      <w:bookmarkStart w:id="16" w:name="_Toc242299343"/>
-      <w:bookmarkStart w:id="17" w:name="_Toc242827611"/>
+      <w:bookmarkStart w:id="24" w:name="_Toc242299343"/>
+      <w:bookmarkStart w:id="25" w:name="_Toc242827611"/>
+      <w:bookmarkStart w:id="26" w:name="_Toc242871464"/>
       <w:r>
         <w:t>2.3 Kết quả định lượng</w:t>
       </w:r>
-      <w:bookmarkEnd w:id="16"/>
-      <w:bookmarkEnd w:id="17"/>
+      <w:bookmarkEnd w:id="24"/>
+      <w:bookmarkEnd w:id="25"/>
+      <w:bookmarkEnd w:id="26"/>
     </w:p>
     <w:p>
       <w:pPr>
@@ -5601,26 +5619,30 @@
         <w:pageBreakBefore/>
         <w:jc w:val="left"/>
       </w:pPr>
-      <w:bookmarkStart w:id="18" w:name="_Toc242299344"/>
-      <w:bookmarkStart w:id="19" w:name="_Toc242827612"/>
+      <w:bookmarkStart w:id="27" w:name="_Toc242299344"/>
+      <w:bookmarkStart w:id="28" w:name="_Toc242827612"/>
+      <w:bookmarkStart w:id="29" w:name="_Toc242871465"/>
       <w:r>
         <w:lastRenderedPageBreak/>
         <w:t>Chương 3 Thiết kế và triển khai trên AWS Learner Lab</w:t>
       </w:r>
-      <w:bookmarkEnd w:id="18"/>
-      <w:bookmarkEnd w:id="19"/>
+      <w:bookmarkEnd w:id="27"/>
+      <w:bookmarkEnd w:id="28"/>
+      <w:bookmarkEnd w:id="29"/>
     </w:p>
     <w:p>
       <w:pPr>
         <w:pStyle w:val="Heading2"/>
       </w:pPr>
-      <w:bookmarkStart w:id="20" w:name="_Toc242299345"/>
-      <w:bookmarkStart w:id="21" w:name="_Toc242827613"/>
+      <w:bookmarkStart w:id="30" w:name="_Toc242299345"/>
+      <w:bookmarkStart w:id="31" w:name="_Toc242827613"/>
+      <w:bookmarkStart w:id="32" w:name="_Toc242871466"/>
       <w:r>
         <w:t>3.1 Danh mục dịch vụ và cấu hình thực tế</w:t>
       </w:r>
-      <w:bookmarkEnd w:id="20"/>
-      <w:bookmarkEnd w:id="21"/>
+      <w:bookmarkEnd w:id="30"/>
+      <w:bookmarkEnd w:id="31"/>
+      <w:bookmarkEnd w:id="32"/>
     </w:p>
     <w:p>
       <w:pPr>
@@ -6368,13 +6390,15 @@
       <w:pPr>
         <w:pStyle w:val="Heading2"/>
       </w:pPr>
-      <w:bookmarkStart w:id="22" w:name="_Toc242299346"/>
-      <w:bookmarkStart w:id="23" w:name="_Toc242827614"/>
+      <w:bookmarkStart w:id="33" w:name="_Toc242299346"/>
+      <w:bookmarkStart w:id="34" w:name="_Toc242827614"/>
+      <w:bookmarkStart w:id="35" w:name="_Toc242871467"/>
       <w:r>
         <w:t>3.2 Dữ liệu và phân vùng S3</w:t>
       </w:r>
-      <w:bookmarkEnd w:id="22"/>
-      <w:bookmarkEnd w:id="23"/>
+      <w:bookmarkEnd w:id="33"/>
+      <w:bookmarkEnd w:id="34"/>
+      <w:bookmarkEnd w:id="35"/>
     </w:p>
     <w:p>
       <w:pPr>
@@ -6429,11 +6453,6 @@
                 <w:sz w:val="22"/>
               </w:rPr>
               <w:br/>
-            </w:r>
-            <w:r>
-              <w:rPr>
-                <w:sz w:val="22"/>
-              </w:rPr>
               <w:t xml:space="preserve">  year=YYYY/month=MM/day=DD/</w:t>
             </w:r>
             <w:r>
@@ -6452,13 +6471,15 @@
       <w:pPr>
         <w:pStyle w:val="Heading2"/>
       </w:pPr>
-      <w:bookmarkStart w:id="24" w:name="_Toc242299347"/>
-      <w:bookmarkStart w:id="25" w:name="_Toc242827615"/>
+      <w:bookmarkStart w:id="36" w:name="_Toc242299347"/>
+      <w:bookmarkStart w:id="37" w:name="_Toc242827615"/>
+      <w:bookmarkStart w:id="38" w:name="_Toc242871468"/>
       <w:r>
         <w:t>3.3 An toàn cấu hình và vận hành</w:t>
       </w:r>
-      <w:bookmarkEnd w:id="24"/>
-      <w:bookmarkEnd w:id="25"/>
+      <w:bookmarkEnd w:id="36"/>
+      <w:bookmarkEnd w:id="37"/>
+      <w:bookmarkEnd w:id="38"/>
     </w:p>
     <w:p>
       <w:pPr>
@@ -6473,14 +6494,16 @@
       <w:pPr>
         <w:pStyle w:val="Heading2"/>
       </w:pPr>
-      <w:bookmarkStart w:id="26" w:name="_Toc242299348"/>
-      <w:bookmarkStart w:id="27" w:name="_Toc242827616"/>
+      <w:bookmarkStart w:id="39" w:name="_Toc242299348"/>
+      <w:bookmarkStart w:id="40" w:name="_Toc242827616"/>
+      <w:bookmarkStart w:id="41" w:name="_Toc242871469"/>
       <w:r>
         <w:lastRenderedPageBreak/>
         <w:t>3.4 Trình tự xử lý của Lambda</w:t>
       </w:r>
-      <w:bookmarkEnd w:id="26"/>
-      <w:bookmarkEnd w:id="27"/>
+      <w:bookmarkEnd w:id="39"/>
+      <w:bookmarkEnd w:id="40"/>
+      <w:bookmarkEnd w:id="41"/>
     </w:p>
     <w:p>
       <w:pPr>
@@ -6513,13 +6536,15 @@
       <w:pPr>
         <w:pStyle w:val="Heading2"/>
       </w:pPr>
-      <w:bookmarkStart w:id="28" w:name="_Toc242299349"/>
-      <w:bookmarkStart w:id="29" w:name="_Toc242827617"/>
+      <w:bookmarkStart w:id="42" w:name="_Toc242299349"/>
+      <w:bookmarkStart w:id="43" w:name="_Toc242827617"/>
+      <w:bookmarkStart w:id="44" w:name="_Toc242871470"/>
       <w:r>
         <w:t>3.5 Truy vấn Athena và khả năng tái lập</w:t>
       </w:r>
-      <w:bookmarkEnd w:id="28"/>
-      <w:bookmarkEnd w:id="29"/>
+      <w:bookmarkEnd w:id="42"/>
+      <w:bookmarkEnd w:id="43"/>
+      <w:bookmarkEnd w:id="44"/>
     </w:p>
     <w:p>
       <w:pPr>
@@ -6775,13 +6800,15 @@
       <w:pPr>
         <w:pStyle w:val="Heading2"/>
       </w:pPr>
-      <w:bookmarkStart w:id="30" w:name="_Toc242299350"/>
-      <w:bookmarkStart w:id="31" w:name="_Toc242827618"/>
+      <w:bookmarkStart w:id="45" w:name="_Toc242299350"/>
+      <w:bookmarkStart w:id="46" w:name="_Toc242827618"/>
+      <w:bookmarkStart w:id="47" w:name="_Toc242871471"/>
       <w:r>
         <w:t>3.6 Lược đồ bản ghi và chất lượng dữ liệu</w:t>
       </w:r>
-      <w:bookmarkEnd w:id="30"/>
-      <w:bookmarkEnd w:id="31"/>
+      <w:bookmarkEnd w:id="45"/>
+      <w:bookmarkEnd w:id="46"/>
+      <w:bookmarkEnd w:id="47"/>
     </w:p>
     <w:p>
       <w:pPr>
@@ -7469,14 +7496,16 @@
       <w:pPr>
         <w:pStyle w:val="Heading2"/>
       </w:pPr>
-      <w:bookmarkStart w:id="32" w:name="_Toc242299351"/>
-      <w:bookmarkStart w:id="33" w:name="_Toc242827619"/>
+      <w:bookmarkStart w:id="48" w:name="_Toc242299351"/>
+      <w:bookmarkStart w:id="49" w:name="_Toc242827619"/>
+      <w:bookmarkStart w:id="50" w:name="_Toc242871472"/>
       <w:r>
         <w:lastRenderedPageBreak/>
         <w:t>3.7 Tần suất gọi Open-Meteo và yêu cầu khóa API</w:t>
       </w:r>
-      <w:bookmarkEnd w:id="32"/>
-      <w:bookmarkEnd w:id="33"/>
+      <w:bookmarkEnd w:id="48"/>
+      <w:bookmarkEnd w:id="49"/>
+      <w:bookmarkEnd w:id="50"/>
     </w:p>
     <w:p>
       <w:pPr>
@@ -7502,26 +7531,30 @@
         <w:pageBreakBefore/>
         <w:jc w:val="left"/>
       </w:pPr>
-      <w:bookmarkStart w:id="34" w:name="_Toc242299352"/>
-      <w:bookmarkStart w:id="35" w:name="_Toc242827620"/>
+      <w:bookmarkStart w:id="51" w:name="_Toc242299352"/>
+      <w:bookmarkStart w:id="52" w:name="_Toc242827620"/>
+      <w:bookmarkStart w:id="53" w:name="_Toc242871473"/>
       <w:r>
         <w:lastRenderedPageBreak/>
         <w:t>Chương 4 Kết quả kiểm tra và phân tích dữ liệu</w:t>
       </w:r>
-      <w:bookmarkEnd w:id="34"/>
-      <w:bookmarkEnd w:id="35"/>
+      <w:bookmarkEnd w:id="51"/>
+      <w:bookmarkEnd w:id="52"/>
+      <w:bookmarkEnd w:id="53"/>
     </w:p>
     <w:p>
       <w:pPr>
         <w:pStyle w:val="Heading2"/>
       </w:pPr>
-      <w:bookmarkStart w:id="36" w:name="_Toc242299353"/>
-      <w:bookmarkStart w:id="37" w:name="_Toc242827621"/>
+      <w:bookmarkStart w:id="54" w:name="_Toc242299353"/>
+      <w:bookmarkStart w:id="55" w:name="_Toc242827621"/>
+      <w:bookmarkStart w:id="56" w:name="_Toc242871474"/>
       <w:r>
         <w:t>4.1 Mốc dữ liệu và số đo vận hành AWS</w:t>
       </w:r>
-      <w:bookmarkEnd w:id="36"/>
-      <w:bookmarkEnd w:id="37"/>
+      <w:bookmarkEnd w:id="54"/>
+      <w:bookmarkEnd w:id="55"/>
+      <w:bookmarkEnd w:id="56"/>
     </w:p>
     <w:p>
       <w:pPr>
@@ -8207,14 +8240,16 @@
         <w:pStyle w:val="Heading2"/>
         <w:pageBreakBefore/>
       </w:pPr>
-      <w:bookmarkStart w:id="38" w:name="_Toc242299354"/>
-      <w:bookmarkStart w:id="39" w:name="_Toc242827622"/>
+      <w:bookmarkStart w:id="57" w:name="_Toc242299354"/>
+      <w:bookmarkStart w:id="58" w:name="_Toc242827622"/>
+      <w:bookmarkStart w:id="59" w:name="_Toc242871475"/>
       <w:r>
         <w:lastRenderedPageBreak/>
         <w:t>4.2 So sánh ba đô thị từ Athena</w:t>
       </w:r>
-      <w:bookmarkEnd w:id="38"/>
-      <w:bookmarkEnd w:id="39"/>
+      <w:bookmarkEnd w:id="57"/>
+      <w:bookmarkEnd w:id="58"/>
+      <w:bookmarkEnd w:id="59"/>
     </w:p>
     <w:p>
       <w:pPr>
@@ -9420,13 +9455,15 @@
       <w:pPr>
         <w:pStyle w:val="Heading2"/>
       </w:pPr>
-      <w:bookmarkStart w:id="40" w:name="_Toc242299355"/>
-      <w:bookmarkStart w:id="41" w:name="_Toc242827623"/>
+      <w:bookmarkStart w:id="60" w:name="_Toc242299355"/>
+      <w:bookmarkStart w:id="61" w:name="_Toc242827623"/>
+      <w:bookmarkStart w:id="62" w:name="_Toc242871476"/>
       <w:r>
         <w:t>4.3 Biến thiên theo 24 giờ UTC</w:t>
       </w:r>
-      <w:bookmarkEnd w:id="40"/>
-      <w:bookmarkEnd w:id="41"/>
+      <w:bookmarkEnd w:id="60"/>
+      <w:bookmarkEnd w:id="61"/>
+      <w:bookmarkEnd w:id="62"/>
     </w:p>
     <w:p>
       <w:pPr>
@@ -12697,13 +12734,15 @@
       <w:pPr>
         <w:pStyle w:val="Heading2"/>
       </w:pPr>
-      <w:bookmarkStart w:id="42" w:name="_Toc242299356"/>
-      <w:bookmarkStart w:id="43" w:name="_Toc242827624"/>
+      <w:bookmarkStart w:id="63" w:name="_Toc242299356"/>
+      <w:bookmarkStart w:id="64" w:name="_Toc242827624"/>
+      <w:bookmarkStart w:id="65" w:name="_Toc242871477"/>
       <w:r>
         <w:t>4.4 Phân bố cấp chất lượng không khí</w:t>
       </w:r>
-      <w:bookmarkEnd w:id="42"/>
-      <w:bookmarkEnd w:id="43"/>
+      <w:bookmarkEnd w:id="63"/>
+      <w:bookmarkEnd w:id="64"/>
+      <w:bookmarkEnd w:id="65"/>
     </w:p>
     <w:p>
       <w:pPr>
@@ -13338,13 +13377,15 @@
       <w:pPr>
         <w:pStyle w:val="Heading2"/>
       </w:pPr>
-      <w:bookmarkStart w:id="44" w:name="_Toc242299357"/>
-      <w:bookmarkStart w:id="45" w:name="_Toc242827625"/>
+      <w:bookmarkStart w:id="66" w:name="_Toc242299357"/>
+      <w:bookmarkStart w:id="67" w:name="_Toc242827625"/>
+      <w:bookmarkStart w:id="68" w:name="_Toc242871478"/>
       <w:r>
         <w:t>4.5 Tương quan PM2.5 với yếu tố khí tượng</w:t>
       </w:r>
-      <w:bookmarkEnd w:id="44"/>
-      <w:bookmarkEnd w:id="45"/>
+      <w:bookmarkEnd w:id="66"/>
+      <w:bookmarkEnd w:id="67"/>
+      <w:bookmarkEnd w:id="68"/>
     </w:p>
     <w:p>
       <w:pPr>
@@ -13877,14 +13918,16 @@
         <w:pStyle w:val="Heading2"/>
         <w:pageBreakBefore/>
       </w:pPr>
-      <w:bookmarkStart w:id="46" w:name="_Toc242299358"/>
-      <w:bookmarkStart w:id="47" w:name="_Toc242827626"/>
+      <w:bookmarkStart w:id="69" w:name="_Toc242299358"/>
+      <w:bookmarkStart w:id="70" w:name="_Toc242827626"/>
+      <w:bookmarkStart w:id="71" w:name="_Toc242871479"/>
       <w:r>
         <w:lastRenderedPageBreak/>
         <w:t>4.6 Thời gian và dung lượng quét của năm truy vấn</w:t>
       </w:r>
-      <w:bookmarkEnd w:id="46"/>
-      <w:bookmarkEnd w:id="47"/>
+      <w:bookmarkEnd w:id="69"/>
+      <w:bookmarkEnd w:id="70"/>
+      <w:bookmarkEnd w:id="71"/>
     </w:p>
     <w:p>
       <w:pPr>
@@ -14723,26 +14766,30 @@
         <w:pageBreakBefore/>
         <w:jc w:val="left"/>
       </w:pPr>
-      <w:bookmarkStart w:id="48" w:name="_Toc242299359"/>
-      <w:bookmarkStart w:id="49" w:name="_Toc242827627"/>
+      <w:bookmarkStart w:id="72" w:name="_Toc242299359"/>
+      <w:bookmarkStart w:id="73" w:name="_Toc242827627"/>
+      <w:bookmarkStart w:id="74" w:name="_Toc242871480"/>
       <w:r>
         <w:lastRenderedPageBreak/>
         <w:t>Chương 5 Tổng hợp kết quả và chi phí Tuần 1</w:t>
       </w:r>
-      <w:bookmarkEnd w:id="48"/>
-      <w:bookmarkEnd w:id="49"/>
+      <w:bookmarkEnd w:id="72"/>
+      <w:bookmarkEnd w:id="73"/>
+      <w:bookmarkEnd w:id="74"/>
     </w:p>
     <w:p>
       <w:pPr>
         <w:pStyle w:val="Heading2"/>
       </w:pPr>
-      <w:bookmarkStart w:id="50" w:name="_Toc242299360"/>
-      <w:bookmarkStart w:id="51" w:name="_Toc242827628"/>
+      <w:bookmarkStart w:id="75" w:name="_Toc242299360"/>
+      <w:bookmarkStart w:id="76" w:name="_Toc242827628"/>
+      <w:bookmarkStart w:id="77" w:name="_Toc242871481"/>
       <w:r>
         <w:t>5.1 Mức độ hoàn thành theo sản phẩm</w:t>
       </w:r>
-      <w:bookmarkEnd w:id="50"/>
-      <w:bookmarkEnd w:id="51"/>
+      <w:bookmarkEnd w:id="75"/>
+      <w:bookmarkEnd w:id="76"/>
+      <w:bookmarkEnd w:id="77"/>
     </w:p>
     <w:p>
       <w:pPr>
@@ -14757,13 +14804,15 @@
       <w:pPr>
         <w:pStyle w:val="Heading2"/>
       </w:pPr>
-      <w:bookmarkStart w:id="52" w:name="_Toc242299361"/>
-      <w:bookmarkStart w:id="53" w:name="_Toc242827629"/>
+      <w:bookmarkStart w:id="78" w:name="_Toc242299361"/>
+      <w:bookmarkStart w:id="79" w:name="_Toc242827629"/>
+      <w:bookmarkStart w:id="80" w:name="_Toc242871482"/>
       <w:r>
         <w:t>5.2 Quản lý chi phí</w:t>
       </w:r>
-      <w:bookmarkEnd w:id="52"/>
-      <w:bookmarkEnd w:id="53"/>
+      <w:bookmarkEnd w:id="78"/>
+      <w:bookmarkEnd w:id="79"/>
+      <w:bookmarkEnd w:id="80"/>
     </w:p>
     <w:p>
       <w:pPr>
@@ -15295,13 +15344,15 @@
       <w:pPr>
         <w:pStyle w:val="Heading2"/>
       </w:pPr>
-      <w:bookmarkStart w:id="54" w:name="_Toc242299362"/>
-      <w:bookmarkStart w:id="55" w:name="_Toc242827630"/>
+      <w:bookmarkStart w:id="81" w:name="_Toc242299362"/>
+      <w:bookmarkStart w:id="82" w:name="_Toc242827630"/>
+      <w:bookmarkStart w:id="83" w:name="_Toc242871483"/>
       <w:r>
         <w:t>5.3 Kết luận</w:t>
       </w:r>
-      <w:bookmarkEnd w:id="54"/>
-      <w:bookmarkEnd w:id="55"/>
+      <w:bookmarkEnd w:id="81"/>
+      <w:bookmarkEnd w:id="82"/>
+      <w:bookmarkEnd w:id="83"/>
     </w:p>
     <w:p>
       <w:pPr>

</xml_diff>

<commit_message>
docs(report): present student data reports consistently
</commit_message>
<xml_diff>
--- a/tuan_1/docs/Bao_cao_tuan_1_Dien_toan_dam_may_Nhom_05.docx
+++ b/tuan_1/docs/Bao_cao_tuan_1_Dien_toan_dam_may_Nhom_05.docx
@@ -534,7 +534,7 @@
         </w:rPr>
         <w:fldChar w:fldCharType="separate"/>
       </w:r>
-      <w:hyperlink w:anchor="_Toc242871456" w:history="1">
+      <w:hyperlink w:anchor="_Toc242872832" w:history="1">
         <w:r>
           <w:rPr>
             <w:rStyle w:val="Hyperlink"/>
@@ -561,7 +561,7 @@
             <w:noProof/>
             <w:webHidden/>
           </w:rPr>
-          <w:instrText xml:space="preserve"> PAGEREF _Toc242871456 \h </w:instrText>
+          <w:instrText xml:space="preserve"> PAGEREF _Toc242872832 \h </w:instrText>
         </w:r>
         <w:r>
           <w:rPr>
@@ -608,7 +608,7 @@
           <w14:ligatures w14:val="standardContextual"/>
         </w:rPr>
       </w:pPr>
-      <w:hyperlink w:anchor="_Toc242871457" w:history="1">
+      <w:hyperlink w:anchor="_Toc242872833" w:history="1">
         <w:r>
           <w:rPr>
             <w:rStyle w:val="Hyperlink"/>
@@ -635,7 +635,7 @@
             <w:noProof/>
             <w:webHidden/>
           </w:rPr>
-          <w:instrText xml:space="preserve"> PAGEREF _Toc242871457 \h </w:instrText>
+          <w:instrText xml:space="preserve"> PAGEREF _Toc242872833 \h </w:instrText>
         </w:r>
         <w:r>
           <w:rPr>
@@ -682,7 +682,7 @@
           <w14:ligatures w14:val="standardContextual"/>
         </w:rPr>
       </w:pPr>
-      <w:hyperlink w:anchor="_Toc242871458" w:history="1">
+      <w:hyperlink w:anchor="_Toc242872834" w:history="1">
         <w:r>
           <w:rPr>
             <w:rStyle w:val="Hyperlink"/>
@@ -709,7 +709,7 @@
             <w:noProof/>
             <w:webHidden/>
           </w:rPr>
-          <w:instrText xml:space="preserve"> PAGEREF _Toc242871458 \h </w:instrText>
+          <w:instrText xml:space="preserve"> PAGEREF _Toc242872834 \h </w:instrText>
         </w:r>
         <w:r>
           <w:rPr>
@@ -756,7 +756,7 @@
           <w14:ligatures w14:val="standardContextual"/>
         </w:rPr>
       </w:pPr>
-      <w:hyperlink w:anchor="_Toc242871459" w:history="1">
+      <w:hyperlink w:anchor="_Toc242872835" w:history="1">
         <w:r>
           <w:rPr>
             <w:rStyle w:val="Hyperlink"/>
@@ -783,7 +783,7 @@
             <w:noProof/>
             <w:webHidden/>
           </w:rPr>
-          <w:instrText xml:space="preserve"> PAGEREF _Toc242871459 \h </w:instrText>
+          <w:instrText xml:space="preserve"> PAGEREF _Toc242872835 \h </w:instrText>
         </w:r>
         <w:r>
           <w:rPr>
@@ -830,7 +830,7 @@
           <w14:ligatures w14:val="standardContextual"/>
         </w:rPr>
       </w:pPr>
-      <w:hyperlink w:anchor="_Toc242871460" w:history="1">
+      <w:hyperlink w:anchor="_Toc242872836" w:history="1">
         <w:r>
           <w:rPr>
             <w:rStyle w:val="Hyperlink"/>
@@ -857,7 +857,7 @@
             <w:noProof/>
             <w:webHidden/>
           </w:rPr>
-          <w:instrText xml:space="preserve"> PAGEREF _Toc242871460 \h </w:instrText>
+          <w:instrText xml:space="preserve"> PAGEREF _Toc242872836 \h </w:instrText>
         </w:r>
         <w:r>
           <w:rPr>
@@ -905,7 +905,7 @@
           <w14:ligatures w14:val="standardContextual"/>
         </w:rPr>
       </w:pPr>
-      <w:hyperlink w:anchor="_Toc242871461" w:history="1">
+      <w:hyperlink w:anchor="_Toc242872837" w:history="1">
         <w:r>
           <w:rPr>
             <w:rStyle w:val="Hyperlink"/>
@@ -932,7 +932,7 @@
             <w:noProof/>
             <w:webHidden/>
           </w:rPr>
-          <w:instrText xml:space="preserve"> PAGEREF _Toc242871461 \h </w:instrText>
+          <w:instrText xml:space="preserve"> PAGEREF _Toc242872837 \h </w:instrText>
         </w:r>
         <w:r>
           <w:rPr>
@@ -979,7 +979,7 @@
           <w14:ligatures w14:val="standardContextual"/>
         </w:rPr>
       </w:pPr>
-      <w:hyperlink w:anchor="_Toc242871462" w:history="1">
+      <w:hyperlink w:anchor="_Toc242872838" w:history="1">
         <w:r>
           <w:rPr>
             <w:rStyle w:val="Hyperlink"/>
@@ -1006,7 +1006,7 @@
             <w:noProof/>
             <w:webHidden/>
           </w:rPr>
-          <w:instrText xml:space="preserve"> PAGEREF _Toc242871462 \h </w:instrText>
+          <w:instrText xml:space="preserve"> PAGEREF _Toc242872838 \h </w:instrText>
         </w:r>
         <w:r>
           <w:rPr>
@@ -1053,7 +1053,7 @@
           <w14:ligatures w14:val="standardContextual"/>
         </w:rPr>
       </w:pPr>
-      <w:hyperlink w:anchor="_Toc242871463" w:history="1">
+      <w:hyperlink w:anchor="_Toc242872839" w:history="1">
         <w:r>
           <w:rPr>
             <w:rStyle w:val="Hyperlink"/>
@@ -1080,7 +1080,7 @@
             <w:noProof/>
             <w:webHidden/>
           </w:rPr>
-          <w:instrText xml:space="preserve"> PAGEREF _Toc242871463 \h </w:instrText>
+          <w:instrText xml:space="preserve"> PAGEREF _Toc242872839 \h </w:instrText>
         </w:r>
         <w:r>
           <w:rPr>
@@ -1127,7 +1127,7 @@
           <w14:ligatures w14:val="standardContextual"/>
         </w:rPr>
       </w:pPr>
-      <w:hyperlink w:anchor="_Toc242871464" w:history="1">
+      <w:hyperlink w:anchor="_Toc242872840" w:history="1">
         <w:r>
           <w:rPr>
             <w:rStyle w:val="Hyperlink"/>
@@ -1154,7 +1154,7 @@
             <w:noProof/>
             <w:webHidden/>
           </w:rPr>
-          <w:instrText xml:space="preserve"> PAGEREF _Toc242871464 \h </w:instrText>
+          <w:instrText xml:space="preserve"> PAGEREF _Toc242872840 \h </w:instrText>
         </w:r>
         <w:r>
           <w:rPr>
@@ -1202,7 +1202,7 @@
           <w14:ligatures w14:val="standardContextual"/>
         </w:rPr>
       </w:pPr>
-      <w:hyperlink w:anchor="_Toc242871465" w:history="1">
+      <w:hyperlink w:anchor="_Toc242872841" w:history="1">
         <w:r>
           <w:rPr>
             <w:rStyle w:val="Hyperlink"/>
@@ -1229,7 +1229,7 @@
             <w:noProof/>
             <w:webHidden/>
           </w:rPr>
-          <w:instrText xml:space="preserve"> PAGEREF _Toc242871465 \h </w:instrText>
+          <w:instrText xml:space="preserve"> PAGEREF _Toc242872841 \h </w:instrText>
         </w:r>
         <w:r>
           <w:rPr>
@@ -1276,7 +1276,7 @@
           <w14:ligatures w14:val="standardContextual"/>
         </w:rPr>
       </w:pPr>
-      <w:hyperlink w:anchor="_Toc242871466" w:history="1">
+      <w:hyperlink w:anchor="_Toc242872842" w:history="1">
         <w:r>
           <w:rPr>
             <w:rStyle w:val="Hyperlink"/>
@@ -1303,7 +1303,7 @@
             <w:noProof/>
             <w:webHidden/>
           </w:rPr>
-          <w:instrText xml:space="preserve"> PAGEREF _Toc242871466 \h </w:instrText>
+          <w:instrText xml:space="preserve"> PAGEREF _Toc242872842 \h </w:instrText>
         </w:r>
         <w:r>
           <w:rPr>
@@ -1350,7 +1350,7 @@
           <w14:ligatures w14:val="standardContextual"/>
         </w:rPr>
       </w:pPr>
-      <w:hyperlink w:anchor="_Toc242871467" w:history="1">
+      <w:hyperlink w:anchor="_Toc242872843" w:history="1">
         <w:r>
           <w:rPr>
             <w:rStyle w:val="Hyperlink"/>
@@ -1377,7 +1377,7 @@
             <w:noProof/>
             <w:webHidden/>
           </w:rPr>
-          <w:instrText xml:space="preserve"> PAGEREF _Toc242871467 \h </w:instrText>
+          <w:instrText xml:space="preserve"> PAGEREF _Toc242872843 \h </w:instrText>
         </w:r>
         <w:r>
           <w:rPr>
@@ -1424,7 +1424,7 @@
           <w14:ligatures w14:val="standardContextual"/>
         </w:rPr>
       </w:pPr>
-      <w:hyperlink w:anchor="_Toc242871468" w:history="1">
+      <w:hyperlink w:anchor="_Toc242872844" w:history="1">
         <w:r>
           <w:rPr>
             <w:rStyle w:val="Hyperlink"/>
@@ -1451,7 +1451,7 @@
             <w:noProof/>
             <w:webHidden/>
           </w:rPr>
-          <w:instrText xml:space="preserve"> PAGEREF _Toc242871468 \h </w:instrText>
+          <w:instrText xml:space="preserve"> PAGEREF _Toc242872844 \h </w:instrText>
         </w:r>
         <w:r>
           <w:rPr>
@@ -1498,7 +1498,7 @@
           <w14:ligatures w14:val="standardContextual"/>
         </w:rPr>
       </w:pPr>
-      <w:hyperlink w:anchor="_Toc242871469" w:history="1">
+      <w:hyperlink w:anchor="_Toc242872845" w:history="1">
         <w:r>
           <w:rPr>
             <w:rStyle w:val="Hyperlink"/>
@@ -1525,7 +1525,7 @@
             <w:noProof/>
             <w:webHidden/>
           </w:rPr>
-          <w:instrText xml:space="preserve"> PAGEREF _Toc242871469 \h </w:instrText>
+          <w:instrText xml:space="preserve"> PAGEREF _Toc242872845 \h </w:instrText>
         </w:r>
         <w:r>
           <w:rPr>
@@ -1572,7 +1572,7 @@
           <w14:ligatures w14:val="standardContextual"/>
         </w:rPr>
       </w:pPr>
-      <w:hyperlink w:anchor="_Toc242871470" w:history="1">
+      <w:hyperlink w:anchor="_Toc242872846" w:history="1">
         <w:r>
           <w:rPr>
             <w:rStyle w:val="Hyperlink"/>
@@ -1599,7 +1599,7 @@
             <w:noProof/>
             <w:webHidden/>
           </w:rPr>
-          <w:instrText xml:space="preserve"> PAGEREF _Toc242871470 \h </w:instrText>
+          <w:instrText xml:space="preserve"> PAGEREF _Toc242872846 \h </w:instrText>
         </w:r>
         <w:r>
           <w:rPr>
@@ -1646,7 +1646,7 @@
           <w14:ligatures w14:val="standardContextual"/>
         </w:rPr>
       </w:pPr>
-      <w:hyperlink w:anchor="_Toc242871471" w:history="1">
+      <w:hyperlink w:anchor="_Toc242872847" w:history="1">
         <w:r>
           <w:rPr>
             <w:rStyle w:val="Hyperlink"/>
@@ -1673,7 +1673,7 @@
             <w:noProof/>
             <w:webHidden/>
           </w:rPr>
-          <w:instrText xml:space="preserve"> PAGEREF _Toc242871471 \h </w:instrText>
+          <w:instrText xml:space="preserve"> PAGEREF _Toc242872847 \h </w:instrText>
         </w:r>
         <w:r>
           <w:rPr>
@@ -1720,7 +1720,7 @@
           <w14:ligatures w14:val="standardContextual"/>
         </w:rPr>
       </w:pPr>
-      <w:hyperlink w:anchor="_Toc242871472" w:history="1">
+      <w:hyperlink w:anchor="_Toc242872848" w:history="1">
         <w:r>
           <w:rPr>
             <w:rStyle w:val="Hyperlink"/>
@@ -1747,7 +1747,7 @@
             <w:noProof/>
             <w:webHidden/>
           </w:rPr>
-          <w:instrText xml:space="preserve"> PAGEREF _Toc242871472 \h </w:instrText>
+          <w:instrText xml:space="preserve"> PAGEREF _Toc242872848 \h </w:instrText>
         </w:r>
         <w:r>
           <w:rPr>
@@ -1795,7 +1795,7 @@
           <w14:ligatures w14:val="standardContextual"/>
         </w:rPr>
       </w:pPr>
-      <w:hyperlink w:anchor="_Toc242871473" w:history="1">
+      <w:hyperlink w:anchor="_Toc242872849" w:history="1">
         <w:r>
           <w:rPr>
             <w:rStyle w:val="Hyperlink"/>
@@ -1822,7 +1822,7 @@
             <w:noProof/>
             <w:webHidden/>
           </w:rPr>
-          <w:instrText xml:space="preserve"> PAGEREF _Toc242871473 \h </w:instrText>
+          <w:instrText xml:space="preserve"> PAGEREF _Toc242872849 \h </w:instrText>
         </w:r>
         <w:r>
           <w:rPr>
@@ -1869,7 +1869,7 @@
           <w14:ligatures w14:val="standardContextual"/>
         </w:rPr>
       </w:pPr>
-      <w:hyperlink w:anchor="_Toc242871474" w:history="1">
+      <w:hyperlink w:anchor="_Toc242872850" w:history="1">
         <w:r>
           <w:rPr>
             <w:rStyle w:val="Hyperlink"/>
@@ -1896,7 +1896,7 @@
             <w:noProof/>
             <w:webHidden/>
           </w:rPr>
-          <w:instrText xml:space="preserve"> PAGEREF _Toc242871474 \h </w:instrText>
+          <w:instrText xml:space="preserve"> PAGEREF _Toc242872850 \h </w:instrText>
         </w:r>
         <w:r>
           <w:rPr>
@@ -1943,7 +1943,7 @@
           <w14:ligatures w14:val="standardContextual"/>
         </w:rPr>
       </w:pPr>
-      <w:hyperlink w:anchor="_Toc242871475" w:history="1">
+      <w:hyperlink w:anchor="_Toc242872851" w:history="1">
         <w:r>
           <w:rPr>
             <w:rStyle w:val="Hyperlink"/>
@@ -1970,7 +1970,7 @@
             <w:noProof/>
             <w:webHidden/>
           </w:rPr>
-          <w:instrText xml:space="preserve"> PAGEREF _Toc242871475 \h </w:instrText>
+          <w:instrText xml:space="preserve"> PAGEREF _Toc242872851 \h </w:instrText>
         </w:r>
         <w:r>
           <w:rPr>
@@ -2017,7 +2017,7 @@
           <w14:ligatures w14:val="standardContextual"/>
         </w:rPr>
       </w:pPr>
-      <w:hyperlink w:anchor="_Toc242871476" w:history="1">
+      <w:hyperlink w:anchor="_Toc242872852" w:history="1">
         <w:r>
           <w:rPr>
             <w:rStyle w:val="Hyperlink"/>
@@ -2044,7 +2044,7 @@
             <w:noProof/>
             <w:webHidden/>
           </w:rPr>
-          <w:instrText xml:space="preserve"> PAGEREF _Toc242871476 \h </w:instrText>
+          <w:instrText xml:space="preserve"> PAGEREF _Toc242872852 \h </w:instrText>
         </w:r>
         <w:r>
           <w:rPr>
@@ -2091,7 +2091,7 @@
           <w14:ligatures w14:val="standardContextual"/>
         </w:rPr>
       </w:pPr>
-      <w:hyperlink w:anchor="_Toc242871477" w:history="1">
+      <w:hyperlink w:anchor="_Toc242872853" w:history="1">
         <w:r>
           <w:rPr>
             <w:rStyle w:val="Hyperlink"/>
@@ -2118,7 +2118,7 @@
             <w:noProof/>
             <w:webHidden/>
           </w:rPr>
-          <w:instrText xml:space="preserve"> PAGEREF _Toc242871477 \h </w:instrText>
+          <w:instrText xml:space="preserve"> PAGEREF _Toc242872853 \h </w:instrText>
         </w:r>
         <w:r>
           <w:rPr>
@@ -2165,7 +2165,7 @@
           <w14:ligatures w14:val="standardContextual"/>
         </w:rPr>
       </w:pPr>
-      <w:hyperlink w:anchor="_Toc242871478" w:history="1">
+      <w:hyperlink w:anchor="_Toc242872854" w:history="1">
         <w:r>
           <w:rPr>
             <w:rStyle w:val="Hyperlink"/>
@@ -2192,7 +2192,7 @@
             <w:noProof/>
             <w:webHidden/>
           </w:rPr>
-          <w:instrText xml:space="preserve"> PAGEREF _Toc242871478 \h </w:instrText>
+          <w:instrText xml:space="preserve"> PAGEREF _Toc242872854 \h </w:instrText>
         </w:r>
         <w:r>
           <w:rPr>
@@ -2239,7 +2239,7 @@
           <w14:ligatures w14:val="standardContextual"/>
         </w:rPr>
       </w:pPr>
-      <w:hyperlink w:anchor="_Toc242871479" w:history="1">
+      <w:hyperlink w:anchor="_Toc242872855" w:history="1">
         <w:r>
           <w:rPr>
             <w:rStyle w:val="Hyperlink"/>
@@ -2266,7 +2266,7 @@
             <w:noProof/>
             <w:webHidden/>
           </w:rPr>
-          <w:instrText xml:space="preserve"> PAGEREF _Toc242871479 \h </w:instrText>
+          <w:instrText xml:space="preserve"> PAGEREF _Toc242872855 \h </w:instrText>
         </w:r>
         <w:r>
           <w:rPr>
@@ -2314,7 +2314,7 @@
           <w14:ligatures w14:val="standardContextual"/>
         </w:rPr>
       </w:pPr>
-      <w:hyperlink w:anchor="_Toc242871480" w:history="1">
+      <w:hyperlink w:anchor="_Toc242872856" w:history="1">
         <w:r>
           <w:rPr>
             <w:rStyle w:val="Hyperlink"/>
@@ -2341,7 +2341,7 @@
             <w:noProof/>
             <w:webHidden/>
           </w:rPr>
-          <w:instrText xml:space="preserve"> PAGEREF _Toc242871480 \h </w:instrText>
+          <w:instrText xml:space="preserve"> PAGEREF _Toc242872856 \h </w:instrText>
         </w:r>
         <w:r>
           <w:rPr>
@@ -2388,7 +2388,7 @@
           <w14:ligatures w14:val="standardContextual"/>
         </w:rPr>
       </w:pPr>
-      <w:hyperlink w:anchor="_Toc242871481" w:history="1">
+      <w:hyperlink w:anchor="_Toc242872857" w:history="1">
         <w:r>
           <w:rPr>
             <w:rStyle w:val="Hyperlink"/>
@@ -2415,7 +2415,7 @@
             <w:noProof/>
             <w:webHidden/>
           </w:rPr>
-          <w:instrText xml:space="preserve"> PAGEREF _Toc242871481 \h </w:instrText>
+          <w:instrText xml:space="preserve"> PAGEREF _Toc242872857 \h </w:instrText>
         </w:r>
         <w:r>
           <w:rPr>
@@ -2462,7 +2462,7 @@
           <w14:ligatures w14:val="standardContextual"/>
         </w:rPr>
       </w:pPr>
-      <w:hyperlink w:anchor="_Toc242871482" w:history="1">
+      <w:hyperlink w:anchor="_Toc242872858" w:history="1">
         <w:r>
           <w:rPr>
             <w:rStyle w:val="Hyperlink"/>
@@ -2489,7 +2489,7 @@
             <w:noProof/>
             <w:webHidden/>
           </w:rPr>
-          <w:instrText xml:space="preserve"> PAGEREF _Toc242871482 \h </w:instrText>
+          <w:instrText xml:space="preserve"> PAGEREF _Toc242872858 \h </w:instrText>
         </w:r>
         <w:r>
           <w:rPr>
@@ -2536,7 +2536,7 @@
           <w14:ligatures w14:val="standardContextual"/>
         </w:rPr>
       </w:pPr>
-      <w:hyperlink w:anchor="_Toc242871483" w:history="1">
+      <w:hyperlink w:anchor="_Toc242872859" w:history="1">
         <w:r>
           <w:rPr>
             <w:rStyle w:val="Hyperlink"/>
@@ -2563,7 +2563,7 @@
             <w:noProof/>
             <w:webHidden/>
           </w:rPr>
-          <w:instrText xml:space="preserve"> PAGEREF _Toc242871483 \h </w:instrText>
+          <w:instrText xml:space="preserve"> PAGEREF _Toc242872859 \h </w:instrText>
         </w:r>
         <w:r>
           <w:rPr>
@@ -2622,6 +2622,7 @@
       <w:bookmarkStart w:id="0" w:name="_Toc242299335"/>
       <w:bookmarkStart w:id="1" w:name="_Toc242827603"/>
       <w:bookmarkStart w:id="2" w:name="_Toc242871456"/>
+      <w:bookmarkStart w:id="3" w:name="_Toc242872832"/>
       <w:r>
         <w:lastRenderedPageBreak/>
         <w:t>Chương 1 Tổng quan đề tài và yêu cầu học phần</w:t>
@@ -2629,20 +2630,23 @@
       <w:bookmarkEnd w:id="0"/>
       <w:bookmarkEnd w:id="1"/>
       <w:bookmarkEnd w:id="2"/>
+      <w:bookmarkEnd w:id="3"/>
     </w:p>
     <w:p>
       <w:pPr>
         <w:pStyle w:val="Heading2"/>
       </w:pPr>
-      <w:bookmarkStart w:id="3" w:name="_Toc242299336"/>
-      <w:bookmarkStart w:id="4" w:name="_Toc242827604"/>
-      <w:bookmarkStart w:id="5" w:name="_Toc242871457"/>
+      <w:bookmarkStart w:id="4" w:name="_Toc242299336"/>
+      <w:bookmarkStart w:id="5" w:name="_Toc242827604"/>
+      <w:bookmarkStart w:id="6" w:name="_Toc242871457"/>
+      <w:bookmarkStart w:id="7" w:name="_Toc242872833"/>
       <w:r>
         <w:t>1.1 Bối cảnh, mục tiêu và phạm vi</w:t>
       </w:r>
-      <w:bookmarkEnd w:id="3"/>
       <w:bookmarkEnd w:id="4"/>
       <w:bookmarkEnd w:id="5"/>
+      <w:bookmarkEnd w:id="6"/>
+      <w:bookmarkEnd w:id="7"/>
     </w:p>
     <w:p>
       <w:pPr>
@@ -2709,15 +2713,17 @@
       <w:pPr>
         <w:pStyle w:val="Heading2"/>
       </w:pPr>
-      <w:bookmarkStart w:id="6" w:name="_Toc242299337"/>
-      <w:bookmarkStart w:id="7" w:name="_Toc242827605"/>
-      <w:bookmarkStart w:id="8" w:name="_Toc242871458"/>
+      <w:bookmarkStart w:id="8" w:name="_Toc242299337"/>
+      <w:bookmarkStart w:id="9" w:name="_Toc242827605"/>
+      <w:bookmarkStart w:id="10" w:name="_Toc242871458"/>
+      <w:bookmarkStart w:id="11" w:name="_Toc242872834"/>
       <w:r>
         <w:t>1.2 Yêu cầu chức năng và kết quả triển khai</w:t>
       </w:r>
-      <w:bookmarkEnd w:id="6"/>
-      <w:bookmarkEnd w:id="7"/>
       <w:bookmarkEnd w:id="8"/>
+      <w:bookmarkEnd w:id="9"/>
+      <w:bookmarkEnd w:id="10"/>
+      <w:bookmarkEnd w:id="11"/>
     </w:p>
     <w:p>
       <w:pPr>
@@ -3309,16 +3315,18 @@
       <w:pPr>
         <w:pStyle w:val="Heading2"/>
       </w:pPr>
-      <w:bookmarkStart w:id="9" w:name="_Toc242299338"/>
-      <w:bookmarkStart w:id="10" w:name="_Toc242827606"/>
-      <w:bookmarkStart w:id="11" w:name="_Toc242871459"/>
+      <w:bookmarkStart w:id="12" w:name="_Toc242299338"/>
+      <w:bookmarkStart w:id="13" w:name="_Toc242827606"/>
+      <w:bookmarkStart w:id="14" w:name="_Toc242871459"/>
+      <w:bookmarkStart w:id="15" w:name="_Toc242872835"/>
       <w:r>
         <w:lastRenderedPageBreak/>
         <w:t>1.3 Kiến trúc tổng thể</w:t>
       </w:r>
-      <w:bookmarkEnd w:id="9"/>
-      <w:bookmarkEnd w:id="10"/>
-      <w:bookmarkEnd w:id="11"/>
+      <w:bookmarkEnd w:id="12"/>
+      <w:bookmarkEnd w:id="13"/>
+      <w:bookmarkEnd w:id="14"/>
+      <w:bookmarkEnd w:id="15"/>
     </w:p>
     <w:p>
       <w:pPr>
@@ -3391,16 +3399,18 @@
         <w:pStyle w:val="Heading2"/>
         <w:pageBreakBefore/>
       </w:pPr>
-      <w:bookmarkStart w:id="12" w:name="_Toc242299339"/>
-      <w:bookmarkStart w:id="13" w:name="_Toc242827607"/>
-      <w:bookmarkStart w:id="14" w:name="_Toc242871460"/>
+      <w:bookmarkStart w:id="16" w:name="_Toc242299339"/>
+      <w:bookmarkStart w:id="17" w:name="_Toc242827607"/>
+      <w:bookmarkStart w:id="18" w:name="_Toc242871460"/>
+      <w:bookmarkStart w:id="19" w:name="_Toc242872836"/>
       <w:r>
         <w:lastRenderedPageBreak/>
         <w:t>1.4 Nguồn số liệu và mốc đo</w:t>
       </w:r>
-      <w:bookmarkEnd w:id="12"/>
-      <w:bookmarkEnd w:id="13"/>
-      <w:bookmarkEnd w:id="14"/>
+      <w:bookmarkEnd w:id="16"/>
+      <w:bookmarkEnd w:id="17"/>
+      <w:bookmarkEnd w:id="18"/>
+      <w:bookmarkEnd w:id="19"/>
     </w:p>
     <w:p>
       <w:pPr>
@@ -4272,16 +4282,18 @@
         <w:pageBreakBefore/>
         <w:jc w:val="left"/>
       </w:pPr>
-      <w:bookmarkStart w:id="15" w:name="_Toc242299340"/>
-      <w:bookmarkStart w:id="16" w:name="_Toc242827608"/>
-      <w:bookmarkStart w:id="17" w:name="_Toc242871461"/>
+      <w:bookmarkStart w:id="20" w:name="_Toc242299340"/>
+      <w:bookmarkStart w:id="21" w:name="_Toc242827608"/>
+      <w:bookmarkStart w:id="22" w:name="_Toc242871461"/>
+      <w:bookmarkStart w:id="23" w:name="_Toc242872837"/>
       <w:r>
         <w:lastRenderedPageBreak/>
         <w:t>Chương 2 Báo cáo tiến độ Tuần 1</w:t>
       </w:r>
-      <w:bookmarkEnd w:id="15"/>
-      <w:bookmarkEnd w:id="16"/>
-      <w:bookmarkEnd w:id="17"/>
+      <w:bookmarkEnd w:id="20"/>
+      <w:bookmarkEnd w:id="21"/>
+      <w:bookmarkEnd w:id="22"/>
+      <w:bookmarkEnd w:id="23"/>
     </w:p>
     <w:p>
       <w:pPr>
@@ -4296,15 +4308,17 @@
       <w:pPr>
         <w:pStyle w:val="Heading2"/>
       </w:pPr>
-      <w:bookmarkStart w:id="18" w:name="_Toc242299341"/>
-      <w:bookmarkStart w:id="19" w:name="_Toc242827609"/>
-      <w:bookmarkStart w:id="20" w:name="_Toc242871462"/>
+      <w:bookmarkStart w:id="24" w:name="_Toc242299341"/>
+      <w:bookmarkStart w:id="25" w:name="_Toc242827609"/>
+      <w:bookmarkStart w:id="26" w:name="_Toc242871462"/>
+      <w:bookmarkStart w:id="27" w:name="_Toc242872838"/>
       <w:r>
         <w:t>2.1 Mục tiêu và phân công thực hiện</w:t>
       </w:r>
-      <w:bookmarkEnd w:id="18"/>
-      <w:bookmarkEnd w:id="19"/>
-      <w:bookmarkEnd w:id="20"/>
+      <w:bookmarkEnd w:id="24"/>
+      <w:bookmarkEnd w:id="25"/>
+      <w:bookmarkEnd w:id="26"/>
+      <w:bookmarkEnd w:id="27"/>
     </w:p>
     <w:p>
       <w:pPr>
@@ -4624,15 +4638,17 @@
       <w:pPr>
         <w:pStyle w:val="Heading2"/>
       </w:pPr>
-      <w:bookmarkStart w:id="21" w:name="_Toc242299342"/>
-      <w:bookmarkStart w:id="22" w:name="_Toc242827610"/>
-      <w:bookmarkStart w:id="23" w:name="_Toc242871463"/>
+      <w:bookmarkStart w:id="28" w:name="_Toc242299342"/>
+      <w:bookmarkStart w:id="29" w:name="_Toc242827610"/>
+      <w:bookmarkStart w:id="30" w:name="_Toc242871463"/>
+      <w:bookmarkStart w:id="31" w:name="_Toc242872839"/>
       <w:r>
         <w:t>2.2 Phạm vi và luồng dữ liệu đo</w:t>
       </w:r>
-      <w:bookmarkEnd w:id="21"/>
-      <w:bookmarkEnd w:id="22"/>
-      <w:bookmarkEnd w:id="23"/>
+      <w:bookmarkEnd w:id="28"/>
+      <w:bookmarkEnd w:id="29"/>
+      <w:bookmarkEnd w:id="30"/>
+      <w:bookmarkEnd w:id="31"/>
     </w:p>
     <w:p>
       <w:pPr>
@@ -5086,15 +5102,17 @@
       <w:pPr>
         <w:pStyle w:val="Heading2"/>
       </w:pPr>
-      <w:bookmarkStart w:id="24" w:name="_Toc242299343"/>
-      <w:bookmarkStart w:id="25" w:name="_Toc242827611"/>
-      <w:bookmarkStart w:id="26" w:name="_Toc242871464"/>
+      <w:bookmarkStart w:id="32" w:name="_Toc242299343"/>
+      <w:bookmarkStart w:id="33" w:name="_Toc242827611"/>
+      <w:bookmarkStart w:id="34" w:name="_Toc242871464"/>
+      <w:bookmarkStart w:id="35" w:name="_Toc242872840"/>
       <w:r>
         <w:t>2.3 Kết quả định lượng</w:t>
       </w:r>
-      <w:bookmarkEnd w:id="24"/>
-      <w:bookmarkEnd w:id="25"/>
-      <w:bookmarkEnd w:id="26"/>
+      <w:bookmarkEnd w:id="32"/>
+      <w:bookmarkEnd w:id="33"/>
+      <w:bookmarkEnd w:id="34"/>
+      <w:bookmarkEnd w:id="35"/>
     </w:p>
     <w:p>
       <w:pPr>
@@ -5619,30 +5637,34 @@
         <w:pageBreakBefore/>
         <w:jc w:val="left"/>
       </w:pPr>
-      <w:bookmarkStart w:id="27" w:name="_Toc242299344"/>
-      <w:bookmarkStart w:id="28" w:name="_Toc242827612"/>
-      <w:bookmarkStart w:id="29" w:name="_Toc242871465"/>
+      <w:bookmarkStart w:id="36" w:name="_Toc242299344"/>
+      <w:bookmarkStart w:id="37" w:name="_Toc242827612"/>
+      <w:bookmarkStart w:id="38" w:name="_Toc242871465"/>
+      <w:bookmarkStart w:id="39" w:name="_Toc242872841"/>
       <w:r>
         <w:lastRenderedPageBreak/>
         <w:t>Chương 3 Thiết kế và triển khai trên AWS Learner Lab</w:t>
       </w:r>
-      <w:bookmarkEnd w:id="27"/>
-      <w:bookmarkEnd w:id="28"/>
-      <w:bookmarkEnd w:id="29"/>
+      <w:bookmarkEnd w:id="36"/>
+      <w:bookmarkEnd w:id="37"/>
+      <w:bookmarkEnd w:id="38"/>
+      <w:bookmarkEnd w:id="39"/>
     </w:p>
     <w:p>
       <w:pPr>
         <w:pStyle w:val="Heading2"/>
       </w:pPr>
-      <w:bookmarkStart w:id="30" w:name="_Toc242299345"/>
-      <w:bookmarkStart w:id="31" w:name="_Toc242827613"/>
-      <w:bookmarkStart w:id="32" w:name="_Toc242871466"/>
+      <w:bookmarkStart w:id="40" w:name="_Toc242299345"/>
+      <w:bookmarkStart w:id="41" w:name="_Toc242827613"/>
+      <w:bookmarkStart w:id="42" w:name="_Toc242871466"/>
+      <w:bookmarkStart w:id="43" w:name="_Toc242872842"/>
       <w:r>
         <w:t>3.1 Danh mục dịch vụ và cấu hình thực tế</w:t>
       </w:r>
-      <w:bookmarkEnd w:id="30"/>
-      <w:bookmarkEnd w:id="31"/>
-      <w:bookmarkEnd w:id="32"/>
+      <w:bookmarkEnd w:id="40"/>
+      <w:bookmarkEnd w:id="41"/>
+      <w:bookmarkEnd w:id="42"/>
+      <w:bookmarkEnd w:id="43"/>
     </w:p>
     <w:p>
       <w:pPr>
@@ -6390,15 +6412,17 @@
       <w:pPr>
         <w:pStyle w:val="Heading2"/>
       </w:pPr>
-      <w:bookmarkStart w:id="33" w:name="_Toc242299346"/>
-      <w:bookmarkStart w:id="34" w:name="_Toc242827614"/>
-      <w:bookmarkStart w:id="35" w:name="_Toc242871467"/>
+      <w:bookmarkStart w:id="44" w:name="_Toc242299346"/>
+      <w:bookmarkStart w:id="45" w:name="_Toc242827614"/>
+      <w:bookmarkStart w:id="46" w:name="_Toc242871467"/>
+      <w:bookmarkStart w:id="47" w:name="_Toc242872843"/>
       <w:r>
         <w:t>3.2 Dữ liệu và phân vùng S3</w:t>
       </w:r>
-      <w:bookmarkEnd w:id="33"/>
-      <w:bookmarkEnd w:id="34"/>
-      <w:bookmarkEnd w:id="35"/>
+      <w:bookmarkEnd w:id="44"/>
+      <w:bookmarkEnd w:id="45"/>
+      <w:bookmarkEnd w:id="46"/>
+      <w:bookmarkEnd w:id="47"/>
     </w:p>
     <w:p>
       <w:pPr>
@@ -6471,15 +6495,17 @@
       <w:pPr>
         <w:pStyle w:val="Heading2"/>
       </w:pPr>
-      <w:bookmarkStart w:id="36" w:name="_Toc242299347"/>
-      <w:bookmarkStart w:id="37" w:name="_Toc242827615"/>
-      <w:bookmarkStart w:id="38" w:name="_Toc242871468"/>
+      <w:bookmarkStart w:id="48" w:name="_Toc242299347"/>
+      <w:bookmarkStart w:id="49" w:name="_Toc242827615"/>
+      <w:bookmarkStart w:id="50" w:name="_Toc242871468"/>
+      <w:bookmarkStart w:id="51" w:name="_Toc242872844"/>
       <w:r>
         <w:t>3.3 An toàn cấu hình và vận hành</w:t>
       </w:r>
-      <w:bookmarkEnd w:id="36"/>
-      <w:bookmarkEnd w:id="37"/>
-      <w:bookmarkEnd w:id="38"/>
+      <w:bookmarkEnd w:id="48"/>
+      <w:bookmarkEnd w:id="49"/>
+      <w:bookmarkEnd w:id="50"/>
+      <w:bookmarkEnd w:id="51"/>
     </w:p>
     <w:p>
       <w:pPr>
@@ -6494,16 +6520,18 @@
       <w:pPr>
         <w:pStyle w:val="Heading2"/>
       </w:pPr>
-      <w:bookmarkStart w:id="39" w:name="_Toc242299348"/>
-      <w:bookmarkStart w:id="40" w:name="_Toc242827616"/>
-      <w:bookmarkStart w:id="41" w:name="_Toc242871469"/>
+      <w:bookmarkStart w:id="52" w:name="_Toc242299348"/>
+      <w:bookmarkStart w:id="53" w:name="_Toc242827616"/>
+      <w:bookmarkStart w:id="54" w:name="_Toc242871469"/>
+      <w:bookmarkStart w:id="55" w:name="_Toc242872845"/>
       <w:r>
         <w:lastRenderedPageBreak/>
         <w:t>3.4 Trình tự xử lý của Lambda</w:t>
       </w:r>
-      <w:bookmarkEnd w:id="39"/>
-      <w:bookmarkEnd w:id="40"/>
-      <w:bookmarkEnd w:id="41"/>
+      <w:bookmarkEnd w:id="52"/>
+      <w:bookmarkEnd w:id="53"/>
+      <w:bookmarkEnd w:id="54"/>
+      <w:bookmarkEnd w:id="55"/>
     </w:p>
     <w:p>
       <w:pPr>
@@ -6520,7 +6548,7 @@
         <w:ind w:firstLine="504"/>
       </w:pPr>
       <w:r>
-        <w:t>Phiên bản Tuần 1 nạp dữ liệu lịch sử với past_hours=48, tính số ngày cần truy vấn rồi lấy tối đa 48 mốc cuối trong mảng thời gian. Hàm dùng chỉ số gốc của mảng khi nguồn trả ít mốc hơn dự kiến để giữ thời gian cùng vị trí với giá trị cảm biến. Mỗi bản ghi được gắn record_id có phần ngẫu nhiên; vì vậy một lần chạy lặp có thể tạo bản ghi trùng ý nghĩa dữ liệu.</w:t>
+        <w:t>Phiên bản Tuần 1 nạp dữ liệu lịch sử với past_hours=48, tính số ngày cần truy vấn rồi lấy tối đa 48 mốc cuối trong mảng thời gian. Hàm dùng chỉ số gốc của mảng khi nguồn trả ít mốc hơn dự kiến để giữ thời gian cùng vị trí với giá trị cảm biến. Mỗi bản ghi được gắn record_id có phần ngẫu nhiên; khi thu thập lại cùng thời điểm, cần đối chiếu thành phố và timestamp để xác định phạm vi quan trắc.</w:t>
       </w:r>
     </w:p>
     <w:p>
@@ -6536,15 +6564,17 @@
       <w:pPr>
         <w:pStyle w:val="Heading2"/>
       </w:pPr>
-      <w:bookmarkStart w:id="42" w:name="_Toc242299349"/>
-      <w:bookmarkStart w:id="43" w:name="_Toc242827617"/>
-      <w:bookmarkStart w:id="44" w:name="_Toc242871470"/>
+      <w:bookmarkStart w:id="56" w:name="_Toc242299349"/>
+      <w:bookmarkStart w:id="57" w:name="_Toc242827617"/>
+      <w:bookmarkStart w:id="58" w:name="_Toc242871470"/>
+      <w:bookmarkStart w:id="59" w:name="_Toc242872846"/>
       <w:r>
         <w:t>3.5 Truy vấn Athena và khả năng tái lập</w:t>
       </w:r>
-      <w:bookmarkEnd w:id="42"/>
-      <w:bookmarkEnd w:id="43"/>
-      <w:bookmarkEnd w:id="44"/>
+      <w:bookmarkEnd w:id="56"/>
+      <w:bookmarkEnd w:id="57"/>
+      <w:bookmarkEnd w:id="58"/>
+      <w:bookmarkEnd w:id="59"/>
     </w:p>
     <w:p>
       <w:pPr>
@@ -6800,15 +6830,17 @@
       <w:pPr>
         <w:pStyle w:val="Heading2"/>
       </w:pPr>
-      <w:bookmarkStart w:id="45" w:name="_Toc242299350"/>
-      <w:bookmarkStart w:id="46" w:name="_Toc242827618"/>
-      <w:bookmarkStart w:id="47" w:name="_Toc242871471"/>
+      <w:bookmarkStart w:id="60" w:name="_Toc242299350"/>
+      <w:bookmarkStart w:id="61" w:name="_Toc242827618"/>
+      <w:bookmarkStart w:id="62" w:name="_Toc242871471"/>
+      <w:bookmarkStart w:id="63" w:name="_Toc242872847"/>
       <w:r>
         <w:t>3.6 Lược đồ bản ghi và chất lượng dữ liệu</w:t>
       </w:r>
-      <w:bookmarkEnd w:id="45"/>
-      <w:bookmarkEnd w:id="46"/>
-      <w:bookmarkEnd w:id="47"/>
+      <w:bookmarkEnd w:id="60"/>
+      <w:bookmarkEnd w:id="61"/>
+      <w:bookmarkEnd w:id="62"/>
+      <w:bookmarkEnd w:id="63"/>
     </w:p>
     <w:p>
       <w:pPr>
@@ -7496,16 +7528,18 @@
       <w:pPr>
         <w:pStyle w:val="Heading2"/>
       </w:pPr>
-      <w:bookmarkStart w:id="48" w:name="_Toc242299351"/>
-      <w:bookmarkStart w:id="49" w:name="_Toc242827619"/>
-      <w:bookmarkStart w:id="50" w:name="_Toc242871472"/>
+      <w:bookmarkStart w:id="64" w:name="_Toc242299351"/>
+      <w:bookmarkStart w:id="65" w:name="_Toc242827619"/>
+      <w:bookmarkStart w:id="66" w:name="_Toc242871472"/>
+      <w:bookmarkStart w:id="67" w:name="_Toc242872848"/>
       <w:r>
         <w:lastRenderedPageBreak/>
         <w:t>3.7 Tần suất gọi Open-Meteo và yêu cầu khóa API</w:t>
       </w:r>
-      <w:bookmarkEnd w:id="48"/>
-      <w:bookmarkEnd w:id="49"/>
-      <w:bookmarkEnd w:id="50"/>
+      <w:bookmarkEnd w:id="64"/>
+      <w:bookmarkEnd w:id="65"/>
+      <w:bookmarkEnd w:id="66"/>
+      <w:bookmarkEnd w:id="67"/>
     </w:p>
     <w:p>
       <w:pPr>
@@ -7531,30 +7565,34 @@
         <w:pageBreakBefore/>
         <w:jc w:val="left"/>
       </w:pPr>
-      <w:bookmarkStart w:id="51" w:name="_Toc242299352"/>
-      <w:bookmarkStart w:id="52" w:name="_Toc242827620"/>
-      <w:bookmarkStart w:id="53" w:name="_Toc242871473"/>
+      <w:bookmarkStart w:id="68" w:name="_Toc242299352"/>
+      <w:bookmarkStart w:id="69" w:name="_Toc242827620"/>
+      <w:bookmarkStart w:id="70" w:name="_Toc242871473"/>
+      <w:bookmarkStart w:id="71" w:name="_Toc242872849"/>
       <w:r>
         <w:lastRenderedPageBreak/>
         <w:t>Chương 4 Kết quả kiểm tra và phân tích dữ liệu</w:t>
       </w:r>
-      <w:bookmarkEnd w:id="51"/>
-      <w:bookmarkEnd w:id="52"/>
-      <w:bookmarkEnd w:id="53"/>
+      <w:bookmarkEnd w:id="68"/>
+      <w:bookmarkEnd w:id="69"/>
+      <w:bookmarkEnd w:id="70"/>
+      <w:bookmarkEnd w:id="71"/>
     </w:p>
     <w:p>
       <w:pPr>
         <w:pStyle w:val="Heading2"/>
       </w:pPr>
-      <w:bookmarkStart w:id="54" w:name="_Toc242299353"/>
-      <w:bookmarkStart w:id="55" w:name="_Toc242827621"/>
-      <w:bookmarkStart w:id="56" w:name="_Toc242871474"/>
+      <w:bookmarkStart w:id="72" w:name="_Toc242299353"/>
+      <w:bookmarkStart w:id="73" w:name="_Toc242827621"/>
+      <w:bookmarkStart w:id="74" w:name="_Toc242871474"/>
+      <w:bookmarkStart w:id="75" w:name="_Toc242872850"/>
       <w:r>
         <w:t>4.1 Mốc dữ liệu và số đo vận hành AWS</w:t>
       </w:r>
-      <w:bookmarkEnd w:id="54"/>
-      <w:bookmarkEnd w:id="55"/>
-      <w:bookmarkEnd w:id="56"/>
+      <w:bookmarkEnd w:id="72"/>
+      <w:bookmarkEnd w:id="73"/>
+      <w:bookmarkEnd w:id="74"/>
+      <w:bookmarkEnd w:id="75"/>
     </w:p>
     <w:p>
       <w:pPr>
@@ -8240,16 +8278,18 @@
         <w:pStyle w:val="Heading2"/>
         <w:pageBreakBefore/>
       </w:pPr>
-      <w:bookmarkStart w:id="57" w:name="_Toc242299354"/>
-      <w:bookmarkStart w:id="58" w:name="_Toc242827622"/>
-      <w:bookmarkStart w:id="59" w:name="_Toc242871475"/>
+      <w:bookmarkStart w:id="76" w:name="_Toc242299354"/>
+      <w:bookmarkStart w:id="77" w:name="_Toc242827622"/>
+      <w:bookmarkStart w:id="78" w:name="_Toc242871475"/>
+      <w:bookmarkStart w:id="79" w:name="_Toc242872851"/>
       <w:r>
         <w:lastRenderedPageBreak/>
         <w:t>4.2 So sánh ba đô thị từ Athena</w:t>
       </w:r>
-      <w:bookmarkEnd w:id="57"/>
-      <w:bookmarkEnd w:id="58"/>
-      <w:bookmarkEnd w:id="59"/>
+      <w:bookmarkEnd w:id="76"/>
+      <w:bookmarkEnd w:id="77"/>
+      <w:bookmarkEnd w:id="78"/>
+      <w:bookmarkEnd w:id="79"/>
     </w:p>
     <w:p>
       <w:pPr>
@@ -9455,15 +9495,17 @@
       <w:pPr>
         <w:pStyle w:val="Heading2"/>
       </w:pPr>
-      <w:bookmarkStart w:id="60" w:name="_Toc242299355"/>
-      <w:bookmarkStart w:id="61" w:name="_Toc242827623"/>
-      <w:bookmarkStart w:id="62" w:name="_Toc242871476"/>
+      <w:bookmarkStart w:id="80" w:name="_Toc242299355"/>
+      <w:bookmarkStart w:id="81" w:name="_Toc242827623"/>
+      <w:bookmarkStart w:id="82" w:name="_Toc242871476"/>
+      <w:bookmarkStart w:id="83" w:name="_Toc242872852"/>
       <w:r>
         <w:t>4.3 Biến thiên theo 24 giờ UTC</w:t>
       </w:r>
-      <w:bookmarkEnd w:id="60"/>
-      <w:bookmarkEnd w:id="61"/>
-      <w:bookmarkEnd w:id="62"/>
+      <w:bookmarkEnd w:id="80"/>
+      <w:bookmarkEnd w:id="81"/>
+      <w:bookmarkEnd w:id="82"/>
+      <w:bookmarkEnd w:id="83"/>
     </w:p>
     <w:p>
       <w:pPr>
@@ -12734,15 +12776,17 @@
       <w:pPr>
         <w:pStyle w:val="Heading2"/>
       </w:pPr>
-      <w:bookmarkStart w:id="63" w:name="_Toc242299356"/>
-      <w:bookmarkStart w:id="64" w:name="_Toc242827624"/>
-      <w:bookmarkStart w:id="65" w:name="_Toc242871477"/>
+      <w:bookmarkStart w:id="84" w:name="_Toc242299356"/>
+      <w:bookmarkStart w:id="85" w:name="_Toc242827624"/>
+      <w:bookmarkStart w:id="86" w:name="_Toc242871477"/>
+      <w:bookmarkStart w:id="87" w:name="_Toc242872853"/>
       <w:r>
         <w:t>4.4 Phân bố cấp chất lượng không khí</w:t>
       </w:r>
-      <w:bookmarkEnd w:id="63"/>
-      <w:bookmarkEnd w:id="64"/>
-      <w:bookmarkEnd w:id="65"/>
+      <w:bookmarkEnd w:id="84"/>
+      <w:bookmarkEnd w:id="85"/>
+      <w:bookmarkEnd w:id="86"/>
+      <w:bookmarkEnd w:id="87"/>
     </w:p>
     <w:p>
       <w:pPr>
@@ -13377,15 +13421,17 @@
       <w:pPr>
         <w:pStyle w:val="Heading2"/>
       </w:pPr>
-      <w:bookmarkStart w:id="66" w:name="_Toc242299357"/>
-      <w:bookmarkStart w:id="67" w:name="_Toc242827625"/>
-      <w:bookmarkStart w:id="68" w:name="_Toc242871478"/>
+      <w:bookmarkStart w:id="88" w:name="_Toc242299357"/>
+      <w:bookmarkStart w:id="89" w:name="_Toc242827625"/>
+      <w:bookmarkStart w:id="90" w:name="_Toc242871478"/>
+      <w:bookmarkStart w:id="91" w:name="_Toc242872854"/>
       <w:r>
         <w:t>4.5 Tương quan PM2.5 với yếu tố khí tượng</w:t>
       </w:r>
-      <w:bookmarkEnd w:id="66"/>
-      <w:bookmarkEnd w:id="67"/>
-      <w:bookmarkEnd w:id="68"/>
+      <w:bookmarkEnd w:id="88"/>
+      <w:bookmarkEnd w:id="89"/>
+      <w:bookmarkEnd w:id="90"/>
+      <w:bookmarkEnd w:id="91"/>
     </w:p>
     <w:p>
       <w:pPr>
@@ -13918,16 +13964,18 @@
         <w:pStyle w:val="Heading2"/>
         <w:pageBreakBefore/>
       </w:pPr>
-      <w:bookmarkStart w:id="69" w:name="_Toc242299358"/>
-      <w:bookmarkStart w:id="70" w:name="_Toc242827626"/>
-      <w:bookmarkStart w:id="71" w:name="_Toc242871479"/>
+      <w:bookmarkStart w:id="92" w:name="_Toc242299358"/>
+      <w:bookmarkStart w:id="93" w:name="_Toc242827626"/>
+      <w:bookmarkStart w:id="94" w:name="_Toc242871479"/>
+      <w:bookmarkStart w:id="95" w:name="_Toc242872855"/>
       <w:r>
         <w:lastRenderedPageBreak/>
         <w:t>4.6 Thời gian và dung lượng quét của năm truy vấn</w:t>
       </w:r>
-      <w:bookmarkEnd w:id="69"/>
-      <w:bookmarkEnd w:id="70"/>
-      <w:bookmarkEnd w:id="71"/>
+      <w:bookmarkEnd w:id="92"/>
+      <w:bookmarkEnd w:id="93"/>
+      <w:bookmarkEnd w:id="94"/>
+      <w:bookmarkEnd w:id="95"/>
     </w:p>
     <w:p>
       <w:pPr>
@@ -14766,30 +14814,34 @@
         <w:pageBreakBefore/>
         <w:jc w:val="left"/>
       </w:pPr>
-      <w:bookmarkStart w:id="72" w:name="_Toc242299359"/>
-      <w:bookmarkStart w:id="73" w:name="_Toc242827627"/>
-      <w:bookmarkStart w:id="74" w:name="_Toc242871480"/>
+      <w:bookmarkStart w:id="96" w:name="_Toc242299359"/>
+      <w:bookmarkStart w:id="97" w:name="_Toc242827627"/>
+      <w:bookmarkStart w:id="98" w:name="_Toc242871480"/>
+      <w:bookmarkStart w:id="99" w:name="_Toc242872856"/>
       <w:r>
         <w:lastRenderedPageBreak/>
         <w:t>Chương 5 Tổng hợp kết quả và chi phí Tuần 1</w:t>
       </w:r>
-      <w:bookmarkEnd w:id="72"/>
-      <w:bookmarkEnd w:id="73"/>
-      <w:bookmarkEnd w:id="74"/>
+      <w:bookmarkEnd w:id="96"/>
+      <w:bookmarkEnd w:id="97"/>
+      <w:bookmarkEnd w:id="98"/>
+      <w:bookmarkEnd w:id="99"/>
     </w:p>
     <w:p>
       <w:pPr>
         <w:pStyle w:val="Heading2"/>
       </w:pPr>
-      <w:bookmarkStart w:id="75" w:name="_Toc242299360"/>
-      <w:bookmarkStart w:id="76" w:name="_Toc242827628"/>
-      <w:bookmarkStart w:id="77" w:name="_Toc242871481"/>
+      <w:bookmarkStart w:id="100" w:name="_Toc242299360"/>
+      <w:bookmarkStart w:id="101" w:name="_Toc242827628"/>
+      <w:bookmarkStart w:id="102" w:name="_Toc242871481"/>
+      <w:bookmarkStart w:id="103" w:name="_Toc242872857"/>
       <w:r>
         <w:t>5.1 Mức độ hoàn thành theo sản phẩm</w:t>
       </w:r>
-      <w:bookmarkEnd w:id="75"/>
-      <w:bookmarkEnd w:id="76"/>
-      <w:bookmarkEnd w:id="77"/>
+      <w:bookmarkEnd w:id="100"/>
+      <w:bookmarkEnd w:id="101"/>
+      <w:bookmarkEnd w:id="102"/>
+      <w:bookmarkEnd w:id="103"/>
     </w:p>
     <w:p>
       <w:pPr>
@@ -14804,15 +14856,17 @@
       <w:pPr>
         <w:pStyle w:val="Heading2"/>
       </w:pPr>
-      <w:bookmarkStart w:id="78" w:name="_Toc242299361"/>
-      <w:bookmarkStart w:id="79" w:name="_Toc242827629"/>
-      <w:bookmarkStart w:id="80" w:name="_Toc242871482"/>
+      <w:bookmarkStart w:id="104" w:name="_Toc242299361"/>
+      <w:bookmarkStart w:id="105" w:name="_Toc242827629"/>
+      <w:bookmarkStart w:id="106" w:name="_Toc242871482"/>
+      <w:bookmarkStart w:id="107" w:name="_Toc242872858"/>
       <w:r>
         <w:t>5.2 Quản lý chi phí</w:t>
       </w:r>
-      <w:bookmarkEnd w:id="78"/>
-      <w:bookmarkEnd w:id="79"/>
-      <w:bookmarkEnd w:id="80"/>
+      <w:bookmarkEnd w:id="104"/>
+      <w:bookmarkEnd w:id="105"/>
+      <w:bookmarkEnd w:id="106"/>
+      <w:bookmarkEnd w:id="107"/>
     </w:p>
     <w:p>
       <w:pPr>
@@ -15344,15 +15398,17 @@
       <w:pPr>
         <w:pStyle w:val="Heading2"/>
       </w:pPr>
-      <w:bookmarkStart w:id="81" w:name="_Toc242299362"/>
-      <w:bookmarkStart w:id="82" w:name="_Toc242827630"/>
-      <w:bookmarkStart w:id="83" w:name="_Toc242871483"/>
+      <w:bookmarkStart w:id="108" w:name="_Toc242299362"/>
+      <w:bookmarkStart w:id="109" w:name="_Toc242827630"/>
+      <w:bookmarkStart w:id="110" w:name="_Toc242871483"/>
+      <w:bookmarkStart w:id="111" w:name="_Toc242872859"/>
       <w:r>
         <w:t>5.3 Kết luận</w:t>
       </w:r>
-      <w:bookmarkEnd w:id="81"/>
-      <w:bookmarkEnd w:id="82"/>
-      <w:bookmarkEnd w:id="83"/>
+      <w:bookmarkEnd w:id="108"/>
+      <w:bookmarkEnd w:id="109"/>
+      <w:bookmarkEnd w:id="110"/>
+      <w:bookmarkEnd w:id="111"/>
     </w:p>
     <w:p>
       <w:pPr>

</xml_diff>

<commit_message>
docs(reports): remove revision notes and refine weekly presentation
</commit_message>
<xml_diff>
--- a/tuan_1/docs/Bao_cao_tuan_1_Dien_toan_dam_may_Nhom_05.docx
+++ b/tuan_1/docs/Bao_cao_tuan_1_Dien_toan_dam_may_Nhom_05.docx
@@ -420,7 +420,7 @@
         <w:ind w:firstLine="504"/>
       </w:pPr>
       <w:r>
-        <w:t>Theo phân công nhóm xác nhận, Sơn phụ trách S3, Secrets Manager, Lambda và SNS; Quyên phụ trách Glue, Athena và phân tích biểu đồ. Hai thành viên cùng thực hiện kiến trúc, tích hợp và báo cáo. Các số liệu trong tài liệu thuộc tập dữ liệu và các lượt quan sát của Tuần 1.</w:t>
+        <w:t>Theo phân công nhóm xác nhận, sinh viên Tiến Sơn phụ trách S3, Secrets Manager, Lambda và SNS; sinh viên Ngọc Quyên phụ trách Glue, Athena và phân tích biểu đồ. Hai thành viên cùng thực hiện kiến trúc, tích hợp và báo cáo. Các số liệu trong tài liệu thuộc tập dữ liệu và các lượt quan sát của Tuần 1.</w:t>
       </w:r>
     </w:p>
     <w:p>
@@ -534,7 +534,7 @@
         </w:rPr>
         <w:fldChar w:fldCharType="separate"/>
       </w:r>
-      <w:hyperlink w:anchor="_Toc242872832" w:history="1">
+      <w:hyperlink w:anchor="_Toc242878392" w:history="1">
         <w:r>
           <w:rPr>
             <w:rStyle w:val="Hyperlink"/>
@@ -561,7 +561,7 @@
             <w:noProof/>
             <w:webHidden/>
           </w:rPr>
-          <w:instrText xml:space="preserve"> PAGEREF _Toc242872832 \h </w:instrText>
+          <w:instrText xml:space="preserve"> PAGEREF _Toc242878392 \h </w:instrText>
         </w:r>
         <w:r>
           <w:rPr>
@@ -608,7 +608,7 @@
           <w14:ligatures w14:val="standardContextual"/>
         </w:rPr>
       </w:pPr>
-      <w:hyperlink w:anchor="_Toc242872833" w:history="1">
+      <w:hyperlink w:anchor="_Toc242878393" w:history="1">
         <w:r>
           <w:rPr>
             <w:rStyle w:val="Hyperlink"/>
@@ -635,7 +635,7 @@
             <w:noProof/>
             <w:webHidden/>
           </w:rPr>
-          <w:instrText xml:space="preserve"> PAGEREF _Toc242872833 \h </w:instrText>
+          <w:instrText xml:space="preserve"> PAGEREF _Toc242878393 \h </w:instrText>
         </w:r>
         <w:r>
           <w:rPr>
@@ -682,7 +682,7 @@
           <w14:ligatures w14:val="standardContextual"/>
         </w:rPr>
       </w:pPr>
-      <w:hyperlink w:anchor="_Toc242872834" w:history="1">
+      <w:hyperlink w:anchor="_Toc242878394" w:history="1">
         <w:r>
           <w:rPr>
             <w:rStyle w:val="Hyperlink"/>
@@ -709,7 +709,7 @@
             <w:noProof/>
             <w:webHidden/>
           </w:rPr>
-          <w:instrText xml:space="preserve"> PAGEREF _Toc242872834 \h </w:instrText>
+          <w:instrText xml:space="preserve"> PAGEREF _Toc242878394 \h </w:instrText>
         </w:r>
         <w:r>
           <w:rPr>
@@ -756,7 +756,7 @@
           <w14:ligatures w14:val="standardContextual"/>
         </w:rPr>
       </w:pPr>
-      <w:hyperlink w:anchor="_Toc242872835" w:history="1">
+      <w:hyperlink w:anchor="_Toc242878395" w:history="1">
         <w:r>
           <w:rPr>
             <w:rStyle w:val="Hyperlink"/>
@@ -783,7 +783,7 @@
             <w:noProof/>
             <w:webHidden/>
           </w:rPr>
-          <w:instrText xml:space="preserve"> PAGEREF _Toc242872835 \h </w:instrText>
+          <w:instrText xml:space="preserve"> PAGEREF _Toc242878395 \h </w:instrText>
         </w:r>
         <w:r>
           <w:rPr>
@@ -830,7 +830,7 @@
           <w14:ligatures w14:val="standardContextual"/>
         </w:rPr>
       </w:pPr>
-      <w:hyperlink w:anchor="_Toc242872836" w:history="1">
+      <w:hyperlink w:anchor="_Toc242878396" w:history="1">
         <w:r>
           <w:rPr>
             <w:rStyle w:val="Hyperlink"/>
@@ -857,7 +857,7 @@
             <w:noProof/>
             <w:webHidden/>
           </w:rPr>
-          <w:instrText xml:space="preserve"> PAGEREF _Toc242872836 \h </w:instrText>
+          <w:instrText xml:space="preserve"> PAGEREF _Toc242878396 \h </w:instrText>
         </w:r>
         <w:r>
           <w:rPr>
@@ -905,7 +905,7 @@
           <w14:ligatures w14:val="standardContextual"/>
         </w:rPr>
       </w:pPr>
-      <w:hyperlink w:anchor="_Toc242872837" w:history="1">
+      <w:hyperlink w:anchor="_Toc242878397" w:history="1">
         <w:r>
           <w:rPr>
             <w:rStyle w:val="Hyperlink"/>
@@ -932,7 +932,7 @@
             <w:noProof/>
             <w:webHidden/>
           </w:rPr>
-          <w:instrText xml:space="preserve"> PAGEREF _Toc242872837 \h </w:instrText>
+          <w:instrText xml:space="preserve"> PAGEREF _Toc242878397 \h </w:instrText>
         </w:r>
         <w:r>
           <w:rPr>
@@ -979,7 +979,7 @@
           <w14:ligatures w14:val="standardContextual"/>
         </w:rPr>
       </w:pPr>
-      <w:hyperlink w:anchor="_Toc242872838" w:history="1">
+      <w:hyperlink w:anchor="_Toc242878398" w:history="1">
         <w:r>
           <w:rPr>
             <w:rStyle w:val="Hyperlink"/>
@@ -1006,7 +1006,7 @@
             <w:noProof/>
             <w:webHidden/>
           </w:rPr>
-          <w:instrText xml:space="preserve"> PAGEREF _Toc242872838 \h </w:instrText>
+          <w:instrText xml:space="preserve"> PAGEREF _Toc242878398 \h </w:instrText>
         </w:r>
         <w:r>
           <w:rPr>
@@ -1053,7 +1053,7 @@
           <w14:ligatures w14:val="standardContextual"/>
         </w:rPr>
       </w:pPr>
-      <w:hyperlink w:anchor="_Toc242872839" w:history="1">
+      <w:hyperlink w:anchor="_Toc242878399" w:history="1">
         <w:r>
           <w:rPr>
             <w:rStyle w:val="Hyperlink"/>
@@ -1080,7 +1080,7 @@
             <w:noProof/>
             <w:webHidden/>
           </w:rPr>
-          <w:instrText xml:space="preserve"> PAGEREF _Toc242872839 \h </w:instrText>
+          <w:instrText xml:space="preserve"> PAGEREF _Toc242878399 \h </w:instrText>
         </w:r>
         <w:r>
           <w:rPr>
@@ -1127,7 +1127,7 @@
           <w14:ligatures w14:val="standardContextual"/>
         </w:rPr>
       </w:pPr>
-      <w:hyperlink w:anchor="_Toc242872840" w:history="1">
+      <w:hyperlink w:anchor="_Toc242878400" w:history="1">
         <w:r>
           <w:rPr>
             <w:rStyle w:val="Hyperlink"/>
@@ -1154,7 +1154,7 @@
             <w:noProof/>
             <w:webHidden/>
           </w:rPr>
-          <w:instrText xml:space="preserve"> PAGEREF _Toc242872840 \h </w:instrText>
+          <w:instrText xml:space="preserve"> PAGEREF _Toc242878400 \h </w:instrText>
         </w:r>
         <w:r>
           <w:rPr>
@@ -1202,7 +1202,7 @@
           <w14:ligatures w14:val="standardContextual"/>
         </w:rPr>
       </w:pPr>
-      <w:hyperlink w:anchor="_Toc242872841" w:history="1">
+      <w:hyperlink w:anchor="_Toc242878401" w:history="1">
         <w:r>
           <w:rPr>
             <w:rStyle w:val="Hyperlink"/>
@@ -1229,7 +1229,7 @@
             <w:noProof/>
             <w:webHidden/>
           </w:rPr>
-          <w:instrText xml:space="preserve"> PAGEREF _Toc242872841 \h </w:instrText>
+          <w:instrText xml:space="preserve"> PAGEREF _Toc242878401 \h </w:instrText>
         </w:r>
         <w:r>
           <w:rPr>
@@ -1276,7 +1276,7 @@
           <w14:ligatures w14:val="standardContextual"/>
         </w:rPr>
       </w:pPr>
-      <w:hyperlink w:anchor="_Toc242872842" w:history="1">
+      <w:hyperlink w:anchor="_Toc242878402" w:history="1">
         <w:r>
           <w:rPr>
             <w:rStyle w:val="Hyperlink"/>
@@ -1303,7 +1303,7 @@
             <w:noProof/>
             <w:webHidden/>
           </w:rPr>
-          <w:instrText xml:space="preserve"> PAGEREF _Toc242872842 \h </w:instrText>
+          <w:instrText xml:space="preserve"> PAGEREF _Toc242878402 \h </w:instrText>
         </w:r>
         <w:r>
           <w:rPr>
@@ -1350,7 +1350,7 @@
           <w14:ligatures w14:val="standardContextual"/>
         </w:rPr>
       </w:pPr>
-      <w:hyperlink w:anchor="_Toc242872843" w:history="1">
+      <w:hyperlink w:anchor="_Toc242878403" w:history="1">
         <w:r>
           <w:rPr>
             <w:rStyle w:val="Hyperlink"/>
@@ -1377,7 +1377,7 @@
             <w:noProof/>
             <w:webHidden/>
           </w:rPr>
-          <w:instrText xml:space="preserve"> PAGEREF _Toc242872843 \h </w:instrText>
+          <w:instrText xml:space="preserve"> PAGEREF _Toc242878403 \h </w:instrText>
         </w:r>
         <w:r>
           <w:rPr>
@@ -1424,7 +1424,7 @@
           <w14:ligatures w14:val="standardContextual"/>
         </w:rPr>
       </w:pPr>
-      <w:hyperlink w:anchor="_Toc242872844" w:history="1">
+      <w:hyperlink w:anchor="_Toc242878404" w:history="1">
         <w:r>
           <w:rPr>
             <w:rStyle w:val="Hyperlink"/>
@@ -1451,7 +1451,7 @@
             <w:noProof/>
             <w:webHidden/>
           </w:rPr>
-          <w:instrText xml:space="preserve"> PAGEREF _Toc242872844 \h </w:instrText>
+          <w:instrText xml:space="preserve"> PAGEREF _Toc242878404 \h </w:instrText>
         </w:r>
         <w:r>
           <w:rPr>
@@ -1498,7 +1498,7 @@
           <w14:ligatures w14:val="standardContextual"/>
         </w:rPr>
       </w:pPr>
-      <w:hyperlink w:anchor="_Toc242872845" w:history="1">
+      <w:hyperlink w:anchor="_Toc242878405" w:history="1">
         <w:r>
           <w:rPr>
             <w:rStyle w:val="Hyperlink"/>
@@ -1525,7 +1525,7 @@
             <w:noProof/>
             <w:webHidden/>
           </w:rPr>
-          <w:instrText xml:space="preserve"> PAGEREF _Toc242872845 \h </w:instrText>
+          <w:instrText xml:space="preserve"> PAGEREF _Toc242878405 \h </w:instrText>
         </w:r>
         <w:r>
           <w:rPr>
@@ -1572,7 +1572,7 @@
           <w14:ligatures w14:val="standardContextual"/>
         </w:rPr>
       </w:pPr>
-      <w:hyperlink w:anchor="_Toc242872846" w:history="1">
+      <w:hyperlink w:anchor="_Toc242878406" w:history="1">
         <w:r>
           <w:rPr>
             <w:rStyle w:val="Hyperlink"/>
@@ -1599,7 +1599,7 @@
             <w:noProof/>
             <w:webHidden/>
           </w:rPr>
-          <w:instrText xml:space="preserve"> PAGEREF _Toc242872846 \h </w:instrText>
+          <w:instrText xml:space="preserve"> PAGEREF _Toc242878406 \h </w:instrText>
         </w:r>
         <w:r>
           <w:rPr>
@@ -1646,7 +1646,7 @@
           <w14:ligatures w14:val="standardContextual"/>
         </w:rPr>
       </w:pPr>
-      <w:hyperlink w:anchor="_Toc242872847" w:history="1">
+      <w:hyperlink w:anchor="_Toc242878407" w:history="1">
         <w:r>
           <w:rPr>
             <w:rStyle w:val="Hyperlink"/>
@@ -1673,7 +1673,7 @@
             <w:noProof/>
             <w:webHidden/>
           </w:rPr>
-          <w:instrText xml:space="preserve"> PAGEREF _Toc242872847 \h </w:instrText>
+          <w:instrText xml:space="preserve"> PAGEREF _Toc242878407 \h </w:instrText>
         </w:r>
         <w:r>
           <w:rPr>
@@ -1720,7 +1720,7 @@
           <w14:ligatures w14:val="standardContextual"/>
         </w:rPr>
       </w:pPr>
-      <w:hyperlink w:anchor="_Toc242872848" w:history="1">
+      <w:hyperlink w:anchor="_Toc242878408" w:history="1">
         <w:r>
           <w:rPr>
             <w:rStyle w:val="Hyperlink"/>
@@ -1747,7 +1747,7 @@
             <w:noProof/>
             <w:webHidden/>
           </w:rPr>
-          <w:instrText xml:space="preserve"> PAGEREF _Toc242872848 \h </w:instrText>
+          <w:instrText xml:space="preserve"> PAGEREF _Toc242878408 \h </w:instrText>
         </w:r>
         <w:r>
           <w:rPr>
@@ -1795,7 +1795,7 @@
           <w14:ligatures w14:val="standardContextual"/>
         </w:rPr>
       </w:pPr>
-      <w:hyperlink w:anchor="_Toc242872849" w:history="1">
+      <w:hyperlink w:anchor="_Toc242878409" w:history="1">
         <w:r>
           <w:rPr>
             <w:rStyle w:val="Hyperlink"/>
@@ -1822,7 +1822,7 @@
             <w:noProof/>
             <w:webHidden/>
           </w:rPr>
-          <w:instrText xml:space="preserve"> PAGEREF _Toc242872849 \h </w:instrText>
+          <w:instrText xml:space="preserve"> PAGEREF _Toc242878409 \h </w:instrText>
         </w:r>
         <w:r>
           <w:rPr>
@@ -1869,7 +1869,7 @@
           <w14:ligatures w14:val="standardContextual"/>
         </w:rPr>
       </w:pPr>
-      <w:hyperlink w:anchor="_Toc242872850" w:history="1">
+      <w:hyperlink w:anchor="_Toc242878410" w:history="1">
         <w:r>
           <w:rPr>
             <w:rStyle w:val="Hyperlink"/>
@@ -1896,7 +1896,7 @@
             <w:noProof/>
             <w:webHidden/>
           </w:rPr>
-          <w:instrText xml:space="preserve"> PAGEREF _Toc242872850 \h </w:instrText>
+          <w:instrText xml:space="preserve"> PAGEREF _Toc242878410 \h </w:instrText>
         </w:r>
         <w:r>
           <w:rPr>
@@ -1943,7 +1943,7 @@
           <w14:ligatures w14:val="standardContextual"/>
         </w:rPr>
       </w:pPr>
-      <w:hyperlink w:anchor="_Toc242872851" w:history="1">
+      <w:hyperlink w:anchor="_Toc242878411" w:history="1">
         <w:r>
           <w:rPr>
             <w:rStyle w:val="Hyperlink"/>
@@ -1970,7 +1970,7 @@
             <w:noProof/>
             <w:webHidden/>
           </w:rPr>
-          <w:instrText xml:space="preserve"> PAGEREF _Toc242872851 \h </w:instrText>
+          <w:instrText xml:space="preserve"> PAGEREF _Toc242878411 \h </w:instrText>
         </w:r>
         <w:r>
           <w:rPr>
@@ -2017,7 +2017,7 @@
           <w14:ligatures w14:val="standardContextual"/>
         </w:rPr>
       </w:pPr>
-      <w:hyperlink w:anchor="_Toc242872852" w:history="1">
+      <w:hyperlink w:anchor="_Toc242878412" w:history="1">
         <w:r>
           <w:rPr>
             <w:rStyle w:val="Hyperlink"/>
@@ -2044,7 +2044,7 @@
             <w:noProof/>
             <w:webHidden/>
           </w:rPr>
-          <w:instrText xml:space="preserve"> PAGEREF _Toc242872852 \h </w:instrText>
+          <w:instrText xml:space="preserve"> PAGEREF _Toc242878412 \h </w:instrText>
         </w:r>
         <w:r>
           <w:rPr>
@@ -2091,7 +2091,7 @@
           <w14:ligatures w14:val="standardContextual"/>
         </w:rPr>
       </w:pPr>
-      <w:hyperlink w:anchor="_Toc242872853" w:history="1">
+      <w:hyperlink w:anchor="_Toc242878413" w:history="1">
         <w:r>
           <w:rPr>
             <w:rStyle w:val="Hyperlink"/>
@@ -2118,7 +2118,7 @@
             <w:noProof/>
             <w:webHidden/>
           </w:rPr>
-          <w:instrText xml:space="preserve"> PAGEREF _Toc242872853 \h </w:instrText>
+          <w:instrText xml:space="preserve"> PAGEREF _Toc242878413 \h </w:instrText>
         </w:r>
         <w:r>
           <w:rPr>
@@ -2165,7 +2165,7 @@
           <w14:ligatures w14:val="standardContextual"/>
         </w:rPr>
       </w:pPr>
-      <w:hyperlink w:anchor="_Toc242872854" w:history="1">
+      <w:hyperlink w:anchor="_Toc242878414" w:history="1">
         <w:r>
           <w:rPr>
             <w:rStyle w:val="Hyperlink"/>
@@ -2192,7 +2192,7 @@
             <w:noProof/>
             <w:webHidden/>
           </w:rPr>
-          <w:instrText xml:space="preserve"> PAGEREF _Toc242872854 \h </w:instrText>
+          <w:instrText xml:space="preserve"> PAGEREF _Toc242878414 \h </w:instrText>
         </w:r>
         <w:r>
           <w:rPr>
@@ -2239,7 +2239,7 @@
           <w14:ligatures w14:val="standardContextual"/>
         </w:rPr>
       </w:pPr>
-      <w:hyperlink w:anchor="_Toc242872855" w:history="1">
+      <w:hyperlink w:anchor="_Toc242878415" w:history="1">
         <w:r>
           <w:rPr>
             <w:rStyle w:val="Hyperlink"/>
@@ -2266,7 +2266,7 @@
             <w:noProof/>
             <w:webHidden/>
           </w:rPr>
-          <w:instrText xml:space="preserve"> PAGEREF _Toc242872855 \h </w:instrText>
+          <w:instrText xml:space="preserve"> PAGEREF _Toc242878415 \h </w:instrText>
         </w:r>
         <w:r>
           <w:rPr>
@@ -2314,7 +2314,7 @@
           <w14:ligatures w14:val="standardContextual"/>
         </w:rPr>
       </w:pPr>
-      <w:hyperlink w:anchor="_Toc242872856" w:history="1">
+      <w:hyperlink w:anchor="_Toc242878416" w:history="1">
         <w:r>
           <w:rPr>
             <w:rStyle w:val="Hyperlink"/>
@@ -2341,7 +2341,7 @@
             <w:noProof/>
             <w:webHidden/>
           </w:rPr>
-          <w:instrText xml:space="preserve"> PAGEREF _Toc242872856 \h </w:instrText>
+          <w:instrText xml:space="preserve"> PAGEREF _Toc242878416 \h </w:instrText>
         </w:r>
         <w:r>
           <w:rPr>
@@ -2388,7 +2388,7 @@
           <w14:ligatures w14:val="standardContextual"/>
         </w:rPr>
       </w:pPr>
-      <w:hyperlink w:anchor="_Toc242872857" w:history="1">
+      <w:hyperlink w:anchor="_Toc242878417" w:history="1">
         <w:r>
           <w:rPr>
             <w:rStyle w:val="Hyperlink"/>
@@ -2415,7 +2415,7 @@
             <w:noProof/>
             <w:webHidden/>
           </w:rPr>
-          <w:instrText xml:space="preserve"> PAGEREF _Toc242872857 \h </w:instrText>
+          <w:instrText xml:space="preserve"> PAGEREF _Toc242878417 \h </w:instrText>
         </w:r>
         <w:r>
           <w:rPr>
@@ -2462,7 +2462,7 @@
           <w14:ligatures w14:val="standardContextual"/>
         </w:rPr>
       </w:pPr>
-      <w:hyperlink w:anchor="_Toc242872858" w:history="1">
+      <w:hyperlink w:anchor="_Toc242878418" w:history="1">
         <w:r>
           <w:rPr>
             <w:rStyle w:val="Hyperlink"/>
@@ -2489,7 +2489,7 @@
             <w:noProof/>
             <w:webHidden/>
           </w:rPr>
-          <w:instrText xml:space="preserve"> PAGEREF _Toc242872858 \h </w:instrText>
+          <w:instrText xml:space="preserve"> PAGEREF _Toc242878418 \h </w:instrText>
         </w:r>
         <w:r>
           <w:rPr>
@@ -2536,7 +2536,7 @@
           <w14:ligatures w14:val="standardContextual"/>
         </w:rPr>
       </w:pPr>
-      <w:hyperlink w:anchor="_Toc242872859" w:history="1">
+      <w:hyperlink w:anchor="_Toc242878419" w:history="1">
         <w:r>
           <w:rPr>
             <w:rStyle w:val="Hyperlink"/>
@@ -2563,7 +2563,7 @@
             <w:noProof/>
             <w:webHidden/>
           </w:rPr>
-          <w:instrText xml:space="preserve"> PAGEREF _Toc242872859 \h </w:instrText>
+          <w:instrText xml:space="preserve"> PAGEREF _Toc242878419 \h </w:instrText>
         </w:r>
         <w:r>
           <w:rPr>
@@ -2623,6 +2623,9 @@
       <w:bookmarkStart w:id="1" w:name="_Toc242827603"/>
       <w:bookmarkStart w:id="2" w:name="_Toc242871456"/>
       <w:bookmarkStart w:id="3" w:name="_Toc242872832"/>
+      <w:bookmarkStart w:id="4" w:name="_Toc242877784"/>
+      <w:bookmarkStart w:id="5" w:name="_Toc242877964"/>
+      <w:bookmarkStart w:id="6" w:name="_Toc242878392"/>
       <w:r>
         <w:lastRenderedPageBreak/>
         <w:t>Chương 1 Tổng quan đề tài và yêu cầu học phần</w:t>
@@ -2631,22 +2634,31 @@
       <w:bookmarkEnd w:id="1"/>
       <w:bookmarkEnd w:id="2"/>
       <w:bookmarkEnd w:id="3"/>
+      <w:bookmarkEnd w:id="4"/>
+      <w:bookmarkEnd w:id="5"/>
+      <w:bookmarkEnd w:id="6"/>
     </w:p>
     <w:p>
       <w:pPr>
         <w:pStyle w:val="Heading2"/>
       </w:pPr>
-      <w:bookmarkStart w:id="4" w:name="_Toc242299336"/>
-      <w:bookmarkStart w:id="5" w:name="_Toc242827604"/>
-      <w:bookmarkStart w:id="6" w:name="_Toc242871457"/>
-      <w:bookmarkStart w:id="7" w:name="_Toc242872833"/>
+      <w:bookmarkStart w:id="7" w:name="_Toc242299336"/>
+      <w:bookmarkStart w:id="8" w:name="_Toc242827604"/>
+      <w:bookmarkStart w:id="9" w:name="_Toc242871457"/>
+      <w:bookmarkStart w:id="10" w:name="_Toc242872833"/>
+      <w:bookmarkStart w:id="11" w:name="_Toc242877785"/>
+      <w:bookmarkStart w:id="12" w:name="_Toc242877965"/>
+      <w:bookmarkStart w:id="13" w:name="_Toc242878393"/>
       <w:r>
         <w:t>1.1 Bối cảnh, mục tiêu và phạm vi</w:t>
       </w:r>
-      <w:bookmarkEnd w:id="4"/>
-      <w:bookmarkEnd w:id="5"/>
-      <w:bookmarkEnd w:id="6"/>
       <w:bookmarkEnd w:id="7"/>
+      <w:bookmarkEnd w:id="8"/>
+      <w:bookmarkEnd w:id="9"/>
+      <w:bookmarkEnd w:id="10"/>
+      <w:bookmarkEnd w:id="11"/>
+      <w:bookmarkEnd w:id="12"/>
+      <w:bookmarkEnd w:id="13"/>
     </w:p>
     <w:p>
       <w:pPr>
@@ -2713,17 +2725,23 @@
       <w:pPr>
         <w:pStyle w:val="Heading2"/>
       </w:pPr>
-      <w:bookmarkStart w:id="8" w:name="_Toc242299337"/>
-      <w:bookmarkStart w:id="9" w:name="_Toc242827605"/>
-      <w:bookmarkStart w:id="10" w:name="_Toc242871458"/>
-      <w:bookmarkStart w:id="11" w:name="_Toc242872834"/>
+      <w:bookmarkStart w:id="14" w:name="_Toc242299337"/>
+      <w:bookmarkStart w:id="15" w:name="_Toc242827605"/>
+      <w:bookmarkStart w:id="16" w:name="_Toc242871458"/>
+      <w:bookmarkStart w:id="17" w:name="_Toc242872834"/>
+      <w:bookmarkStart w:id="18" w:name="_Toc242877786"/>
+      <w:bookmarkStart w:id="19" w:name="_Toc242877966"/>
+      <w:bookmarkStart w:id="20" w:name="_Toc242878394"/>
       <w:r>
         <w:t>1.2 Yêu cầu chức năng và kết quả triển khai</w:t>
       </w:r>
-      <w:bookmarkEnd w:id="8"/>
-      <w:bookmarkEnd w:id="9"/>
-      <w:bookmarkEnd w:id="10"/>
-      <w:bookmarkEnd w:id="11"/>
+      <w:bookmarkEnd w:id="14"/>
+      <w:bookmarkEnd w:id="15"/>
+      <w:bookmarkEnd w:id="16"/>
+      <w:bookmarkEnd w:id="17"/>
+      <w:bookmarkEnd w:id="18"/>
+      <w:bookmarkEnd w:id="19"/>
+      <w:bookmarkEnd w:id="20"/>
     </w:p>
     <w:p>
       <w:pPr>
@@ -3315,18 +3333,24 @@
       <w:pPr>
         <w:pStyle w:val="Heading2"/>
       </w:pPr>
-      <w:bookmarkStart w:id="12" w:name="_Toc242299338"/>
-      <w:bookmarkStart w:id="13" w:name="_Toc242827606"/>
-      <w:bookmarkStart w:id="14" w:name="_Toc242871459"/>
-      <w:bookmarkStart w:id="15" w:name="_Toc242872835"/>
+      <w:bookmarkStart w:id="21" w:name="_Toc242299338"/>
+      <w:bookmarkStart w:id="22" w:name="_Toc242827606"/>
+      <w:bookmarkStart w:id="23" w:name="_Toc242871459"/>
+      <w:bookmarkStart w:id="24" w:name="_Toc242872835"/>
+      <w:bookmarkStart w:id="25" w:name="_Toc242877787"/>
+      <w:bookmarkStart w:id="26" w:name="_Toc242877967"/>
+      <w:bookmarkStart w:id="27" w:name="_Toc242878395"/>
       <w:r>
         <w:lastRenderedPageBreak/>
         <w:t>1.3 Kiến trúc tổng thể</w:t>
       </w:r>
-      <w:bookmarkEnd w:id="12"/>
-      <w:bookmarkEnd w:id="13"/>
-      <w:bookmarkEnd w:id="14"/>
-      <w:bookmarkEnd w:id="15"/>
+      <w:bookmarkEnd w:id="21"/>
+      <w:bookmarkEnd w:id="22"/>
+      <w:bookmarkEnd w:id="23"/>
+      <w:bookmarkEnd w:id="24"/>
+      <w:bookmarkEnd w:id="25"/>
+      <w:bookmarkEnd w:id="26"/>
+      <w:bookmarkEnd w:id="27"/>
     </w:p>
     <w:p>
       <w:pPr>
@@ -3399,18 +3423,24 @@
         <w:pStyle w:val="Heading2"/>
         <w:pageBreakBefore/>
       </w:pPr>
-      <w:bookmarkStart w:id="16" w:name="_Toc242299339"/>
-      <w:bookmarkStart w:id="17" w:name="_Toc242827607"/>
-      <w:bookmarkStart w:id="18" w:name="_Toc242871460"/>
-      <w:bookmarkStart w:id="19" w:name="_Toc242872836"/>
+      <w:bookmarkStart w:id="28" w:name="_Toc242299339"/>
+      <w:bookmarkStart w:id="29" w:name="_Toc242827607"/>
+      <w:bookmarkStart w:id="30" w:name="_Toc242871460"/>
+      <w:bookmarkStart w:id="31" w:name="_Toc242872836"/>
+      <w:bookmarkStart w:id="32" w:name="_Toc242877788"/>
+      <w:bookmarkStart w:id="33" w:name="_Toc242877968"/>
+      <w:bookmarkStart w:id="34" w:name="_Toc242878396"/>
       <w:r>
         <w:lastRenderedPageBreak/>
         <w:t>1.4 Nguồn số liệu và mốc đo</w:t>
       </w:r>
-      <w:bookmarkEnd w:id="16"/>
-      <w:bookmarkEnd w:id="17"/>
-      <w:bookmarkEnd w:id="18"/>
-      <w:bookmarkEnd w:id="19"/>
+      <w:bookmarkEnd w:id="28"/>
+      <w:bookmarkEnd w:id="29"/>
+      <w:bookmarkEnd w:id="30"/>
+      <w:bookmarkEnd w:id="31"/>
+      <w:bookmarkEnd w:id="32"/>
+      <w:bookmarkEnd w:id="33"/>
+      <w:bookmarkEnd w:id="34"/>
     </w:p>
     <w:p>
       <w:pPr>
@@ -4282,18 +4312,24 @@
         <w:pageBreakBefore/>
         <w:jc w:val="left"/>
       </w:pPr>
-      <w:bookmarkStart w:id="20" w:name="_Toc242299340"/>
-      <w:bookmarkStart w:id="21" w:name="_Toc242827608"/>
-      <w:bookmarkStart w:id="22" w:name="_Toc242871461"/>
-      <w:bookmarkStart w:id="23" w:name="_Toc242872837"/>
+      <w:bookmarkStart w:id="35" w:name="_Toc242299340"/>
+      <w:bookmarkStart w:id="36" w:name="_Toc242827608"/>
+      <w:bookmarkStart w:id="37" w:name="_Toc242871461"/>
+      <w:bookmarkStart w:id="38" w:name="_Toc242872837"/>
+      <w:bookmarkStart w:id="39" w:name="_Toc242877789"/>
+      <w:bookmarkStart w:id="40" w:name="_Toc242877969"/>
+      <w:bookmarkStart w:id="41" w:name="_Toc242878397"/>
       <w:r>
         <w:lastRenderedPageBreak/>
         <w:t>Chương 2 Báo cáo tiến độ Tuần 1</w:t>
       </w:r>
-      <w:bookmarkEnd w:id="20"/>
-      <w:bookmarkEnd w:id="21"/>
-      <w:bookmarkEnd w:id="22"/>
-      <w:bookmarkEnd w:id="23"/>
+      <w:bookmarkEnd w:id="35"/>
+      <w:bookmarkEnd w:id="36"/>
+      <w:bookmarkEnd w:id="37"/>
+      <w:bookmarkEnd w:id="38"/>
+      <w:bookmarkEnd w:id="39"/>
+      <w:bookmarkEnd w:id="40"/>
+      <w:bookmarkEnd w:id="41"/>
     </w:p>
     <w:p>
       <w:pPr>
@@ -4308,17 +4344,23 @@
       <w:pPr>
         <w:pStyle w:val="Heading2"/>
       </w:pPr>
-      <w:bookmarkStart w:id="24" w:name="_Toc242299341"/>
-      <w:bookmarkStart w:id="25" w:name="_Toc242827609"/>
-      <w:bookmarkStart w:id="26" w:name="_Toc242871462"/>
-      <w:bookmarkStart w:id="27" w:name="_Toc242872838"/>
+      <w:bookmarkStart w:id="42" w:name="_Toc242299341"/>
+      <w:bookmarkStart w:id="43" w:name="_Toc242827609"/>
+      <w:bookmarkStart w:id="44" w:name="_Toc242871462"/>
+      <w:bookmarkStart w:id="45" w:name="_Toc242872838"/>
+      <w:bookmarkStart w:id="46" w:name="_Toc242877790"/>
+      <w:bookmarkStart w:id="47" w:name="_Toc242877970"/>
+      <w:bookmarkStart w:id="48" w:name="_Toc242878398"/>
       <w:r>
         <w:t>2.1 Mục tiêu và phân công thực hiện</w:t>
       </w:r>
-      <w:bookmarkEnd w:id="24"/>
-      <w:bookmarkEnd w:id="25"/>
-      <w:bookmarkEnd w:id="26"/>
-      <w:bookmarkEnd w:id="27"/>
+      <w:bookmarkEnd w:id="42"/>
+      <w:bookmarkEnd w:id="43"/>
+      <w:bookmarkEnd w:id="44"/>
+      <w:bookmarkEnd w:id="45"/>
+      <w:bookmarkEnd w:id="46"/>
+      <w:bookmarkEnd w:id="47"/>
+      <w:bookmarkEnd w:id="48"/>
     </w:p>
     <w:p>
       <w:pPr>
@@ -4638,17 +4680,23 @@
       <w:pPr>
         <w:pStyle w:val="Heading2"/>
       </w:pPr>
-      <w:bookmarkStart w:id="28" w:name="_Toc242299342"/>
-      <w:bookmarkStart w:id="29" w:name="_Toc242827610"/>
-      <w:bookmarkStart w:id="30" w:name="_Toc242871463"/>
-      <w:bookmarkStart w:id="31" w:name="_Toc242872839"/>
+      <w:bookmarkStart w:id="49" w:name="_Toc242299342"/>
+      <w:bookmarkStart w:id="50" w:name="_Toc242827610"/>
+      <w:bookmarkStart w:id="51" w:name="_Toc242871463"/>
+      <w:bookmarkStart w:id="52" w:name="_Toc242872839"/>
+      <w:bookmarkStart w:id="53" w:name="_Toc242877791"/>
+      <w:bookmarkStart w:id="54" w:name="_Toc242877971"/>
+      <w:bookmarkStart w:id="55" w:name="_Toc242878399"/>
       <w:r>
         <w:t>2.2 Phạm vi và luồng dữ liệu đo</w:t>
       </w:r>
-      <w:bookmarkEnd w:id="28"/>
-      <w:bookmarkEnd w:id="29"/>
-      <w:bookmarkEnd w:id="30"/>
-      <w:bookmarkEnd w:id="31"/>
+      <w:bookmarkEnd w:id="49"/>
+      <w:bookmarkEnd w:id="50"/>
+      <w:bookmarkEnd w:id="51"/>
+      <w:bookmarkEnd w:id="52"/>
+      <w:bookmarkEnd w:id="53"/>
+      <w:bookmarkEnd w:id="54"/>
+      <w:bookmarkEnd w:id="55"/>
     </w:p>
     <w:p>
       <w:pPr>
@@ -5102,17 +5150,23 @@
       <w:pPr>
         <w:pStyle w:val="Heading2"/>
       </w:pPr>
-      <w:bookmarkStart w:id="32" w:name="_Toc242299343"/>
-      <w:bookmarkStart w:id="33" w:name="_Toc242827611"/>
-      <w:bookmarkStart w:id="34" w:name="_Toc242871464"/>
-      <w:bookmarkStart w:id="35" w:name="_Toc242872840"/>
+      <w:bookmarkStart w:id="56" w:name="_Toc242299343"/>
+      <w:bookmarkStart w:id="57" w:name="_Toc242827611"/>
+      <w:bookmarkStart w:id="58" w:name="_Toc242871464"/>
+      <w:bookmarkStart w:id="59" w:name="_Toc242872840"/>
+      <w:bookmarkStart w:id="60" w:name="_Toc242877792"/>
+      <w:bookmarkStart w:id="61" w:name="_Toc242877972"/>
+      <w:bookmarkStart w:id="62" w:name="_Toc242878400"/>
       <w:r>
         <w:t>2.3 Kết quả định lượng</w:t>
       </w:r>
-      <w:bookmarkEnd w:id="32"/>
-      <w:bookmarkEnd w:id="33"/>
-      <w:bookmarkEnd w:id="34"/>
-      <w:bookmarkEnd w:id="35"/>
+      <w:bookmarkEnd w:id="56"/>
+      <w:bookmarkEnd w:id="57"/>
+      <w:bookmarkEnd w:id="58"/>
+      <w:bookmarkEnd w:id="59"/>
+      <w:bookmarkEnd w:id="60"/>
+      <w:bookmarkEnd w:id="61"/>
+      <w:bookmarkEnd w:id="62"/>
     </w:p>
     <w:p>
       <w:pPr>
@@ -5637,34 +5691,46 @@
         <w:pageBreakBefore/>
         <w:jc w:val="left"/>
       </w:pPr>
-      <w:bookmarkStart w:id="36" w:name="_Toc242299344"/>
-      <w:bookmarkStart w:id="37" w:name="_Toc242827612"/>
-      <w:bookmarkStart w:id="38" w:name="_Toc242871465"/>
-      <w:bookmarkStart w:id="39" w:name="_Toc242872841"/>
+      <w:bookmarkStart w:id="63" w:name="_Toc242299344"/>
+      <w:bookmarkStart w:id="64" w:name="_Toc242827612"/>
+      <w:bookmarkStart w:id="65" w:name="_Toc242871465"/>
+      <w:bookmarkStart w:id="66" w:name="_Toc242872841"/>
+      <w:bookmarkStart w:id="67" w:name="_Toc242877793"/>
+      <w:bookmarkStart w:id="68" w:name="_Toc242877973"/>
+      <w:bookmarkStart w:id="69" w:name="_Toc242878401"/>
       <w:r>
         <w:lastRenderedPageBreak/>
         <w:t>Chương 3 Thiết kế và triển khai trên AWS Learner Lab</w:t>
       </w:r>
-      <w:bookmarkEnd w:id="36"/>
-      <w:bookmarkEnd w:id="37"/>
-      <w:bookmarkEnd w:id="38"/>
-      <w:bookmarkEnd w:id="39"/>
+      <w:bookmarkEnd w:id="63"/>
+      <w:bookmarkEnd w:id="64"/>
+      <w:bookmarkEnd w:id="65"/>
+      <w:bookmarkEnd w:id="66"/>
+      <w:bookmarkEnd w:id="67"/>
+      <w:bookmarkEnd w:id="68"/>
+      <w:bookmarkEnd w:id="69"/>
     </w:p>
     <w:p>
       <w:pPr>
         <w:pStyle w:val="Heading2"/>
       </w:pPr>
-      <w:bookmarkStart w:id="40" w:name="_Toc242299345"/>
-      <w:bookmarkStart w:id="41" w:name="_Toc242827613"/>
-      <w:bookmarkStart w:id="42" w:name="_Toc242871466"/>
-      <w:bookmarkStart w:id="43" w:name="_Toc242872842"/>
+      <w:bookmarkStart w:id="70" w:name="_Toc242299345"/>
+      <w:bookmarkStart w:id="71" w:name="_Toc242827613"/>
+      <w:bookmarkStart w:id="72" w:name="_Toc242871466"/>
+      <w:bookmarkStart w:id="73" w:name="_Toc242872842"/>
+      <w:bookmarkStart w:id="74" w:name="_Toc242877794"/>
+      <w:bookmarkStart w:id="75" w:name="_Toc242877974"/>
+      <w:bookmarkStart w:id="76" w:name="_Toc242878402"/>
       <w:r>
         <w:t>3.1 Danh mục dịch vụ và cấu hình thực tế</w:t>
       </w:r>
-      <w:bookmarkEnd w:id="40"/>
-      <w:bookmarkEnd w:id="41"/>
-      <w:bookmarkEnd w:id="42"/>
-      <w:bookmarkEnd w:id="43"/>
+      <w:bookmarkEnd w:id="70"/>
+      <w:bookmarkEnd w:id="71"/>
+      <w:bookmarkEnd w:id="72"/>
+      <w:bookmarkEnd w:id="73"/>
+      <w:bookmarkEnd w:id="74"/>
+      <w:bookmarkEnd w:id="75"/>
+      <w:bookmarkEnd w:id="76"/>
     </w:p>
     <w:p>
       <w:pPr>
@@ -6412,17 +6478,23 @@
       <w:pPr>
         <w:pStyle w:val="Heading2"/>
       </w:pPr>
-      <w:bookmarkStart w:id="44" w:name="_Toc242299346"/>
-      <w:bookmarkStart w:id="45" w:name="_Toc242827614"/>
-      <w:bookmarkStart w:id="46" w:name="_Toc242871467"/>
-      <w:bookmarkStart w:id="47" w:name="_Toc242872843"/>
+      <w:bookmarkStart w:id="77" w:name="_Toc242299346"/>
+      <w:bookmarkStart w:id="78" w:name="_Toc242827614"/>
+      <w:bookmarkStart w:id="79" w:name="_Toc242871467"/>
+      <w:bookmarkStart w:id="80" w:name="_Toc242872843"/>
+      <w:bookmarkStart w:id="81" w:name="_Toc242877795"/>
+      <w:bookmarkStart w:id="82" w:name="_Toc242877975"/>
+      <w:bookmarkStart w:id="83" w:name="_Toc242878403"/>
       <w:r>
         <w:t>3.2 Dữ liệu và phân vùng S3</w:t>
       </w:r>
-      <w:bookmarkEnd w:id="44"/>
-      <w:bookmarkEnd w:id="45"/>
-      <w:bookmarkEnd w:id="46"/>
-      <w:bookmarkEnd w:id="47"/>
+      <w:bookmarkEnd w:id="77"/>
+      <w:bookmarkEnd w:id="78"/>
+      <w:bookmarkEnd w:id="79"/>
+      <w:bookmarkEnd w:id="80"/>
+      <w:bookmarkEnd w:id="81"/>
+      <w:bookmarkEnd w:id="82"/>
+      <w:bookmarkEnd w:id="83"/>
     </w:p>
     <w:p>
       <w:pPr>
@@ -6495,17 +6567,23 @@
       <w:pPr>
         <w:pStyle w:val="Heading2"/>
       </w:pPr>
-      <w:bookmarkStart w:id="48" w:name="_Toc242299347"/>
-      <w:bookmarkStart w:id="49" w:name="_Toc242827615"/>
-      <w:bookmarkStart w:id="50" w:name="_Toc242871468"/>
-      <w:bookmarkStart w:id="51" w:name="_Toc242872844"/>
+      <w:bookmarkStart w:id="84" w:name="_Toc242299347"/>
+      <w:bookmarkStart w:id="85" w:name="_Toc242827615"/>
+      <w:bookmarkStart w:id="86" w:name="_Toc242871468"/>
+      <w:bookmarkStart w:id="87" w:name="_Toc242872844"/>
+      <w:bookmarkStart w:id="88" w:name="_Toc242877796"/>
+      <w:bookmarkStart w:id="89" w:name="_Toc242877976"/>
+      <w:bookmarkStart w:id="90" w:name="_Toc242878404"/>
       <w:r>
         <w:t>3.3 An toàn cấu hình và vận hành</w:t>
       </w:r>
-      <w:bookmarkEnd w:id="48"/>
-      <w:bookmarkEnd w:id="49"/>
-      <w:bookmarkEnd w:id="50"/>
-      <w:bookmarkEnd w:id="51"/>
+      <w:bookmarkEnd w:id="84"/>
+      <w:bookmarkEnd w:id="85"/>
+      <w:bookmarkEnd w:id="86"/>
+      <w:bookmarkEnd w:id="87"/>
+      <w:bookmarkEnd w:id="88"/>
+      <w:bookmarkEnd w:id="89"/>
+      <w:bookmarkEnd w:id="90"/>
     </w:p>
     <w:p>
       <w:pPr>
@@ -6520,18 +6598,24 @@
       <w:pPr>
         <w:pStyle w:val="Heading2"/>
       </w:pPr>
-      <w:bookmarkStart w:id="52" w:name="_Toc242299348"/>
-      <w:bookmarkStart w:id="53" w:name="_Toc242827616"/>
-      <w:bookmarkStart w:id="54" w:name="_Toc242871469"/>
-      <w:bookmarkStart w:id="55" w:name="_Toc242872845"/>
+      <w:bookmarkStart w:id="91" w:name="_Toc242299348"/>
+      <w:bookmarkStart w:id="92" w:name="_Toc242827616"/>
+      <w:bookmarkStart w:id="93" w:name="_Toc242871469"/>
+      <w:bookmarkStart w:id="94" w:name="_Toc242872845"/>
+      <w:bookmarkStart w:id="95" w:name="_Toc242877797"/>
+      <w:bookmarkStart w:id="96" w:name="_Toc242877977"/>
+      <w:bookmarkStart w:id="97" w:name="_Toc242878405"/>
       <w:r>
         <w:lastRenderedPageBreak/>
         <w:t>3.4 Trình tự xử lý của Lambda</w:t>
       </w:r>
-      <w:bookmarkEnd w:id="52"/>
-      <w:bookmarkEnd w:id="53"/>
-      <w:bookmarkEnd w:id="54"/>
-      <w:bookmarkEnd w:id="55"/>
+      <w:bookmarkEnd w:id="91"/>
+      <w:bookmarkEnd w:id="92"/>
+      <w:bookmarkEnd w:id="93"/>
+      <w:bookmarkEnd w:id="94"/>
+      <w:bookmarkEnd w:id="95"/>
+      <w:bookmarkEnd w:id="96"/>
+      <w:bookmarkEnd w:id="97"/>
     </w:p>
     <w:p>
       <w:pPr>
@@ -6564,17 +6648,23 @@
       <w:pPr>
         <w:pStyle w:val="Heading2"/>
       </w:pPr>
-      <w:bookmarkStart w:id="56" w:name="_Toc242299349"/>
-      <w:bookmarkStart w:id="57" w:name="_Toc242827617"/>
-      <w:bookmarkStart w:id="58" w:name="_Toc242871470"/>
-      <w:bookmarkStart w:id="59" w:name="_Toc242872846"/>
+      <w:bookmarkStart w:id="98" w:name="_Toc242299349"/>
+      <w:bookmarkStart w:id="99" w:name="_Toc242827617"/>
+      <w:bookmarkStart w:id="100" w:name="_Toc242871470"/>
+      <w:bookmarkStart w:id="101" w:name="_Toc242872846"/>
+      <w:bookmarkStart w:id="102" w:name="_Toc242877798"/>
+      <w:bookmarkStart w:id="103" w:name="_Toc242877978"/>
+      <w:bookmarkStart w:id="104" w:name="_Toc242878406"/>
       <w:r>
         <w:t>3.5 Truy vấn Athena và khả năng tái lập</w:t>
       </w:r>
-      <w:bookmarkEnd w:id="56"/>
-      <w:bookmarkEnd w:id="57"/>
-      <w:bookmarkEnd w:id="58"/>
-      <w:bookmarkEnd w:id="59"/>
+      <w:bookmarkEnd w:id="98"/>
+      <w:bookmarkEnd w:id="99"/>
+      <w:bookmarkEnd w:id="100"/>
+      <w:bookmarkEnd w:id="101"/>
+      <w:bookmarkEnd w:id="102"/>
+      <w:bookmarkEnd w:id="103"/>
+      <w:bookmarkEnd w:id="104"/>
     </w:p>
     <w:p>
       <w:pPr>
@@ -6830,17 +6920,23 @@
       <w:pPr>
         <w:pStyle w:val="Heading2"/>
       </w:pPr>
-      <w:bookmarkStart w:id="60" w:name="_Toc242299350"/>
-      <w:bookmarkStart w:id="61" w:name="_Toc242827618"/>
-      <w:bookmarkStart w:id="62" w:name="_Toc242871471"/>
-      <w:bookmarkStart w:id="63" w:name="_Toc242872847"/>
+      <w:bookmarkStart w:id="105" w:name="_Toc242299350"/>
+      <w:bookmarkStart w:id="106" w:name="_Toc242827618"/>
+      <w:bookmarkStart w:id="107" w:name="_Toc242871471"/>
+      <w:bookmarkStart w:id="108" w:name="_Toc242872847"/>
+      <w:bookmarkStart w:id="109" w:name="_Toc242877799"/>
+      <w:bookmarkStart w:id="110" w:name="_Toc242877979"/>
+      <w:bookmarkStart w:id="111" w:name="_Toc242878407"/>
       <w:r>
         <w:t>3.6 Lược đồ bản ghi và chất lượng dữ liệu</w:t>
       </w:r>
-      <w:bookmarkEnd w:id="60"/>
-      <w:bookmarkEnd w:id="61"/>
-      <w:bookmarkEnd w:id="62"/>
-      <w:bookmarkEnd w:id="63"/>
+      <w:bookmarkEnd w:id="105"/>
+      <w:bookmarkEnd w:id="106"/>
+      <w:bookmarkEnd w:id="107"/>
+      <w:bookmarkEnd w:id="108"/>
+      <w:bookmarkEnd w:id="109"/>
+      <w:bookmarkEnd w:id="110"/>
+      <w:bookmarkEnd w:id="111"/>
     </w:p>
     <w:p>
       <w:pPr>
@@ -7426,7 +7522,7 @@
               <w:rPr>
                 <w:sz w:val="22"/>
               </w:rPr>
-              <w:t>Phiên bản Tuần 1 ghép theo vị trí trong mảng; phiên bản Tuần 2 ghép theo timestamp.</w:t>
+              <w:t>Chuỗi khí tượng được ghép với chuỗi AQI theo vị trí trong mảng thời gian ở Tuần 1.</w:t>
             </w:r>
           </w:p>
         </w:tc>
@@ -7521,25 +7617,32 @@
         <w:ind w:firstLine="504"/>
       </w:pPr>
       <w:r>
-        <w:t>Việc đổi null thành 0 giúp hàm không lỗi kiểu dữ liệu nhưng khiến AVG coi số 0 là một phép đo thật. Chưa có thống kê tỷ lệ giá trị thiếu trong toàn bộ đối tượng S3, nên các kết luận khí tượng ở Chương 4 chỉ mô tả tệp CSV đã xuất. Phiên bản được đối chiếu ở Tuần 1 ghép hai chuỗi lịch sử theo vị trí trong mảng; bộ source hoàn thiện ở Tuần 2 đã ghép theo timestamp. Sự thay đổi mã nguồn này không làm thay đổi các giá trị trong bộ CSV đã lưu dùng cho hai báo cáo.</w:t>
+        <w:t>Việc đổi null thành 0 giúp hàm không lỗi kiểu dữ liệu nhưng khiến AVG coi số 0 là một phép đo thật. Chưa có thống kê tỷ lệ giá trị thiếu trong toàn bộ đối tượng S3, nên các kết luận khí tượng ở Chương 4 chỉ mô tả tệp CSV đã xuất.</w:t>
       </w:r>
     </w:p>
     <w:p>
       <w:pPr>
         <w:pStyle w:val="Heading2"/>
+        <w:pageBreakBefore/>
       </w:pPr>
-      <w:bookmarkStart w:id="64" w:name="_Toc242299351"/>
-      <w:bookmarkStart w:id="65" w:name="_Toc242827619"/>
-      <w:bookmarkStart w:id="66" w:name="_Toc242871472"/>
-      <w:bookmarkStart w:id="67" w:name="_Toc242872848"/>
+      <w:bookmarkStart w:id="112" w:name="_Toc242299351"/>
+      <w:bookmarkStart w:id="113" w:name="_Toc242827619"/>
+      <w:bookmarkStart w:id="114" w:name="_Toc242871472"/>
+      <w:bookmarkStart w:id="115" w:name="_Toc242872848"/>
+      <w:bookmarkStart w:id="116" w:name="_Toc242877800"/>
+      <w:bookmarkStart w:id="117" w:name="_Toc242877980"/>
+      <w:bookmarkStart w:id="118" w:name="_Toc242878408"/>
       <w:r>
         <w:lastRenderedPageBreak/>
         <w:t>3.7 Tần suất gọi Open-Meteo và yêu cầu khóa API</w:t>
       </w:r>
-      <w:bookmarkEnd w:id="64"/>
-      <w:bookmarkEnd w:id="65"/>
-      <w:bookmarkEnd w:id="66"/>
-      <w:bookmarkEnd w:id="67"/>
+      <w:bookmarkEnd w:id="112"/>
+      <w:bookmarkEnd w:id="113"/>
+      <w:bookmarkEnd w:id="114"/>
+      <w:bookmarkEnd w:id="115"/>
+      <w:bookmarkEnd w:id="116"/>
+      <w:bookmarkEnd w:id="117"/>
+      <w:bookmarkEnd w:id="118"/>
     </w:p>
     <w:p>
       <w:pPr>
@@ -7565,34 +7668,46 @@
         <w:pageBreakBefore/>
         <w:jc w:val="left"/>
       </w:pPr>
-      <w:bookmarkStart w:id="68" w:name="_Toc242299352"/>
-      <w:bookmarkStart w:id="69" w:name="_Toc242827620"/>
-      <w:bookmarkStart w:id="70" w:name="_Toc242871473"/>
-      <w:bookmarkStart w:id="71" w:name="_Toc242872849"/>
+      <w:bookmarkStart w:id="119" w:name="_Toc242299352"/>
+      <w:bookmarkStart w:id="120" w:name="_Toc242827620"/>
+      <w:bookmarkStart w:id="121" w:name="_Toc242871473"/>
+      <w:bookmarkStart w:id="122" w:name="_Toc242872849"/>
+      <w:bookmarkStart w:id="123" w:name="_Toc242877801"/>
+      <w:bookmarkStart w:id="124" w:name="_Toc242877981"/>
+      <w:bookmarkStart w:id="125" w:name="_Toc242878409"/>
       <w:r>
         <w:lastRenderedPageBreak/>
         <w:t>Chương 4 Kết quả kiểm tra và phân tích dữ liệu</w:t>
       </w:r>
-      <w:bookmarkEnd w:id="68"/>
-      <w:bookmarkEnd w:id="69"/>
-      <w:bookmarkEnd w:id="70"/>
-      <w:bookmarkEnd w:id="71"/>
+      <w:bookmarkEnd w:id="119"/>
+      <w:bookmarkEnd w:id="120"/>
+      <w:bookmarkEnd w:id="121"/>
+      <w:bookmarkEnd w:id="122"/>
+      <w:bookmarkEnd w:id="123"/>
+      <w:bookmarkEnd w:id="124"/>
+      <w:bookmarkEnd w:id="125"/>
     </w:p>
     <w:p>
       <w:pPr>
         <w:pStyle w:val="Heading2"/>
       </w:pPr>
-      <w:bookmarkStart w:id="72" w:name="_Toc242299353"/>
-      <w:bookmarkStart w:id="73" w:name="_Toc242827621"/>
-      <w:bookmarkStart w:id="74" w:name="_Toc242871474"/>
-      <w:bookmarkStart w:id="75" w:name="_Toc242872850"/>
+      <w:bookmarkStart w:id="126" w:name="_Toc242299353"/>
+      <w:bookmarkStart w:id="127" w:name="_Toc242827621"/>
+      <w:bookmarkStart w:id="128" w:name="_Toc242871474"/>
+      <w:bookmarkStart w:id="129" w:name="_Toc242872850"/>
+      <w:bookmarkStart w:id="130" w:name="_Toc242877802"/>
+      <w:bookmarkStart w:id="131" w:name="_Toc242877982"/>
+      <w:bookmarkStart w:id="132" w:name="_Toc242878410"/>
       <w:r>
         <w:t>4.1 Mốc dữ liệu và số đo vận hành AWS</w:t>
       </w:r>
-      <w:bookmarkEnd w:id="72"/>
-      <w:bookmarkEnd w:id="73"/>
-      <w:bookmarkEnd w:id="74"/>
-      <w:bookmarkEnd w:id="75"/>
+      <w:bookmarkEnd w:id="126"/>
+      <w:bookmarkEnd w:id="127"/>
+      <w:bookmarkEnd w:id="128"/>
+      <w:bookmarkEnd w:id="129"/>
+      <w:bookmarkEnd w:id="130"/>
+      <w:bookmarkEnd w:id="131"/>
+      <w:bookmarkEnd w:id="132"/>
     </w:p>
     <w:p>
       <w:pPr>
@@ -8212,7 +8327,7 @@
         <w:ind w:firstLine="504"/>
       </w:pPr>
       <w:r>
-        <w:t>Tổng total_records theo đô thị là 52 + 52 + 52 = 156. Tổng sample_count của 24 nhóm giờ và tổng occurrence_count của các cấp AQI đều bằng 156. CSV gốc cũng có đúng 156 dòng và 156 record_id riêng biệt. Bốn phép kiểm tra số dòng độc lập cho thấy các bảng tổng hợp dùng cùng quy mô mẫu của lượt xuất Tuần 1.</w:t>
+        <w:t>Tổng total_records theo đô thị là 52 + 52 + 52 = 156. Tổng sample_count của 24 nhóm giờ và tổng occurrence_count của các cấp AQI đều bằng 156. CSV gốc cũng có đúng 156 dòng và 156 record_id riêng biệt. Các phép đối chiếu số dòng cho thấy các bảng tổng hợp dùng cùng quy mô mẫu của lượt xuất Tuần 1.</w:t>
       </w:r>
     </w:p>
     <w:tbl>
@@ -8278,18 +8393,24 @@
         <w:pStyle w:val="Heading2"/>
         <w:pageBreakBefore/>
       </w:pPr>
-      <w:bookmarkStart w:id="76" w:name="_Toc242299354"/>
-      <w:bookmarkStart w:id="77" w:name="_Toc242827622"/>
-      <w:bookmarkStart w:id="78" w:name="_Toc242871475"/>
-      <w:bookmarkStart w:id="79" w:name="_Toc242872851"/>
+      <w:bookmarkStart w:id="133" w:name="_Toc242299354"/>
+      <w:bookmarkStart w:id="134" w:name="_Toc242827622"/>
+      <w:bookmarkStart w:id="135" w:name="_Toc242871475"/>
+      <w:bookmarkStart w:id="136" w:name="_Toc242872851"/>
+      <w:bookmarkStart w:id="137" w:name="_Toc242877803"/>
+      <w:bookmarkStart w:id="138" w:name="_Toc242877983"/>
+      <w:bookmarkStart w:id="139" w:name="_Toc242878411"/>
       <w:r>
         <w:lastRenderedPageBreak/>
         <w:t>4.2 So sánh ba đô thị từ Athena</w:t>
       </w:r>
-      <w:bookmarkEnd w:id="76"/>
-      <w:bookmarkEnd w:id="77"/>
-      <w:bookmarkEnd w:id="78"/>
-      <w:bookmarkEnd w:id="79"/>
+      <w:bookmarkEnd w:id="133"/>
+      <w:bookmarkEnd w:id="134"/>
+      <w:bookmarkEnd w:id="135"/>
+      <w:bookmarkEnd w:id="136"/>
+      <w:bookmarkEnd w:id="137"/>
+      <w:bookmarkEnd w:id="138"/>
+      <w:bookmarkEnd w:id="139"/>
     </w:p>
     <w:p>
       <w:pPr>
@@ -9495,17 +9616,23 @@
       <w:pPr>
         <w:pStyle w:val="Heading2"/>
       </w:pPr>
-      <w:bookmarkStart w:id="80" w:name="_Toc242299355"/>
-      <w:bookmarkStart w:id="81" w:name="_Toc242827623"/>
-      <w:bookmarkStart w:id="82" w:name="_Toc242871476"/>
-      <w:bookmarkStart w:id="83" w:name="_Toc242872852"/>
+      <w:bookmarkStart w:id="140" w:name="_Toc242299355"/>
+      <w:bookmarkStart w:id="141" w:name="_Toc242827623"/>
+      <w:bookmarkStart w:id="142" w:name="_Toc242871476"/>
+      <w:bookmarkStart w:id="143" w:name="_Toc242872852"/>
+      <w:bookmarkStart w:id="144" w:name="_Toc242877804"/>
+      <w:bookmarkStart w:id="145" w:name="_Toc242877984"/>
+      <w:bookmarkStart w:id="146" w:name="_Toc242878412"/>
       <w:r>
         <w:t>4.3 Biến thiên theo 24 giờ UTC</w:t>
       </w:r>
-      <w:bookmarkEnd w:id="80"/>
-      <w:bookmarkEnd w:id="81"/>
-      <w:bookmarkEnd w:id="82"/>
-      <w:bookmarkEnd w:id="83"/>
+      <w:bookmarkEnd w:id="140"/>
+      <w:bookmarkEnd w:id="141"/>
+      <w:bookmarkEnd w:id="142"/>
+      <w:bookmarkEnd w:id="143"/>
+      <w:bookmarkEnd w:id="144"/>
+      <w:bookmarkEnd w:id="145"/>
+      <w:bookmarkEnd w:id="146"/>
     </w:p>
     <w:p>
       <w:pPr>
@@ -12776,17 +12903,23 @@
       <w:pPr>
         <w:pStyle w:val="Heading2"/>
       </w:pPr>
-      <w:bookmarkStart w:id="84" w:name="_Toc242299356"/>
-      <w:bookmarkStart w:id="85" w:name="_Toc242827624"/>
-      <w:bookmarkStart w:id="86" w:name="_Toc242871477"/>
-      <w:bookmarkStart w:id="87" w:name="_Toc242872853"/>
+      <w:bookmarkStart w:id="147" w:name="_Toc242299356"/>
+      <w:bookmarkStart w:id="148" w:name="_Toc242827624"/>
+      <w:bookmarkStart w:id="149" w:name="_Toc242871477"/>
+      <w:bookmarkStart w:id="150" w:name="_Toc242872853"/>
+      <w:bookmarkStart w:id="151" w:name="_Toc242877805"/>
+      <w:bookmarkStart w:id="152" w:name="_Toc242877985"/>
+      <w:bookmarkStart w:id="153" w:name="_Toc242878413"/>
       <w:r>
         <w:t>4.4 Phân bố cấp chất lượng không khí</w:t>
       </w:r>
-      <w:bookmarkEnd w:id="84"/>
-      <w:bookmarkEnd w:id="85"/>
-      <w:bookmarkEnd w:id="86"/>
-      <w:bookmarkEnd w:id="87"/>
+      <w:bookmarkEnd w:id="147"/>
+      <w:bookmarkEnd w:id="148"/>
+      <w:bookmarkEnd w:id="149"/>
+      <w:bookmarkEnd w:id="150"/>
+      <w:bookmarkEnd w:id="151"/>
+      <w:bookmarkEnd w:id="152"/>
+      <w:bookmarkEnd w:id="153"/>
     </w:p>
     <w:p>
       <w:pPr>
@@ -13421,17 +13554,23 @@
       <w:pPr>
         <w:pStyle w:val="Heading2"/>
       </w:pPr>
-      <w:bookmarkStart w:id="88" w:name="_Toc242299357"/>
-      <w:bookmarkStart w:id="89" w:name="_Toc242827625"/>
-      <w:bookmarkStart w:id="90" w:name="_Toc242871478"/>
-      <w:bookmarkStart w:id="91" w:name="_Toc242872854"/>
+      <w:bookmarkStart w:id="154" w:name="_Toc242299357"/>
+      <w:bookmarkStart w:id="155" w:name="_Toc242827625"/>
+      <w:bookmarkStart w:id="156" w:name="_Toc242871478"/>
+      <w:bookmarkStart w:id="157" w:name="_Toc242872854"/>
+      <w:bookmarkStart w:id="158" w:name="_Toc242877806"/>
+      <w:bookmarkStart w:id="159" w:name="_Toc242877986"/>
+      <w:bookmarkStart w:id="160" w:name="_Toc242878414"/>
       <w:r>
         <w:t>4.5 Tương quan PM2.5 với yếu tố khí tượng</w:t>
       </w:r>
-      <w:bookmarkEnd w:id="88"/>
-      <w:bookmarkEnd w:id="89"/>
-      <w:bookmarkEnd w:id="90"/>
-      <w:bookmarkEnd w:id="91"/>
+      <w:bookmarkEnd w:id="154"/>
+      <w:bookmarkEnd w:id="155"/>
+      <w:bookmarkEnd w:id="156"/>
+      <w:bookmarkEnd w:id="157"/>
+      <w:bookmarkEnd w:id="158"/>
+      <w:bookmarkEnd w:id="159"/>
+      <w:bookmarkEnd w:id="160"/>
     </w:p>
     <w:p>
       <w:pPr>
@@ -13964,18 +14103,24 @@
         <w:pStyle w:val="Heading2"/>
         <w:pageBreakBefore/>
       </w:pPr>
-      <w:bookmarkStart w:id="92" w:name="_Toc242299358"/>
-      <w:bookmarkStart w:id="93" w:name="_Toc242827626"/>
-      <w:bookmarkStart w:id="94" w:name="_Toc242871479"/>
-      <w:bookmarkStart w:id="95" w:name="_Toc242872855"/>
+      <w:bookmarkStart w:id="161" w:name="_Toc242299358"/>
+      <w:bookmarkStart w:id="162" w:name="_Toc242827626"/>
+      <w:bookmarkStart w:id="163" w:name="_Toc242871479"/>
+      <w:bookmarkStart w:id="164" w:name="_Toc242872855"/>
+      <w:bookmarkStart w:id="165" w:name="_Toc242877807"/>
+      <w:bookmarkStart w:id="166" w:name="_Toc242877987"/>
+      <w:bookmarkStart w:id="167" w:name="_Toc242878415"/>
       <w:r>
         <w:lastRenderedPageBreak/>
         <w:t>4.6 Thời gian và dung lượng quét của năm truy vấn</w:t>
       </w:r>
-      <w:bookmarkEnd w:id="92"/>
-      <w:bookmarkEnd w:id="93"/>
-      <w:bookmarkEnd w:id="94"/>
-      <w:bookmarkEnd w:id="95"/>
+      <w:bookmarkEnd w:id="161"/>
+      <w:bookmarkEnd w:id="162"/>
+      <w:bookmarkEnd w:id="163"/>
+      <w:bookmarkEnd w:id="164"/>
+      <w:bookmarkEnd w:id="165"/>
+      <w:bookmarkEnd w:id="166"/>
+      <w:bookmarkEnd w:id="167"/>
     </w:p>
     <w:p>
       <w:pPr>
@@ -14814,34 +14959,46 @@
         <w:pageBreakBefore/>
         <w:jc w:val="left"/>
       </w:pPr>
-      <w:bookmarkStart w:id="96" w:name="_Toc242299359"/>
-      <w:bookmarkStart w:id="97" w:name="_Toc242827627"/>
-      <w:bookmarkStart w:id="98" w:name="_Toc242871480"/>
-      <w:bookmarkStart w:id="99" w:name="_Toc242872856"/>
+      <w:bookmarkStart w:id="168" w:name="_Toc242299359"/>
+      <w:bookmarkStart w:id="169" w:name="_Toc242827627"/>
+      <w:bookmarkStart w:id="170" w:name="_Toc242871480"/>
+      <w:bookmarkStart w:id="171" w:name="_Toc242872856"/>
+      <w:bookmarkStart w:id="172" w:name="_Toc242877808"/>
+      <w:bookmarkStart w:id="173" w:name="_Toc242877988"/>
+      <w:bookmarkStart w:id="174" w:name="_Toc242878416"/>
       <w:r>
         <w:lastRenderedPageBreak/>
         <w:t>Chương 5 Tổng hợp kết quả và chi phí Tuần 1</w:t>
       </w:r>
-      <w:bookmarkEnd w:id="96"/>
-      <w:bookmarkEnd w:id="97"/>
-      <w:bookmarkEnd w:id="98"/>
-      <w:bookmarkEnd w:id="99"/>
+      <w:bookmarkEnd w:id="168"/>
+      <w:bookmarkEnd w:id="169"/>
+      <w:bookmarkEnd w:id="170"/>
+      <w:bookmarkEnd w:id="171"/>
+      <w:bookmarkEnd w:id="172"/>
+      <w:bookmarkEnd w:id="173"/>
+      <w:bookmarkEnd w:id="174"/>
     </w:p>
     <w:p>
       <w:pPr>
         <w:pStyle w:val="Heading2"/>
       </w:pPr>
-      <w:bookmarkStart w:id="100" w:name="_Toc242299360"/>
-      <w:bookmarkStart w:id="101" w:name="_Toc242827628"/>
-      <w:bookmarkStart w:id="102" w:name="_Toc242871481"/>
-      <w:bookmarkStart w:id="103" w:name="_Toc242872857"/>
+      <w:bookmarkStart w:id="175" w:name="_Toc242299360"/>
+      <w:bookmarkStart w:id="176" w:name="_Toc242827628"/>
+      <w:bookmarkStart w:id="177" w:name="_Toc242871481"/>
+      <w:bookmarkStart w:id="178" w:name="_Toc242872857"/>
+      <w:bookmarkStart w:id="179" w:name="_Toc242877809"/>
+      <w:bookmarkStart w:id="180" w:name="_Toc242877989"/>
+      <w:bookmarkStart w:id="181" w:name="_Toc242878417"/>
       <w:r>
         <w:t>5.1 Mức độ hoàn thành theo sản phẩm</w:t>
       </w:r>
-      <w:bookmarkEnd w:id="100"/>
-      <w:bookmarkEnd w:id="101"/>
-      <w:bookmarkEnd w:id="102"/>
-      <w:bookmarkEnd w:id="103"/>
+      <w:bookmarkEnd w:id="175"/>
+      <w:bookmarkEnd w:id="176"/>
+      <w:bookmarkEnd w:id="177"/>
+      <w:bookmarkEnd w:id="178"/>
+      <w:bookmarkEnd w:id="179"/>
+      <w:bookmarkEnd w:id="180"/>
+      <w:bookmarkEnd w:id="181"/>
     </w:p>
     <w:p>
       <w:pPr>
@@ -14856,17 +15013,23 @@
       <w:pPr>
         <w:pStyle w:val="Heading2"/>
       </w:pPr>
-      <w:bookmarkStart w:id="104" w:name="_Toc242299361"/>
-      <w:bookmarkStart w:id="105" w:name="_Toc242827629"/>
-      <w:bookmarkStart w:id="106" w:name="_Toc242871482"/>
-      <w:bookmarkStart w:id="107" w:name="_Toc242872858"/>
+      <w:bookmarkStart w:id="182" w:name="_Toc242299361"/>
+      <w:bookmarkStart w:id="183" w:name="_Toc242827629"/>
+      <w:bookmarkStart w:id="184" w:name="_Toc242871482"/>
+      <w:bookmarkStart w:id="185" w:name="_Toc242872858"/>
+      <w:bookmarkStart w:id="186" w:name="_Toc242877810"/>
+      <w:bookmarkStart w:id="187" w:name="_Toc242877990"/>
+      <w:bookmarkStart w:id="188" w:name="_Toc242878418"/>
       <w:r>
         <w:t>5.2 Quản lý chi phí</w:t>
       </w:r>
-      <w:bookmarkEnd w:id="104"/>
-      <w:bookmarkEnd w:id="105"/>
-      <w:bookmarkEnd w:id="106"/>
-      <w:bookmarkEnd w:id="107"/>
+      <w:bookmarkEnd w:id="182"/>
+      <w:bookmarkEnd w:id="183"/>
+      <w:bookmarkEnd w:id="184"/>
+      <w:bookmarkEnd w:id="185"/>
+      <w:bookmarkEnd w:id="186"/>
+      <w:bookmarkEnd w:id="187"/>
+      <w:bookmarkEnd w:id="188"/>
     </w:p>
     <w:p>
       <w:pPr>
@@ -15398,17 +15561,23 @@
       <w:pPr>
         <w:pStyle w:val="Heading2"/>
       </w:pPr>
-      <w:bookmarkStart w:id="108" w:name="_Toc242299362"/>
-      <w:bookmarkStart w:id="109" w:name="_Toc242827630"/>
-      <w:bookmarkStart w:id="110" w:name="_Toc242871483"/>
-      <w:bookmarkStart w:id="111" w:name="_Toc242872859"/>
+      <w:bookmarkStart w:id="189" w:name="_Toc242299362"/>
+      <w:bookmarkStart w:id="190" w:name="_Toc242827630"/>
+      <w:bookmarkStart w:id="191" w:name="_Toc242871483"/>
+      <w:bookmarkStart w:id="192" w:name="_Toc242872859"/>
+      <w:bookmarkStart w:id="193" w:name="_Toc242877811"/>
+      <w:bookmarkStart w:id="194" w:name="_Toc242877991"/>
+      <w:bookmarkStart w:id="195" w:name="_Toc242878419"/>
       <w:r>
         <w:t>5.3 Kết luận</w:t>
       </w:r>
-      <w:bookmarkEnd w:id="108"/>
-      <w:bookmarkEnd w:id="109"/>
-      <w:bookmarkEnd w:id="110"/>
-      <w:bookmarkEnd w:id="111"/>
+      <w:bookmarkEnd w:id="189"/>
+      <w:bookmarkEnd w:id="190"/>
+      <w:bookmarkEnd w:id="191"/>
+      <w:bookmarkEnd w:id="192"/>
+      <w:bookmarkEnd w:id="193"/>
+      <w:bookmarkEnd w:id="194"/>
+      <w:bookmarkEnd w:id="195"/>
     </w:p>
     <w:p>
       <w:pPr>

</xml_diff>